<commit_message>
Deepen and refine Maya application workspaces
</commit_message>
<xml_diff>
--- a/docs/Maya_Navigation_Guide.docx
+++ b/docs/Maya_Navigation_Guide.docx
@@ -153,12 +153,7 @@
         <w:jc w:val="center"/>
       </w:pPr>
       <w:r>
-        <w:rPr>
-          <w:rFonts w:ascii="Calibri" w:hAnsi="Calibri"/>
-          <w:color w:val="69736D"/>
-          <w:sz w:val="18"/>
-        </w:rPr>
-        <w:t>Version 1.0  |  Synthetic concept data  |  August 2026</w:t>
+        <w:t>Version 1.1  |  Synthetic concept data  |  September 2026</w:t>
       </w:r>
     </w:p>
     <w:p>
@@ -2176,11 +2171,7 @@
     </w:p>
     <w:p>
       <w:r>
-        <w:rPr>
-          <w:rFonts w:ascii="Calibri" w:hAnsi="Calibri"/>
-          <w:color w:val="111815"/>
-        </w:rPr>
-        <w:t>Each application opens with an Active Decision Context strip. It shows the current CASE ID, title, application contribution, method code, lifecycle stage, and status.</w:t>
+        <w:t>Each decision application opens with one unified decision command bar. It keeps the CASE ID, application contribution, lifecycle state, governed data freshness, Case Workspace link, and Action Room handoff together.</w:t>
       </w:r>
     </w:p>
     <w:p>
@@ -2320,6 +2311,119 @@
       <w:r>
         <w:br w:type="page"/>
       </w:r>
+    </w:p>
+    <w:p>
+      <w:pPr>
+        <w:pStyle w:val="Heading2"/>
+      </w:pPr>
+      <w:r>
+        <w:t>Read the application operating model</w:t>
+      </w:r>
+    </w:p>
+    <w:p>
+      <w:pPr/>
+      <w:r>
+        <w:t>Every application now includes the same four-tab operating model. This keeps the working dashboard clean while making the decision logic, governance, and implementation depth available on demand.</w:t>
+      </w:r>
+    </w:p>
+    <w:p>
+      <w:pPr>
+        <w:pStyle w:val="ListBullet"/>
+      </w:pPr>
+      <w:r>
+        <w:t>Operating model: decision question, primary users, cadence, planning horizon, decision rights, accountable workflow gates, and exit criteria.</w:t>
+      </w:r>
+    </w:p>
+    <w:p>
+      <w:pPr>
+        <w:pStyle w:val="ListBullet"/>
+      </w:pPr>
+      <w:r>
+        <w:t>Methods: four application-specific analytical or operations-research methods, including the formulation, intended use, and validation requirement.</w:t>
+      </w:r>
+    </w:p>
+    <w:p>
+      <w:pPr>
+        <w:pStyle w:val="ListBullet"/>
+      </w:pPr>
+      <w:r>
+        <w:t>Data &amp; controls: governed input contracts by grain, source, freshness, and fitness checks, plus the controls that prevent unsafe automation.</w:t>
+      </w:r>
+    </w:p>
+    <w:p>
+      <w:pPr>
+        <w:pStyle w:val="ListBullet"/>
+      </w:pPr>
+      <w:r>
+        <w:t>Measure &amp; hand off: value and model-health KPIs, controlled downstream artifacts, owners, targets, and explicit interpretation limits.</w:t>
+      </w:r>
+    </w:p>
+    <w:p>
+      <w:pPr>
+        <w:pStyle w:val="Heading2"/>
+      </w:pPr>
+      <w:r>
+        <w:t>Application decision map</w:t>
+      </w:r>
+    </w:p>
+    <w:p>
+      <w:pPr>
+        <w:pStyle w:val="ListBullet"/>
+      </w:pPr>
+      <w:r>
+        <w:t>RiskRadar - prioritize emerging threats using Bayesian updates, hazard models, Monte Carlo exposure, graph criticality, and tail-risk measures.</w:t>
+      </w:r>
+    </w:p>
+    <w:p>
+      <w:pPr>
+        <w:pStyle w:val="ListBullet"/>
+      </w:pPr>
+      <w:r>
+        <w:t>Network Optimizer - select feasible sourcing, production, inventory, logistics, and customer allocations using MILP, stochastic and robust optimization, with a rapid greedy-repair fallback.</w:t>
+      </w:r>
+    </w:p>
+    <w:p>
+      <w:pPr>
+        <w:pStyle w:val="ListBullet"/>
+      </w:pPr>
+      <w:r>
+        <w:t>FlowLens - connect physical execution to working capital and margin using cash-conversion decomposition, cost-to-serve, min-cost flow, and causal benefit measurement.</w:t>
+      </w:r>
+    </w:p>
+    <w:p>
+      <w:pPr>
+        <w:pStyle w:val="ListBullet"/>
+      </w:pPr>
+      <w:r>
+        <w:t>DemandSense - create explainable demand ranges using hierarchical ensembles, causal regression, Bayesian prediction, and newsvendor service segmentation.</w:t>
+      </w:r>
+    </w:p>
+    <w:p>
+      <w:pPr>
+        <w:pStyle w:val="ListBullet"/>
+      </w:pPr>
+      <w:r>
+        <w:t>SupplierGraph - expose n-tier concentration and qualify alternatives using network science, multi-criteria analysis, capability matching, and should-cost logic.</w:t>
+      </w:r>
+    </w:p>
+    <w:p>
+      <w:pPr>
+        <w:pStyle w:val="ListBullet"/>
+      </w:pPr>
+      <w:r>
+        <w:t>Data Agent Hub - operate source ingestion through change capture, probabilistic entity resolution, semantic conformance, and policy enforcement.</w:t>
+      </w:r>
+    </w:p>
+    <w:p>
+      <w:pPr>
+        <w:pStyle w:val="ListBullet"/>
+      </w:pPr>
+      <w:r>
+        <w:t>Operational Knowledge Graph - serve time-aware evidence through temporal graphs, fact fusion, dependency reasoning, and governed graph features.</w:t>
+      </w:r>
+    </w:p>
+    <w:p>
+      <w:pPr/>
     </w:p>
     <w:p>
       <w:pPr>

</xml_diff>

<commit_message>
Build detailed Maya network radar and OR workbench
</commit_message>
<xml_diff>
--- a/docs/Maya_Navigation_Guide.docx
+++ b/docs/Maya_Navigation_Guide.docx
@@ -153,7 +153,7 @@
         <w:jc w:val="center"/>
       </w:pPr>
       <w:r>
-        <w:t>Version 1.1  |  Synthetic concept data  |  September 2026</w:t>
+        <w:t>Version 3.0  |  Deep concept experience  |  Deterministic synthetic data  |  September 2026</w:t>
       </w:r>
     </w:p>
     <w:p>
@@ -187,11 +187,7 @@
     </w:p>
     <w:p>
       <w:r>
-        <w:rPr>
-          <w:rFonts w:ascii="Calibri" w:hAnsi="Calibri"/>
-          <w:color w:val="111815"/>
-        </w:rPr>
-        <w:t>Maya is organized around one continuous decision thread. Every scope dashboard and application reads the same synthetic network context; each governed case carries its own entities, variables, methods, evidence, scenario options, owners, and outcome contract.</w:t>
+        <w:t>Maya is organized around one continuous decision thread. Every scope dashboard and application reads the same deterministic synthetic network context; each governed case carries its own entities, variables, methods, evidence, six response alternatives, owners, release controls, and outcome-learning contract.</w:t>
       </w:r>
     </w:p>
     <w:tbl>
@@ -1222,19 +1218,7 @@
         <w:ind w:left="540" w:hanging="271"/>
       </w:pPr>
       <w:r>
-        <w:rPr>
-          <w:rFonts w:ascii="Calibri" w:hAnsi="Calibri"/>
-          <w:b/>
-          <w:color w:val="111815"/>
-        </w:rPr>
-        <w:t xml:space="preserve">Network map. </w:t>
-      </w:r>
-      <w:r>
-        <w:rPr>
-          <w:rFonts w:ascii="Calibri" w:hAnsi="Calibri"/>
-          <w:color w:val="111815"/>
-        </w:rPr>
-        <w:t>Select a node to inspect its connected demand, value, movements, and dependency path.</w:t>
+        <w:t>World Network Radar. Focus the world or a region, deliberately engage pan/zoom, filter eight logistics layers, move through nine time frames and three scenarios, then hover or pin corridors, hubs, assets, cargo lots, and transfers for quantity, weight, cube, value, freight, ETA, owner, and causal-change evidence.</w:t>
       </w:r>
     </w:p>
     <w:p>
@@ -1266,19 +1250,7 @@
         <w:ind w:left="540" w:hanging="271"/>
       </w:pPr>
       <w:r>
-        <w:rPr>
-          <w:rFonts w:ascii="Calibri" w:hAnsi="Calibri"/>
-          <w:b/>
-          <w:color w:val="111815"/>
-        </w:rPr>
-        <w:t xml:space="preserve">Movement and supplier registers. </w:t>
-      </w:r>
-      <w:r>
-        <w:rPr>
-          <w:rFonts w:ascii="Calibri" w:hAnsi="Calibri"/>
-          <w:color w:val="111815"/>
-        </w:rPr>
-        <w:t>Provides operational detail before jumping into RiskRadar or Network Optimizer.</w:t>
+        <w:t>Movement and supplier registers. Use the radar's Map/List switch for an accessible, reconciled corridor register; use the lower operational registers to continue into RiskRadar, SupplierGraph, or Network Optimizer.</w:t>
       </w:r>
     </w:p>
     <w:tbl>
@@ -2323,7 +2295,7 @@
     <w:p>
       <w:pPr/>
       <w:r>
-        <w:t>Every application now includes the same four-tab operating model. This keeps the working dashboard clean while making the decision logic, governance, and implementation depth available on demand.</w:t>
+        <w:t>Every application includes the same five-tab operating model. This keeps the working dashboard clean while making decision logic, governance, implementation depth, causal change, and closed-loop learning available on demand.</w:t>
       </w:r>
     </w:p>
     <w:p>
@@ -2355,7 +2327,7 @@
         <w:pStyle w:val="ListBullet"/>
       </w:pPr>
       <w:r>
-        <w:t>Measure &amp; hand off: value and model-health KPIs, controlled downstream artifacts, owners, targets, and explicit interpretation limits.</w:t>
+        <w:t>Measure &amp; hand off: value and model-health KPIs, controlled downstream artifacts, owners, targets, and explicit interpretation limits. Change &amp; learning: six app-specific before-current-forecast events with cause, evidence, confidence, trigger, owner, downstream handoff, drift logic, and champion/challenger governance.</w:t>
       </w:r>
     </w:p>
     <w:p>
@@ -2379,7 +2351,7 @@
         <w:pStyle w:val="ListBullet"/>
       </w:pPr>
       <w:r>
-        <w:t>Network Optimizer - select feasible sourcing, production, inventory, logistics, and customer allocations using MILP, stochastic and robust optimization, with a rapid greedy-repair fallback.</w:t>
+        <w:t>Network Optimizer - frame and formulate a decision, inspect all handbook methods M-01 through M-30, build a primary/support/fallback stack, govern six probability-model behavior classes, compare joint scenarios and Pareto alternatives, and apply semantic, mathematical, empirical, and operational validation. Maya demonstrates a deterministic synthetic response calculator; it does not claim a live MILP solve or mathematical optimality.</w:t>
       </w:r>
     </w:p>
     <w:p>
@@ -2411,7 +2383,7 @@
         <w:pStyle w:val="ListBullet"/>
       </w:pPr>
       <w:r>
-        <w:t>Data Agent Hub - operate source ingestion through change capture, probabilistic entity resolution, semantic conformance, and policy enforcement.</w:t>
+        <w:t>Data Agent Hub - inspect 12 synthetic agents spanning ERP, PLM, WMS, TMS, QMS, CRM, finance, trade, carbon, suppliers, unstructured work, and market intelligence; operate change capture, entity resolution, semantic conformance, SLOs, quarantines, and policy enforcement.</w:t>
       </w:r>
     </w:p>
     <w:p>
@@ -2553,19 +2525,7 @@
         <w:ind w:left="540" w:hanging="271"/>
       </w:pPr>
       <w:r>
-        <w:rPr>
-          <w:rFonts w:ascii="Calibri" w:hAnsi="Calibri"/>
-          <w:b/>
-          <w:color w:val="111815"/>
-        </w:rPr>
-        <w:t xml:space="preserve">Compare scenarios. </w:t>
-      </w:r>
-      <w:r>
-        <w:rPr>
-          <w:rFonts w:ascii="Calibri" w:hAnsi="Calibri"/>
-          <w:color w:val="111815"/>
-        </w:rPr>
-        <w:t>Contrast Hold current plan, Balanced response, and Service-first response across value, service, cost, cash, residual risk, and carbon.</w:t>
+        <w:t>Compare six scenarios. Contrast no action, balanced, service-first, robust reserve, low-carbon, and adaptive staged responses across method stack, feasibility, value, service, cost, cash, residual risk, carbon, and the action delta.</w:t>
       </w:r>
     </w:p>
     <w:p>
@@ -2575,19 +2535,7 @@
         <w:ind w:left="540" w:hanging="271"/>
       </w:pPr>
       <w:r>
-        <w:rPr>
-          <w:rFonts w:ascii="Calibri" w:hAnsi="Calibri"/>
-          <w:b/>
-          <w:color w:val="111815"/>
-        </w:rPr>
-        <w:t xml:space="preserve">Open Network Optimizer. </w:t>
-      </w:r>
-      <w:r>
-        <w:rPr>
-          <w:rFonts w:ascii="Calibri" w:hAnsi="Calibri"/>
-          <w:color w:val="111815"/>
-        </w:rPr>
-        <w:t>Use the case-context strip to show that CASE-1042 persists. Adjust constraints or run the deterministic model if desired.</w:t>
+        <w:t>Open Network Optimizer. Use the case-context strip to show that CASE-1042 persists. Walk Frame, Formulate, Techniques, Stress + compare, and Validate + release. Change an assumption, show the pending diff, run the deterministic replay, and explain why hard violations block release.</w:t>
       </w:r>
     </w:p>
     <w:p>
@@ -3296,11 +3244,7 @@
     </w:p>
     <w:p>
       <w:r>
-        <w:rPr>
-          <w:rFonts w:ascii="Calibri" w:hAnsi="Calibri"/>
-          <w:color w:val="111815"/>
-        </w:rPr>
-        <w:t>All organizations, suppliers, products, orders, metrics, evidence, methods, scenarios, recommendations, approvals, and outcomes in Maya are synthetic. The experience has no business-data backend, operational connector, persistence layer, or write-back authority.</w:t>
+        <w:t>All organizations, suppliers, products, orders, cargo, operators, prices, quantities, telemetry, metrics, evidence, methods, scenarios, recommendations, approvals, and outcomes in Maya are synthetic. The experience has no business-data backend, live solver, operational connector, persistence layer, navigation authority, or write-back authority.</w:t>
       </w:r>
     </w:p>
     <w:tbl>
@@ -3362,6 +3306,3549 @@
       <w:pPr>
         <w:spacing w:after="0"/>
       </w:pPr>
+    </w:p>
+    <w:p>
+      <w:r>
+        <w:br w:type="page"/>
+      </w:r>
+    </w:p>
+    <w:p>
+      <w:pPr>
+        <w:spacing w:before="80" w:after="60"/>
+      </w:pPr>
+      <w:r>
+        <w:rPr>
+          <w:rFonts w:ascii="Segoe UI" w:hAnsi="Segoe UI"/>
+          <w:b/>
+          <w:color w:val="4C5E54"/>
+          <w:sz w:val="18"/>
+        </w:rPr>
+        <w:t>07 / WORLD NETWORK RADAR</w:t>
+      </w:r>
+    </w:p>
+    <w:p>
+      <w:pPr>
+        <w:pStyle w:val="Heading1"/>
+        <w:keepNext/>
+      </w:pPr>
+      <w:r>
+        <w:t>Navigate the physical network like an operations control tower</w:t>
+      </w:r>
+    </w:p>
+    <w:p>
+      <w:r>
+        <w:t>The Network Radar replaces the earlier schematic map with a geographic Natural Earth land layer and one linked synthetic operations model. Map KPIs, corridor geometry, hover cards, pinned inspection, time frames, scenarios, and the accessible list view are calculated from the same filtered records.</w:t>
+      </w:r>
+    </w:p>
+    <w:p>
+      <w:pPr>
+        <w:pStyle w:val="Heading2"/>
+      </w:pPr>
+      <w:r>
+        <w:t>Recommended operating sequence</w:t>
+      </w:r>
+    </w:p>
+    <w:p>
+      <w:pPr>
+        <w:pStyle w:val="ListNumber"/>
+      </w:pPr>
+      <w:r>
+        <w:t>Select Global, APAC, or Company context. Scope filters the same canonical locations, corridors, assets, cargo, transfers, and change events.</w:t>
+      </w:r>
+    </w:p>
+    <w:p>
+      <w:pPr>
+        <w:pStyle w:val="ListNumber"/>
+      </w:pPr>
+      <w:r>
+        <w:t>Choose Current trajectory, No-action disruption, or Recommended response. The selected scenario changes delay, utilization, reliability, freight, status, and the resulting KPIs.</w:t>
+      </w:r>
+    </w:p>
+    <w:p>
+      <w:pPr>
+        <w:pStyle w:val="ListNumber"/>
+      </w:pPr>
+      <w:r>
+        <w:t>Use World, Americas, Europe, MEA, APAC, or Company footprint. Region presets move and zoom the geographic camera without changing scope or hiding the underlying audit trail.</w:t>
+      </w:r>
+    </w:p>
+    <w:p>
+      <w:pPr>
+        <w:pStyle w:val="ListNumber"/>
+      </w:pPr>
+      <w:r>
+        <w:t>Turn Ocean, Air, Road, Rail, Transfers, Assets, Cargo, and Locations on or off. Low zoom emphasizes corridors; higher zoom progressively reveals hubs, assets, labels, selectable cargo lots, and transfers.</w:t>
+      </w:r>
+    </w:p>
+    <w:p>
+      <w:pPr>
+        <w:pStyle w:val="ListNumber"/>
+      </w:pPr>
+      <w:r>
+        <w:t>Select Engage map controls before dragging or using the mouse wheel. This deliberate state prevents the map from trapping normal page scrolling. Press Esc to release; use arrows to pan, +/− to zoom, and 0 to reset.</w:t>
+      </w:r>
+    </w:p>
+    <w:p>
+      <w:pPr>
+        <w:pStyle w:val="ListNumber"/>
+      </w:pPr>
+      <w:r>
+        <w:t>Hover or keyboard-focus an entity for a compact radar card. Select it to pin the inspector and retain quantity, tonnes/TEU, cube, goods value, freight, unit cost, ETA variance, reliability, carbon, owner, evidence, and change history. From the pinned inspector, Trace dependency, Optimize corridor, or Inspect cash impact carries the selected entity into the destination application's shared context bar.</w:t>
+      </w:r>
+    </w:p>
+    <w:p>
+      <w:pPr>
+        <w:pStyle w:val="ListNumber"/>
+      </w:pPr>
+      <w:r>
+        <w:t>Move from T−24h and T−6h through Live, +6h, +24h, +72h, +7d, +30d, and +90d. Assets, corridor conditions, cargo, transfers, delay, reliability, economics, and causal changes are recalculated for each deterministic frame. Play advances the fixed frames; pause and select any frame to compare states.</w:t>
+      </w:r>
+    </w:p>
+    <w:p>
+      <w:pPr>
+        <w:pStyle w:val="ListNumber"/>
+      </w:pPr>
+      <w:r>
+        <w:t>Switch to List when a table is more useful or accessible. Inspect returns to the map with that corridor pinned.</w:t>
+      </w:r>
+    </w:p>
+    <w:tbl>
+      <w:tblPr>
+        <w:tblStyle w:val="TableGrid"/>
+        <w:tblW w:type="dxa" w:w="9360"/>
+        <w:jc w:val="center"/>
+        <w:tblLayout w:type="fixed"/>
+        <w:tblLook w:firstColumn="1" w:firstRow="1" w:lastColumn="0" w:lastRow="0" w:noHBand="0" w:noVBand="1" w:val="04A0"/>
+        <w:tblInd w:w="90" w:type="dxa"/>
+      </w:tblPr>
+      <w:tblGrid>
+        <w:gridCol w:w="1250"/>
+        <w:gridCol w:w="2000"/>
+        <w:gridCol w:w="4000"/>
+        <w:gridCol w:w="2110"/>
+      </w:tblGrid>
+      <w:tr>
+        <w:trPr>
+          <w:tblHeader w:val="true"/>
+        </w:trPr>
+        <w:tc>
+          <w:tcPr>
+            <w:tcW w:type="dxa" w:w="1250"/>
+            <w:shd w:fill="16211C"/>
+            <w:tcMar>
+              <w:top w:w="90" w:type="dxa"/>
+              <w:start w:w="90" w:type="dxa"/>
+              <w:bottom w:w="90" w:type="dxa"/>
+              <w:end w:w="90" w:type="dxa"/>
+            </w:tcMar>
+            <w:vAlign w:val="center"/>
+          </w:tcPr>
+          <w:p>
+            <w:r>
+              <w:rPr>
+                <w:rFonts w:ascii="Segoe UI" w:hAnsi="Segoe UI"/>
+                <w:b/>
+                <w:color w:val="FFFFFF"/>
+                <w:sz w:val="16"/>
+              </w:rPr>
+              <w:t>Entity</w:t>
+            </w:r>
+          </w:p>
+        </w:tc>
+        <w:tc>
+          <w:tcPr>
+            <w:tcW w:type="dxa" w:w="2000"/>
+            <w:shd w:fill="16211C"/>
+            <w:tcMar>
+              <w:top w:w="90" w:type="dxa"/>
+              <w:start w:w="90" w:type="dxa"/>
+              <w:bottom w:w="90" w:type="dxa"/>
+              <w:end w:w="90" w:type="dxa"/>
+            </w:tcMar>
+            <w:vAlign w:val="center"/>
+          </w:tcPr>
+          <w:p>
+            <w:r>
+              <w:rPr>
+                <w:rFonts w:ascii="Segoe UI" w:hAnsi="Segoe UI"/>
+                <w:b/>
+                <w:color w:val="FFFFFF"/>
+                <w:sz w:val="16"/>
+              </w:rPr>
+              <w:t>Hover / focus</w:t>
+            </w:r>
+          </w:p>
+        </w:tc>
+        <w:tc>
+          <w:tcPr>
+            <w:tcW w:type="dxa" w:w="4000"/>
+            <w:shd w:fill="16211C"/>
+            <w:tcMar>
+              <w:top w:w="90" w:type="dxa"/>
+              <w:start w:w="90" w:type="dxa"/>
+              <w:bottom w:w="90" w:type="dxa"/>
+              <w:end w:w="90" w:type="dxa"/>
+            </w:tcMar>
+            <w:vAlign w:val="center"/>
+          </w:tcPr>
+          <w:p>
+            <w:r>
+              <w:rPr>
+                <w:rFonts w:ascii="Segoe UI" w:hAnsi="Segoe UI"/>
+                <w:b/>
+                <w:color w:val="FFFFFF"/>
+                <w:sz w:val="16"/>
+              </w:rPr>
+              <w:t>Pinned detail</w:t>
+            </w:r>
+          </w:p>
+        </w:tc>
+        <w:tc>
+          <w:tcPr>
+            <w:tcW w:type="dxa" w:w="2110"/>
+            <w:shd w:fill="16211C"/>
+            <w:tcMar>
+              <w:top w:w="90" w:type="dxa"/>
+              <w:start w:w="90" w:type="dxa"/>
+              <w:bottom w:w="90" w:type="dxa"/>
+              <w:end w:w="90" w:type="dxa"/>
+            </w:tcMar>
+            <w:vAlign w:val="center"/>
+          </w:tcPr>
+          <w:p>
+            <w:r>
+              <w:rPr>
+                <w:rFonts w:ascii="Segoe UI" w:hAnsi="Segoe UI"/>
+                <w:b/>
+                <w:color w:val="FFFFFF"/>
+                <w:sz w:val="16"/>
+              </w:rPr>
+              <w:t>Action handoff</w:t>
+            </w:r>
+          </w:p>
+        </w:tc>
+      </w:tr>
+      <w:tr>
+        <w:tc>
+          <w:tcPr>
+            <w:tcW w:type="dxa" w:w="1250"/>
+            <w:tcMar>
+              <w:top w:w="90" w:type="dxa"/>
+              <w:start w:w="90" w:type="dxa"/>
+              <w:bottom w:w="90" w:type="dxa"/>
+              <w:end w:w="90" w:type="dxa"/>
+            </w:tcMar>
+            <w:vAlign w:val="top"/>
+          </w:tcPr>
+          <w:p>
+            <w:pPr>
+              <w:spacing w:after="0"/>
+            </w:pPr>
+            <w:r>
+              <w:rPr>
+                <w:rFonts w:ascii="Segoe UI" w:hAnsi="Segoe UI"/>
+                <w:sz w:val="16"/>
+              </w:rPr>
+              <w:t>Corridor</w:t>
+            </w:r>
+          </w:p>
+        </w:tc>
+        <w:tc>
+          <w:tcPr>
+            <w:tcW w:type="dxa" w:w="2000"/>
+            <w:tcMar>
+              <w:top w:w="90" w:type="dxa"/>
+              <w:start w:w="90" w:type="dxa"/>
+              <w:bottom w:w="90" w:type="dxa"/>
+              <w:end w:w="90" w:type="dxa"/>
+            </w:tcMar>
+            <w:vAlign w:val="top"/>
+          </w:tcPr>
+          <w:p>
+            <w:pPr>
+              <w:spacing w:after="0"/>
+            </w:pPr>
+            <w:r>
+              <w:rPr>
+                <w:rFonts w:ascii="Segoe UI" w:hAnsi="Segoe UI"/>
+                <w:sz w:val="16"/>
+              </w:rPr>
+              <w:t>Mode, status, endpoints, quantity, weight, value, freight</w:t>
+            </w:r>
+          </w:p>
+        </w:tc>
+        <w:tc>
+          <w:tcPr>
+            <w:tcW w:type="dxa" w:w="4000"/>
+            <w:tcMar>
+              <w:top w:w="90" w:type="dxa"/>
+              <w:start w:w="90" w:type="dxa"/>
+              <w:bottom w:w="90" w:type="dxa"/>
+              <w:end w:w="90" w:type="dxa"/>
+            </w:tcMar>
+            <w:vAlign w:val="top"/>
+          </w:tcPr>
+          <w:p>
+            <w:pPr>
+              <w:spacing w:after="0"/>
+            </w:pPr>
+            <w:r>
+              <w:rPr>
+                <w:rFonts w:ascii="Segoe UI" w:hAnsi="Segoe UI"/>
+                <w:sz w:val="16"/>
+              </w:rPr>
+              <w:t>Capacity, cube, TEU, cost/unit, ETA, reliability, carbon, frozen state, cargo and change ledger</w:t>
+            </w:r>
+          </w:p>
+        </w:tc>
+        <w:tc>
+          <w:tcPr>
+            <w:tcW w:type="dxa" w:w="2110"/>
+            <w:tcMar>
+              <w:top w:w="90" w:type="dxa"/>
+              <w:start w:w="90" w:type="dxa"/>
+              <w:bottom w:w="90" w:type="dxa"/>
+              <w:end w:w="90" w:type="dxa"/>
+            </w:tcMar>
+            <w:vAlign w:val="top"/>
+          </w:tcPr>
+          <w:p>
+            <w:pPr>
+              <w:spacing w:after="0"/>
+            </w:pPr>
+            <w:r>
+              <w:rPr>
+                <w:rFonts w:ascii="Segoe UI" w:hAnsi="Segoe UI"/>
+                <w:sz w:val="16"/>
+              </w:rPr>
+              <w:t>Risk dependency, corridor optimization, cash impact</w:t>
+            </w:r>
+          </w:p>
+        </w:tc>
+      </w:tr>
+      <w:tr>
+        <w:tc>
+          <w:tcPr>
+            <w:tcW w:type="dxa" w:w="1250"/>
+            <w:tcMar>
+              <w:top w:w="90" w:type="dxa"/>
+              <w:start w:w="90" w:type="dxa"/>
+              <w:bottom w:w="90" w:type="dxa"/>
+              <w:end w:w="90" w:type="dxa"/>
+            </w:tcMar>
+            <w:vAlign w:val="top"/>
+            <w:shd w:fill="F1F2ED"/>
+          </w:tcPr>
+          <w:p>
+            <w:pPr>
+              <w:spacing w:after="0"/>
+            </w:pPr>
+            <w:r>
+              <w:rPr>
+                <w:rFonts w:ascii="Segoe UI" w:hAnsi="Segoe UI"/>
+                <w:sz w:val="16"/>
+              </w:rPr>
+              <w:t>Asset</w:t>
+            </w:r>
+          </w:p>
+        </w:tc>
+        <w:tc>
+          <w:tcPr>
+            <w:tcW w:type="dxa" w:w="2000"/>
+            <w:tcMar>
+              <w:top w:w="90" w:type="dxa"/>
+              <w:start w:w="90" w:type="dxa"/>
+              <w:bottom w:w="90" w:type="dxa"/>
+              <w:end w:w="90" w:type="dxa"/>
+            </w:tcMar>
+            <w:vAlign w:val="top"/>
+            <w:shd w:fill="F1F2ED"/>
+          </w:tcPr>
+          <w:p>
+            <w:pPr>
+              <w:spacing w:after="0"/>
+            </w:pPr>
+            <w:r>
+              <w:rPr>
+                <w:rFonts w:ascii="Segoe UI" w:hAnsi="Segoe UI"/>
+                <w:sz w:val="16"/>
+              </w:rPr>
+              <w:t>Demo identifier, observed/estimated state, progress, speed, freshness</w:t>
+            </w:r>
+          </w:p>
+        </w:tc>
+        <w:tc>
+          <w:tcPr>
+            <w:tcW w:type="dxa" w:w="4000"/>
+            <w:tcMar>
+              <w:top w:w="90" w:type="dxa"/>
+              <w:start w:w="90" w:type="dxa"/>
+              <w:bottom w:w="90" w:type="dxa"/>
+              <w:end w:w="90" w:type="dxa"/>
+            </w:tcMar>
+            <w:vAlign w:val="top"/>
+            <w:shd w:fill="F1F2ED"/>
+          </w:tcPr>
+          <w:p>
+            <w:pPr>
+              <w:spacing w:after="0"/>
+            </w:pPr>
+            <w:r>
+              <w:rPr>
+                <w:rFonts w:ascii="Segoe UI" w:hAnsi="Segoe UI"/>
+                <w:sz w:val="16"/>
+              </w:rPr>
+              <w:t>Heading, next waypoint, ETA, mode telemetry, cargo totals and synthetic responsible operator</w:t>
+            </w:r>
+          </w:p>
+        </w:tc>
+        <w:tc>
+          <w:tcPr>
+            <w:tcW w:type="dxa" w:w="2110"/>
+            <w:tcMar>
+              <w:top w:w="90" w:type="dxa"/>
+              <w:start w:w="90" w:type="dxa"/>
+              <w:bottom w:w="90" w:type="dxa"/>
+              <w:end w:w="90" w:type="dxa"/>
+            </w:tcMar>
+            <w:vAlign w:val="top"/>
+            <w:shd w:fill="F1F2ED"/>
+          </w:tcPr>
+          <w:p>
+            <w:pPr>
+              <w:spacing w:after="0"/>
+            </w:pPr>
+            <w:r>
+              <w:rPr>
+                <w:rFonts w:ascii="Segoe UI" w:hAnsi="Segoe UI"/>
+                <w:sz w:val="16"/>
+              </w:rPr>
+              <w:t>Related corridor and case</w:t>
+            </w:r>
+          </w:p>
+        </w:tc>
+      </w:tr>
+      <w:tr>
+        <w:tc>
+          <w:tcPr>
+            <w:tcW w:type="dxa" w:w="1250"/>
+            <w:tcMar>
+              <w:top w:w="90" w:type="dxa"/>
+              <w:start w:w="90" w:type="dxa"/>
+              <w:bottom w:w="90" w:type="dxa"/>
+              <w:end w:w="90" w:type="dxa"/>
+            </w:tcMar>
+            <w:vAlign w:val="top"/>
+          </w:tcPr>
+          <w:p>
+            <w:pPr>
+              <w:spacing w:after="0"/>
+            </w:pPr>
+            <w:r>
+              <w:rPr>
+                <w:rFonts w:ascii="Segoe UI" w:hAnsi="Segoe UI"/>
+                <w:sz w:val="16"/>
+              </w:rPr>
+              <w:t>Location</w:t>
+            </w:r>
+          </w:p>
+        </w:tc>
+        <w:tc>
+          <w:tcPr>
+            <w:tcW w:type="dxa" w:w="2000"/>
+            <w:tcMar>
+              <w:top w:w="90" w:type="dxa"/>
+              <w:start w:w="90" w:type="dxa"/>
+              <w:bottom w:w="90" w:type="dxa"/>
+              <w:end w:w="90" w:type="dxa"/>
+            </w:tcMar>
+            <w:vAlign w:val="top"/>
+          </w:tcPr>
+          <w:p>
+            <w:pPr>
+              <w:spacing w:after="0"/>
+            </w:pPr>
+            <w:r>
+              <w:rPr>
+                <w:rFonts w:ascii="Segoe UI" w:hAnsi="Segoe UI"/>
+                <w:sz w:val="16"/>
+              </w:rPr>
+              <w:t>Facility type, region, orders, connected value, utilization</w:t>
+            </w:r>
+          </w:p>
+        </w:tc>
+        <w:tc>
+          <w:tcPr>
+            <w:tcW w:type="dxa" w:w="4000"/>
+            <w:tcMar>
+              <w:top w:w="90" w:type="dxa"/>
+              <w:start w:w="90" w:type="dxa"/>
+              <w:bottom w:w="90" w:type="dxa"/>
+              <w:end w:w="90" w:type="dxa"/>
+            </w:tcMar>
+            <w:vAlign w:val="top"/>
+          </w:tcPr>
+          <w:p>
+            <w:pPr>
+              <w:spacing w:after="0"/>
+            </w:pPr>
+            <w:r>
+              <w:rPr>
+                <w:rFonts w:ascii="Segoe UI" w:hAnsi="Segoe UI"/>
+                <w:sz w:val="16"/>
+              </w:rPr>
+              <w:t>Capacity/day, dwell, provenance, freshness and accountable owner</w:t>
+            </w:r>
+          </w:p>
+        </w:tc>
+        <w:tc>
+          <w:tcPr>
+            <w:tcW w:type="dxa" w:w="2110"/>
+            <w:tcMar>
+              <w:top w:w="90" w:type="dxa"/>
+              <w:start w:w="90" w:type="dxa"/>
+              <w:bottom w:w="90" w:type="dxa"/>
+              <w:end w:w="90" w:type="dxa"/>
+            </w:tcMar>
+            <w:vAlign w:val="top"/>
+          </w:tcPr>
+          <w:p>
+            <w:pPr>
+              <w:spacing w:after="0"/>
+            </w:pPr>
+            <w:r>
+              <w:rPr>
+                <w:rFonts w:ascii="Segoe UI" w:hAnsi="Segoe UI"/>
+                <w:sz w:val="16"/>
+              </w:rPr>
+              <w:t>Dependency and capacity review</w:t>
+            </w:r>
+          </w:p>
+        </w:tc>
+      </w:tr>
+      <w:tr>
+        <w:tc>
+          <w:tcPr>
+            <w:tcW w:type="dxa" w:w="1250"/>
+            <w:tcMar>
+              <w:top w:w="90" w:type="dxa"/>
+              <w:start w:w="90" w:type="dxa"/>
+              <w:bottom w:w="90" w:type="dxa"/>
+              <w:end w:w="90" w:type="dxa"/>
+            </w:tcMar>
+            <w:vAlign w:val="top"/>
+            <w:shd w:fill="F1F2ED"/>
+          </w:tcPr>
+          <w:p>
+            <w:pPr>
+              <w:spacing w:after="0"/>
+            </w:pPr>
+            <w:r>
+              <w:rPr>
+                <w:rFonts w:ascii="Segoe UI" w:hAnsi="Segoe UI"/>
+                <w:sz w:val="16"/>
+              </w:rPr>
+              <w:t>Transfer</w:t>
+            </w:r>
+          </w:p>
+        </w:tc>
+        <w:tc>
+          <w:tcPr>
+            <w:tcW w:type="dxa" w:w="2000"/>
+            <w:tcMar>
+              <w:top w:w="90" w:type="dxa"/>
+              <w:start w:w="90" w:type="dxa"/>
+              <w:bottom w:w="90" w:type="dxa"/>
+              <w:end w:w="90" w:type="dxa"/>
+            </w:tcMar>
+            <w:vAlign w:val="top"/>
+            <w:shd w:fill="F1F2ED"/>
+          </w:tcPr>
+          <w:p>
+            <w:pPr>
+              <w:spacing w:after="0"/>
+            </w:pPr>
+            <w:r>
+              <w:rPr>
+                <w:rFonts w:ascii="Segoe UI" w:hAnsi="Segoe UI"/>
+                <w:sz w:val="16"/>
+              </w:rPr>
+              <w:t>Status, hub and quantity</w:t>
+            </w:r>
+          </w:p>
+        </w:tc>
+        <w:tc>
+          <w:tcPr>
+            <w:tcW w:type="dxa" w:w="4000"/>
+            <w:tcMar>
+              <w:top w:w="90" w:type="dxa"/>
+              <w:start w:w="90" w:type="dxa"/>
+              <w:bottom w:w="90" w:type="dxa"/>
+              <w:end w:w="90" w:type="dxa"/>
+            </w:tcMar>
+            <w:vAlign w:val="top"/>
+            <w:shd w:fill="F1F2ED"/>
+          </w:tcPr>
+          <w:p>
+            <w:pPr>
+              <w:spacing w:after="0"/>
+            </w:pPr>
+            <w:r>
+              <w:rPr>
+                <w:rFonts w:ascii="Segoe UI" w:hAnsi="Segoe UI"/>
+                <w:sz w:val="16"/>
+              </w:rPr>
+              <w:t>Inbound/outbound assets, value, planned/projected handoff, dwell, cutoff and synthetic custodian</w:t>
+            </w:r>
+          </w:p>
+        </w:tc>
+        <w:tc>
+          <w:tcPr>
+            <w:tcW w:type="dxa" w:w="2110"/>
+            <w:tcMar>
+              <w:top w:w="90" w:type="dxa"/>
+              <w:start w:w="90" w:type="dxa"/>
+              <w:bottom w:w="90" w:type="dxa"/>
+              <w:end w:w="90" w:type="dxa"/>
+            </w:tcMar>
+            <w:vAlign w:val="top"/>
+            <w:shd w:fill="F1F2ED"/>
+          </w:tcPr>
+          <w:p>
+            <w:pPr>
+              <w:spacing w:after="0"/>
+            </w:pPr>
+            <w:r>
+              <w:rPr>
+                <w:rFonts w:ascii="Segoe UI" w:hAnsi="Segoe UI"/>
+                <w:sz w:val="16"/>
+              </w:rPr>
+              <w:t>Customs, service and cash exception</w:t>
+            </w:r>
+          </w:p>
+        </w:tc>
+      </w:tr>
+    </w:tbl>
+    <w:p/>
+    <w:p>
+      <w:pPr>
+        <w:pStyle w:val="Heading2"/>
+      </w:pPr>
+      <w:r>
+        <w:t>Geographic interpretation</w:t>
+      </w:r>
+    </w:p>
+    <w:p>
+      <w:pPr>
+        <w:pStyle w:val="ListBullet"/>
+        <w:spacing w:after="60"/>
+      </w:pPr>
+      <w:r>
+        <w:t>Natural Earth 1:110m public-domain land geometry supplies geographic context and is bundled locally; Maya does not request a third-party tile service at runtime.</w:t>
+      </w:r>
+    </w:p>
+    <w:p>
+      <w:pPr>
+        <w:pStyle w:val="ListBullet"/>
+        <w:spacing w:after="60"/>
+      </w:pPr>
+      <w:r>
+        <w:t>Ocean corridors include representative maritime waypoints such as Malacca, Suez, Bab el-Mandeb, Gibraltar, Panama, and the Cape route. Air legs are geographic arcs. Road and rail legs are intentionally operationally representative—not turn-by-turn navigation.</w:t>
+      </w:r>
+    </w:p>
+    <w:p>
+      <w:pPr>
+        <w:pStyle w:val="ListBullet"/>
+        <w:spacing w:after="60"/>
+      </w:pPr>
+      <w:r>
+        <w:t>A line, marker, position, ETA, price, quantity, or person shown on the map is synthetic. It must not be used for navigation, tracking, commercial execution, or personal contact.</w:t>
+      </w:r>
+    </w:p>
+    <w:p>
+      <w:r>
+        <w:br w:type="page"/>
+      </w:r>
+    </w:p>
+    <w:p>
+      <w:pPr>
+        <w:spacing w:before="80" w:after="60"/>
+      </w:pPr>
+      <w:r>
+        <w:rPr>
+          <w:rFonts w:ascii="Segoe UI" w:hAnsi="Segoe UI"/>
+          <w:b/>
+          <w:color w:val="4C5E54"/>
+          <w:sz w:val="18"/>
+        </w:rPr>
+        <w:t>08 / NETWORK OPTIMIZER</w:t>
+      </w:r>
+    </w:p>
+    <w:p>
+      <w:pPr>
+        <w:pStyle w:val="Heading1"/>
+        <w:keepNext/>
+      </w:pPr>
+      <w:r>
+        <w:t>Use the complete operations-research workbench</w:t>
+      </w:r>
+    </w:p>
+    <w:p>
+      <w:r>
+        <w:t>Network Optimizer demonstrates the professional OR decision process described by the Supply-Chain Operations Research Methodology Handbook. It is a deterministic synthetic response calculator with a generated candidate-space index, not a mathematical solver. It does not execute a commercial solver, provide a bound or gap, expose shadow prices, issue a mathematical certificate, or prove optimality.</w:t>
+      </w:r>
+    </w:p>
+    <w:tbl>
+      <w:tblPr>
+        <w:tblStyle w:val="TableGrid"/>
+        <w:tblW w:type="dxa" w:w="9360"/>
+        <w:jc w:val="center"/>
+        <w:tblLayout w:type="fixed"/>
+        <w:tblLook w:firstColumn="1" w:firstRow="1" w:lastColumn="0" w:lastRow="0" w:noHBand="0" w:noVBand="1" w:val="04A0"/>
+        <w:tblInd w:w="90" w:type="dxa"/>
+      </w:tblPr>
+      <w:tblGrid>
+        <w:gridCol w:w="1300"/>
+        <w:gridCol w:w="2000"/>
+        <w:gridCol w:w="4000"/>
+        <w:gridCol w:w="2060"/>
+      </w:tblGrid>
+      <w:tr>
+        <w:trPr>
+          <w:tblHeader w:val="true"/>
+        </w:trPr>
+        <w:tc>
+          <w:tcPr>
+            <w:tcW w:type="dxa" w:w="1300"/>
+            <w:shd w:fill="16211C"/>
+            <w:tcMar>
+              <w:top w:w="90" w:type="dxa"/>
+              <w:start w:w="90" w:type="dxa"/>
+              <w:bottom w:w="90" w:type="dxa"/>
+              <w:end w:w="90" w:type="dxa"/>
+            </w:tcMar>
+            <w:vAlign w:val="center"/>
+          </w:tcPr>
+          <w:p>
+            <w:r>
+              <w:rPr>
+                <w:rFonts w:ascii="Segoe UI" w:hAnsi="Segoe UI"/>
+                <w:b/>
+                <w:color w:val="FFFFFF"/>
+                <w:sz w:val="16"/>
+              </w:rPr>
+              <w:t>Stage</w:t>
+            </w:r>
+          </w:p>
+        </w:tc>
+        <w:tc>
+          <w:tcPr>
+            <w:tcW w:type="dxa" w:w="2000"/>
+            <w:shd w:fill="16211C"/>
+            <w:tcMar>
+              <w:top w:w="90" w:type="dxa"/>
+              <w:start w:w="90" w:type="dxa"/>
+              <w:bottom w:w="90" w:type="dxa"/>
+              <w:end w:w="90" w:type="dxa"/>
+            </w:tcMar>
+            <w:vAlign w:val="center"/>
+          </w:tcPr>
+          <w:p>
+            <w:r>
+              <w:rPr>
+                <w:rFonts w:ascii="Segoe UI" w:hAnsi="Segoe UI"/>
+                <w:b/>
+                <w:color w:val="FFFFFF"/>
+                <w:sz w:val="16"/>
+              </w:rPr>
+              <w:t>Primary question</w:t>
+            </w:r>
+          </w:p>
+        </w:tc>
+        <w:tc>
+          <w:tcPr>
+            <w:tcW w:type="dxa" w:w="4000"/>
+            <w:shd w:fill="16211C"/>
+            <w:tcMar>
+              <w:top w:w="90" w:type="dxa"/>
+              <w:start w:w="90" w:type="dxa"/>
+              <w:bottom w:w="90" w:type="dxa"/>
+              <w:end w:w="90" w:type="dxa"/>
+            </w:tcMar>
+            <w:vAlign w:val="center"/>
+          </w:tcPr>
+          <w:p>
+            <w:r>
+              <w:rPr>
+                <w:rFonts w:ascii="Segoe UI" w:hAnsi="Segoe UI"/>
+                <w:b/>
+                <w:color w:val="FFFFFF"/>
+                <w:sz w:val="16"/>
+              </w:rPr>
+              <w:t>Key content</w:t>
+            </w:r>
+          </w:p>
+        </w:tc>
+        <w:tc>
+          <w:tcPr>
+            <w:tcW w:type="dxa" w:w="2060"/>
+            <w:shd w:fill="16211C"/>
+            <w:tcMar>
+              <w:top w:w="90" w:type="dxa"/>
+              <w:start w:w="90" w:type="dxa"/>
+              <w:bottom w:w="90" w:type="dxa"/>
+              <w:end w:w="90" w:type="dxa"/>
+            </w:tcMar>
+            <w:vAlign w:val="center"/>
+          </w:tcPr>
+          <w:p>
+            <w:r>
+              <w:rPr>
+                <w:rFonts w:ascii="Segoe UI" w:hAnsi="Segoe UI"/>
+                <w:b/>
+                <w:color w:val="FFFFFF"/>
+                <w:sz w:val="16"/>
+              </w:rPr>
+              <w:t>Exit evidence</w:t>
+            </w:r>
+          </w:p>
+        </w:tc>
+      </w:tr>
+      <w:tr>
+        <w:tc>
+          <w:tcPr>
+            <w:tcW w:type="dxa" w:w="1300"/>
+            <w:tcMar>
+              <w:top w:w="90" w:type="dxa"/>
+              <w:start w:w="90" w:type="dxa"/>
+              <w:bottom w:w="90" w:type="dxa"/>
+              <w:end w:w="90" w:type="dxa"/>
+            </w:tcMar>
+            <w:vAlign w:val="top"/>
+          </w:tcPr>
+          <w:p>
+            <w:pPr>
+              <w:spacing w:after="0"/>
+            </w:pPr>
+            <w:r>
+              <w:rPr>
+                <w:rFonts w:ascii="Segoe UI" w:hAnsi="Segoe UI"/>
+                <w:sz w:val="16"/>
+              </w:rPr>
+              <w:t>01 · Frame</w:t>
+            </w:r>
+          </w:p>
+        </w:tc>
+        <w:tc>
+          <w:tcPr>
+            <w:tcW w:type="dxa" w:w="2000"/>
+            <w:tcMar>
+              <w:top w:w="90" w:type="dxa"/>
+              <w:start w:w="90" w:type="dxa"/>
+              <w:bottom w:w="90" w:type="dxa"/>
+              <w:end w:w="90" w:type="dxa"/>
+            </w:tcMar>
+            <w:vAlign w:val="top"/>
+          </w:tcPr>
+          <w:p>
+            <w:pPr>
+              <w:spacing w:after="0"/>
+            </w:pPr>
+            <w:r>
+              <w:rPr>
+                <w:rFonts w:ascii="Segoe UI" w:hAnsi="Segoe UI"/>
+                <w:sz w:val="16"/>
+              </w:rPr>
+              <w:t>What decision is being made?</w:t>
+            </w:r>
+          </w:p>
+        </w:tc>
+        <w:tc>
+          <w:tcPr>
+            <w:tcW w:type="dxa" w:w="4000"/>
+            <w:tcMar>
+              <w:top w:w="90" w:type="dxa"/>
+              <w:start w:w="90" w:type="dxa"/>
+              <w:bottom w:w="90" w:type="dxa"/>
+              <w:end w:w="90" w:type="dxa"/>
+            </w:tcMar>
+            <w:vAlign w:val="top"/>
+          </w:tcPr>
+          <w:p>
+            <w:pPr>
+              <w:spacing w:after="0"/>
+            </w:pPr>
+            <w:r>
+              <w:rPr>
+                <w:rFonts w:ascii="Segoe UI" w:hAnsi="Segoe UI"/>
+                <w:sz w:val="16"/>
+              </w:rPr>
+              <w:t>12 reusable problem patterns, four planning horizons, owner, cadence, grain, baseline, freeze window, authority and non-negotiables</w:t>
+            </w:r>
+          </w:p>
+        </w:tc>
+        <w:tc>
+          <w:tcPr>
+            <w:tcW w:type="dxa" w:w="2060"/>
+            <w:tcMar>
+              <w:top w:w="90" w:type="dxa"/>
+              <w:start w:w="90" w:type="dxa"/>
+              <w:bottom w:w="90" w:type="dxa"/>
+              <w:end w:w="90" w:type="dxa"/>
+            </w:tcMar>
+            <w:vAlign w:val="top"/>
+          </w:tcPr>
+          <w:p>
+            <w:pPr>
+              <w:spacing w:after="0"/>
+            </w:pPr>
+            <w:r>
+              <w:rPr>
+                <w:rFonts w:ascii="Segoe UI" w:hAnsi="Segoe UI"/>
+                <w:sz w:val="16"/>
+              </w:rPr>
+              <w:t>Signed decision contract</w:t>
+            </w:r>
+          </w:p>
+        </w:tc>
+      </w:tr>
+      <w:tr>
+        <w:tc>
+          <w:tcPr>
+            <w:tcW w:type="dxa" w:w="1300"/>
+            <w:tcMar>
+              <w:top w:w="90" w:type="dxa"/>
+              <w:start w:w="90" w:type="dxa"/>
+              <w:bottom w:w="90" w:type="dxa"/>
+              <w:end w:w="90" w:type="dxa"/>
+            </w:tcMar>
+            <w:vAlign w:val="top"/>
+            <w:shd w:fill="F1F2ED"/>
+          </w:tcPr>
+          <w:p>
+            <w:pPr>
+              <w:spacing w:after="0"/>
+            </w:pPr>
+            <w:r>
+              <w:rPr>
+                <w:rFonts w:ascii="Segoe UI" w:hAnsi="Segoe UI"/>
+                <w:sz w:val="16"/>
+              </w:rPr>
+              <w:t>02 · Formulate</w:t>
+            </w:r>
+          </w:p>
+        </w:tc>
+        <w:tc>
+          <w:tcPr>
+            <w:tcW w:type="dxa" w:w="2000"/>
+            <w:tcMar>
+              <w:top w:w="90" w:type="dxa"/>
+              <w:start w:w="90" w:type="dxa"/>
+              <w:bottom w:w="90" w:type="dxa"/>
+              <w:end w:w="90" w:type="dxa"/>
+            </w:tcMar>
+            <w:vAlign w:val="top"/>
+            <w:shd w:fill="F1F2ED"/>
+          </w:tcPr>
+          <w:p>
+            <w:pPr>
+              <w:spacing w:after="0"/>
+            </w:pPr>
+            <w:r>
+              <w:rPr>
+                <w:rFonts w:ascii="Segoe UI" w:hAnsi="Segoe UI"/>
+                <w:sz w:val="16"/>
+              </w:rPr>
+              <w:t>What may change and what must remain true?</w:t>
+            </w:r>
+          </w:p>
+        </w:tc>
+        <w:tc>
+          <w:tcPr>
+            <w:tcW w:type="dxa" w:w="4000"/>
+            <w:tcMar>
+              <w:top w:w="90" w:type="dxa"/>
+              <w:start w:w="90" w:type="dxa"/>
+              <w:bottom w:w="90" w:type="dxa"/>
+              <w:end w:w="90" w:type="dxa"/>
+            </w:tcMar>
+            <w:vAlign w:val="top"/>
+            <w:shd w:fill="F1F2ED"/>
+          </w:tcPr>
+          <w:p>
+            <w:pPr>
+              <w:spacing w:after="0"/>
+            </w:pPr>
+            <w:r>
+              <w:rPr>
+                <w:rFonts w:ascii="Segoe UI" w:hAnsi="Segoe UI"/>
+                <w:sz w:val="16"/>
+              </w:rPr>
+              <w:t>Five controlled assumptions, four-level objective hierarchy, canonical variables and all 12 constraint families / 57 illustrative rows</w:t>
+            </w:r>
+          </w:p>
+        </w:tc>
+        <w:tc>
+          <w:tcPr>
+            <w:tcW w:type="dxa" w:w="2060"/>
+            <w:tcMar>
+              <w:top w:w="90" w:type="dxa"/>
+              <w:start w:w="90" w:type="dxa"/>
+              <w:bottom w:w="90" w:type="dxa"/>
+              <w:end w:w="90" w:type="dxa"/>
+            </w:tcMar>
+            <w:vAlign w:val="top"/>
+            <w:shd w:fill="F1F2ED"/>
+          </w:tcPr>
+          <w:p>
+            <w:pPr>
+              <w:spacing w:after="0"/>
+            </w:pPr>
+            <w:r>
+              <w:rPr>
+                <w:rFonts w:ascii="Segoe UI" w:hAnsi="Segoe UI"/>
+                <w:sz w:val="16"/>
+              </w:rPr>
+              <w:t>Versioned formulation and hard/soft status</w:t>
+            </w:r>
+          </w:p>
+        </w:tc>
+      </w:tr>
+      <w:tr>
+        <w:tc>
+          <w:tcPr>
+            <w:tcW w:type="dxa" w:w="1300"/>
+            <w:tcMar>
+              <w:top w:w="90" w:type="dxa"/>
+              <w:start w:w="90" w:type="dxa"/>
+              <w:bottom w:w="90" w:type="dxa"/>
+              <w:end w:w="90" w:type="dxa"/>
+            </w:tcMar>
+            <w:vAlign w:val="top"/>
+          </w:tcPr>
+          <w:p>
+            <w:pPr>
+              <w:spacing w:after="0"/>
+            </w:pPr>
+            <w:r>
+              <w:rPr>
+                <w:rFonts w:ascii="Segoe UI" w:hAnsi="Segoe UI"/>
+                <w:sz w:val="16"/>
+              </w:rPr>
+              <w:t>03 · Techniques</w:t>
+            </w:r>
+          </w:p>
+        </w:tc>
+        <w:tc>
+          <w:tcPr>
+            <w:tcW w:type="dxa" w:w="2000"/>
+            <w:tcMar>
+              <w:top w:w="90" w:type="dxa"/>
+              <w:start w:w="90" w:type="dxa"/>
+              <w:bottom w:w="90" w:type="dxa"/>
+              <w:end w:w="90" w:type="dxa"/>
+            </w:tcMar>
+            <w:vAlign w:val="top"/>
+          </w:tcPr>
+          <w:p>
+            <w:pPr>
+              <w:spacing w:after="0"/>
+            </w:pPr>
+            <w:r>
+              <w:rPr>
+                <w:rFonts w:ascii="Segoe UI" w:hAnsi="Segoe UI"/>
+                <w:sz w:val="16"/>
+              </w:rPr>
+              <w:t>Which method stack fits this decision?</w:t>
+            </w:r>
+          </w:p>
+        </w:tc>
+        <w:tc>
+          <w:tcPr>
+            <w:tcW w:type="dxa" w:w="4000"/>
+            <w:tcMar>
+              <w:top w:w="90" w:type="dxa"/>
+              <w:start w:w="90" w:type="dxa"/>
+              <w:bottom w:w="90" w:type="dxa"/>
+              <w:end w:w="90" w:type="dxa"/>
+            </w:tcMar>
+            <w:vAlign w:val="top"/>
+          </w:tcPr>
+          <w:p>
+            <w:pPr>
+              <w:spacing w:after="0"/>
+            </w:pPr>
+            <w:r>
+              <w:rPr>
+                <w:rFonts w:ascii="Segoe UI" w:hAnsi="Segoe UI"/>
+                <w:sz w:val="16"/>
+              </w:rPr>
+              <w:t>All 30 handbook methods, named techniques, primary/support/fallback role, formulation, outputs, validation, runtime and limitation</w:t>
+            </w:r>
+          </w:p>
+        </w:tc>
+        <w:tc>
+          <w:tcPr>
+            <w:tcW w:type="dxa" w:w="2060"/>
+            <w:tcMar>
+              <w:top w:w="90" w:type="dxa"/>
+              <w:start w:w="90" w:type="dxa"/>
+              <w:bottom w:w="90" w:type="dxa"/>
+              <w:end w:w="90" w:type="dxa"/>
+            </w:tcMar>
+            <w:vAlign w:val="top"/>
+          </w:tcPr>
+          <w:p>
+            <w:pPr>
+              <w:spacing w:after="0"/>
+            </w:pPr>
+            <w:r>
+              <w:rPr>
+                <w:rFonts w:ascii="Segoe UI" w:hAnsi="Segoe UI"/>
+                <w:sz w:val="16"/>
+              </w:rPr>
+              <w:t>Transparent selection rationale</w:t>
+            </w:r>
+          </w:p>
+        </w:tc>
+      </w:tr>
+      <w:tr>
+        <w:tc>
+          <w:tcPr>
+            <w:tcW w:type="dxa" w:w="1300"/>
+            <w:tcMar>
+              <w:top w:w="90" w:type="dxa"/>
+              <w:start w:w="90" w:type="dxa"/>
+              <w:bottom w:w="90" w:type="dxa"/>
+              <w:end w:w="90" w:type="dxa"/>
+            </w:tcMar>
+            <w:vAlign w:val="top"/>
+            <w:shd w:fill="F1F2ED"/>
+          </w:tcPr>
+          <w:p>
+            <w:pPr>
+              <w:spacing w:after="0"/>
+            </w:pPr>
+            <w:r>
+              <w:rPr>
+                <w:rFonts w:ascii="Segoe UI" w:hAnsi="Segoe UI"/>
+                <w:sz w:val="16"/>
+              </w:rPr>
+              <w:t>04 · Stress + compare</w:t>
+            </w:r>
+          </w:p>
+        </w:tc>
+        <w:tc>
+          <w:tcPr>
+            <w:tcW w:type="dxa" w:w="2000"/>
+            <w:tcMar>
+              <w:top w:w="90" w:type="dxa"/>
+              <w:start w:w="90" w:type="dxa"/>
+              <w:bottom w:w="90" w:type="dxa"/>
+              <w:end w:w="90" w:type="dxa"/>
+            </w:tcMar>
+            <w:vAlign w:val="top"/>
+            <w:shd w:fill="F1F2ED"/>
+          </w:tcPr>
+          <w:p>
+            <w:pPr>
+              <w:spacing w:after="0"/>
+            </w:pPr>
+            <w:r>
+              <w:rPr>
+                <w:rFonts w:ascii="Segoe UI" w:hAnsi="Segoe UI"/>
+                <w:sz w:val="16"/>
+              </w:rPr>
+              <w:t>How does the plan behave under uncertainty and trade-offs?</w:t>
+            </w:r>
+          </w:p>
+        </w:tc>
+        <w:tc>
+          <w:tcPr>
+            <w:tcW w:type="dxa" w:w="4000"/>
+            <w:tcMar>
+              <w:top w:w="90" w:type="dxa"/>
+              <w:start w:w="90" w:type="dxa"/>
+              <w:bottom w:w="90" w:type="dxa"/>
+              <w:end w:w="90" w:type="dxa"/>
+            </w:tcMar>
+            <w:vAlign w:val="top"/>
+            <w:shd w:fill="F1F2ED"/>
+          </w:tcPr>
+          <w:p>
+            <w:pPr>
+              <w:spacing w:after="0"/>
+            </w:pPr>
+            <w:r>
+              <w:rPr>
+                <w:rFonts w:ascii="Segoe UI" w:hAnsi="Segoe UI"/>
+                <w:sz w:val="16"/>
+              </w:rPr>
+              <w:t>12 probability-reconciled joint scenarios, cost/service/tail outcomes and 16 illustrative Pareto alternatives</w:t>
+            </w:r>
+          </w:p>
+        </w:tc>
+        <w:tc>
+          <w:tcPr>
+            <w:tcW w:type="dxa" w:w="2060"/>
+            <w:tcMar>
+              <w:top w:w="90" w:type="dxa"/>
+              <w:start w:w="90" w:type="dxa"/>
+              <w:bottom w:w="90" w:type="dxa"/>
+              <w:end w:w="90" w:type="dxa"/>
+            </w:tcMar>
+            <w:vAlign w:val="top"/>
+            <w:shd w:fill="F1F2ED"/>
+          </w:tcPr>
+          <w:p>
+            <w:pPr>
+              <w:spacing w:after="0"/>
+            </w:pPr>
+            <w:r>
+              <w:rPr>
+                <w:rFonts w:ascii="Segoe UI" w:hAnsi="Segoe UI"/>
+                <w:sz w:val="16"/>
+              </w:rPr>
+              <w:t>Scenario, tail-risk and trade-off evidence</w:t>
+            </w:r>
+          </w:p>
+        </w:tc>
+      </w:tr>
+      <w:tr>
+        <w:tc>
+          <w:tcPr>
+            <w:tcW w:type="dxa" w:w="1300"/>
+            <w:tcMar>
+              <w:top w:w="90" w:type="dxa"/>
+              <w:start w:w="90" w:type="dxa"/>
+              <w:bottom w:w="90" w:type="dxa"/>
+              <w:end w:w="90" w:type="dxa"/>
+            </w:tcMar>
+            <w:vAlign w:val="top"/>
+          </w:tcPr>
+          <w:p>
+            <w:pPr>
+              <w:spacing w:after="0"/>
+            </w:pPr>
+            <w:r>
+              <w:rPr>
+                <w:rFonts w:ascii="Segoe UI" w:hAnsi="Segoe UI"/>
+                <w:sz w:val="16"/>
+              </w:rPr>
+              <w:t>05 · Validate + release</w:t>
+            </w:r>
+          </w:p>
+        </w:tc>
+        <w:tc>
+          <w:tcPr>
+            <w:tcW w:type="dxa" w:w="2000"/>
+            <w:tcMar>
+              <w:top w:w="90" w:type="dxa"/>
+              <w:start w:w="90" w:type="dxa"/>
+              <w:bottom w:w="90" w:type="dxa"/>
+              <w:end w:w="90" w:type="dxa"/>
+            </w:tcMar>
+            <w:vAlign w:val="top"/>
+          </w:tcPr>
+          <w:p>
+            <w:pPr>
+              <w:spacing w:after="0"/>
+            </w:pPr>
+            <w:r>
+              <w:rPr>
+                <w:rFonts w:ascii="Segoe UI" w:hAnsi="Segoe UI"/>
+                <w:sz w:val="16"/>
+              </w:rPr>
+              <w:t>Is the recommendation safe to review and execute?</w:t>
+            </w:r>
+          </w:p>
+        </w:tc>
+        <w:tc>
+          <w:tcPr>
+            <w:tcW w:type="dxa" w:w="4000"/>
+            <w:tcMar>
+              <w:top w:w="90" w:type="dxa"/>
+              <w:start w:w="90" w:type="dxa"/>
+              <w:bottom w:w="90" w:type="dxa"/>
+              <w:end w:w="90" w:type="dxa"/>
+            </w:tcMar>
+            <w:vAlign w:val="top"/>
+          </w:tcPr>
+          <w:p>
+            <w:pPr>
+              <w:spacing w:after="0"/>
+            </w:pPr>
+            <w:r>
+              <w:rPr>
+                <w:rFonts w:ascii="Segoe UI" w:hAnsi="Segoe UI"/>
+                <w:sz w:val="16"/>
+              </w:rPr>
+              <w:t>Hard release gate, semantic/mathematical/empirical/operational validation, seven-block report, reproducibility manifest and 20-run history</w:t>
+            </w:r>
+          </w:p>
+        </w:tc>
+        <w:tc>
+          <w:tcPr>
+            <w:tcW w:type="dxa" w:w="2060"/>
+            <w:tcMar>
+              <w:top w:w="90" w:type="dxa"/>
+              <w:start w:w="90" w:type="dxa"/>
+              <w:bottom w:w="90" w:type="dxa"/>
+              <w:end w:w="90" w:type="dxa"/>
+            </w:tcMar>
+            <w:vAlign w:val="top"/>
+          </w:tcPr>
+          <w:p>
+            <w:pPr>
+              <w:spacing w:after="0"/>
+            </w:pPr>
+            <w:r>
+              <w:rPr>
+                <w:rFonts w:ascii="Segoe UI" w:hAnsi="Segoe UI"/>
+                <w:sz w:val="16"/>
+              </w:rPr>
+              <w:t>Human-review package or explicit block</w:t>
+            </w:r>
+          </w:p>
+        </w:tc>
+      </w:tr>
+    </w:tbl>
+    <w:p/>
+    <w:p>
+      <w:pPr>
+        <w:pStyle w:val="Heading2"/>
+      </w:pPr>
+      <w:r>
+        <w:t>Method families</w:t>
+      </w:r>
+    </w:p>
+    <w:tbl>
+      <w:tblPr>
+        <w:tblStyle w:val="TableGrid"/>
+        <w:tblW w:type="dxa" w:w="9360"/>
+        <w:jc w:val="center"/>
+        <w:tblLayout w:type="fixed"/>
+        <w:tblLook w:firstColumn="1" w:firstRow="1" w:lastColumn="0" w:lastRow="0" w:noHBand="0" w:noVBand="1" w:val="04A0"/>
+        <w:tblInd w:w="90" w:type="dxa"/>
+      </w:tblPr>
+      <w:tblGrid>
+        <w:gridCol w:w="1250"/>
+        <w:gridCol w:w="1900"/>
+        <w:gridCol w:w="4200"/>
+        <w:gridCol w:w="2010"/>
+      </w:tblGrid>
+      <w:tr>
+        <w:trPr>
+          <w:tblHeader w:val="true"/>
+        </w:trPr>
+        <w:tc>
+          <w:tcPr>
+            <w:tcW w:type="dxa" w:w="1250"/>
+            <w:shd w:fill="16211C"/>
+            <w:tcMar>
+              <w:top w:w="90" w:type="dxa"/>
+              <w:start w:w="90" w:type="dxa"/>
+              <w:bottom w:w="90" w:type="dxa"/>
+              <w:end w:w="90" w:type="dxa"/>
+            </w:tcMar>
+            <w:vAlign w:val="center"/>
+          </w:tcPr>
+          <w:p>
+            <w:r>
+              <w:rPr>
+                <w:rFonts w:ascii="Segoe UI" w:hAnsi="Segoe UI"/>
+                <w:b/>
+                <w:color w:val="FFFFFF"/>
+                <w:sz w:val="16"/>
+              </w:rPr>
+              <w:t>Codes</w:t>
+            </w:r>
+          </w:p>
+        </w:tc>
+        <w:tc>
+          <w:tcPr>
+            <w:tcW w:type="dxa" w:w="1900"/>
+            <w:shd w:fill="16211C"/>
+            <w:tcMar>
+              <w:top w:w="90" w:type="dxa"/>
+              <w:start w:w="90" w:type="dxa"/>
+              <w:bottom w:w="90" w:type="dxa"/>
+              <w:end w:w="90" w:type="dxa"/>
+            </w:tcMar>
+            <w:vAlign w:val="center"/>
+          </w:tcPr>
+          <w:p>
+            <w:r>
+              <w:rPr>
+                <w:rFonts w:ascii="Segoe UI" w:hAnsi="Segoe UI"/>
+                <w:b/>
+                <w:color w:val="FFFFFF"/>
+                <w:sz w:val="16"/>
+              </w:rPr>
+              <w:t>Family</w:t>
+            </w:r>
+          </w:p>
+        </w:tc>
+        <w:tc>
+          <w:tcPr>
+            <w:tcW w:type="dxa" w:w="4200"/>
+            <w:shd w:fill="16211C"/>
+            <w:tcMar>
+              <w:top w:w="90" w:type="dxa"/>
+              <w:start w:w="90" w:type="dxa"/>
+              <w:bottom w:w="90" w:type="dxa"/>
+              <w:end w:w="90" w:type="dxa"/>
+            </w:tcMar>
+            <w:vAlign w:val="center"/>
+          </w:tcPr>
+          <w:p>
+            <w:r>
+              <w:rPr>
+                <w:rFonts w:ascii="Segoe UI" w:hAnsi="Segoe UI"/>
+                <w:b/>
+                <w:color w:val="FFFFFF"/>
+                <w:sz w:val="16"/>
+              </w:rPr>
+              <w:t>Representative techniques</w:t>
+            </w:r>
+          </w:p>
+        </w:tc>
+        <w:tc>
+          <w:tcPr>
+            <w:tcW w:type="dxa" w:w="2010"/>
+            <w:shd w:fill="16211C"/>
+            <w:tcMar>
+              <w:top w:w="90" w:type="dxa"/>
+              <w:start w:w="90" w:type="dxa"/>
+              <w:bottom w:w="90" w:type="dxa"/>
+              <w:end w:w="90" w:type="dxa"/>
+            </w:tcMar>
+            <w:vAlign w:val="center"/>
+          </w:tcPr>
+          <w:p>
+            <w:r>
+              <w:rPr>
+                <w:rFonts w:ascii="Segoe UI" w:hAnsi="Segoe UI"/>
+                <w:b/>
+                <w:color w:val="FFFFFF"/>
+                <w:sz w:val="16"/>
+              </w:rPr>
+              <w:t>Typical use</w:t>
+            </w:r>
+          </w:p>
+        </w:tc>
+      </w:tr>
+      <w:tr>
+        <w:tc>
+          <w:tcPr>
+            <w:tcW w:type="dxa" w:w="1250"/>
+            <w:tcMar>
+              <w:top w:w="90" w:type="dxa"/>
+              <w:start w:w="90" w:type="dxa"/>
+              <w:bottom w:w="90" w:type="dxa"/>
+              <w:end w:w="90" w:type="dxa"/>
+            </w:tcMar>
+            <w:vAlign w:val="top"/>
+          </w:tcPr>
+          <w:p>
+            <w:pPr>
+              <w:spacing w:after="0"/>
+            </w:pPr>
+            <w:r>
+              <w:rPr>
+                <w:rFonts w:ascii="Segoe UI" w:hAnsi="Segoe UI"/>
+                <w:sz w:val="16"/>
+              </w:rPr>
+              <w:t>M-01–M-04</w:t>
+            </w:r>
+          </w:p>
+        </w:tc>
+        <w:tc>
+          <w:tcPr>
+            <w:tcW w:type="dxa" w:w="1900"/>
+            <w:tcMar>
+              <w:top w:w="90" w:type="dxa"/>
+              <w:start w:w="90" w:type="dxa"/>
+              <w:bottom w:w="90" w:type="dxa"/>
+              <w:end w:w="90" w:type="dxa"/>
+            </w:tcMar>
+            <w:vAlign w:val="top"/>
+          </w:tcPr>
+          <w:p>
+            <w:pPr>
+              <w:spacing w:after="0"/>
+            </w:pPr>
+            <w:r>
+              <w:rPr>
+                <w:rFonts w:ascii="Segoe UI" w:hAnsi="Segoe UI"/>
+                <w:sz w:val="16"/>
+              </w:rPr>
+              <w:t>Diagnose, forecast and estimate</w:t>
+            </w:r>
+          </w:p>
+        </w:tc>
+        <w:tc>
+          <w:tcPr>
+            <w:tcW w:type="dxa" w:w="4200"/>
+            <w:tcMar>
+              <w:top w:w="90" w:type="dxa"/>
+              <w:start w:w="90" w:type="dxa"/>
+              <w:bottom w:w="90" w:type="dxa"/>
+              <w:end w:w="90" w:type="dxa"/>
+            </w:tcMar>
+            <w:vAlign w:val="top"/>
+          </w:tcPr>
+          <w:p>
+            <w:pPr>
+              <w:spacing w:after="0"/>
+            </w:pPr>
+            <w:r>
+              <w:rPr>
+                <w:rFonts w:ascii="Segoe UI" w:hAnsi="Segoe UI"/>
+                <w:sz w:val="16"/>
+              </w:rPr>
+              <w:t>SPC, causal/hierarchical forecasting, Croston-style intermittent demand, Bayesian state estimation</w:t>
+            </w:r>
+          </w:p>
+        </w:tc>
+        <w:tc>
+          <w:tcPr>
+            <w:tcW w:type="dxa" w:w="2010"/>
+            <w:tcMar>
+              <w:top w:w="90" w:type="dxa"/>
+              <w:start w:w="90" w:type="dxa"/>
+              <w:bottom w:w="90" w:type="dxa"/>
+              <w:end w:w="90" w:type="dxa"/>
+            </w:tcMar>
+            <w:vAlign w:val="top"/>
+          </w:tcPr>
+          <w:p>
+            <w:pPr>
+              <w:spacing w:after="0"/>
+            </w:pPr>
+            <w:r>
+              <w:rPr>
+                <w:rFonts w:ascii="Segoe UI" w:hAnsi="Segoe UI"/>
+                <w:sz w:val="16"/>
+              </w:rPr>
+              <w:t>Input fitness, demand, disruption and latent state</w:t>
+            </w:r>
+          </w:p>
+        </w:tc>
+      </w:tr>
+      <w:tr>
+        <w:tc>
+          <w:tcPr>
+            <w:tcW w:type="dxa" w:w="1250"/>
+            <w:tcMar>
+              <w:top w:w="90" w:type="dxa"/>
+              <w:start w:w="90" w:type="dxa"/>
+              <w:bottom w:w="90" w:type="dxa"/>
+              <w:end w:w="90" w:type="dxa"/>
+            </w:tcMar>
+            <w:vAlign w:val="top"/>
+            <w:shd w:fill="F1F2ED"/>
+          </w:tcPr>
+          <w:p>
+            <w:pPr>
+              <w:spacing w:after="0"/>
+            </w:pPr>
+            <w:r>
+              <w:rPr>
+                <w:rFonts w:ascii="Segoe UI" w:hAnsi="Segoe UI"/>
+                <w:sz w:val="16"/>
+              </w:rPr>
+              <w:t>M-05–M-08</w:t>
+            </w:r>
+          </w:p>
+        </w:tc>
+        <w:tc>
+          <w:tcPr>
+            <w:tcW w:type="dxa" w:w="1900"/>
+            <w:tcMar>
+              <w:top w:w="90" w:type="dxa"/>
+              <w:start w:w="90" w:type="dxa"/>
+              <w:bottom w:w="90" w:type="dxa"/>
+              <w:end w:w="90" w:type="dxa"/>
+            </w:tcMar>
+            <w:vAlign w:val="top"/>
+            <w:shd w:fill="F1F2ED"/>
+          </w:tcPr>
+          <w:p>
+            <w:pPr>
+              <w:spacing w:after="0"/>
+            </w:pPr>
+            <w:r>
+              <w:rPr>
+                <w:rFonts w:ascii="Segoe UI" w:hAnsi="Segoe UI"/>
+                <w:sz w:val="16"/>
+              </w:rPr>
+              <w:t>Exact structural optimization</w:t>
+            </w:r>
+          </w:p>
+        </w:tc>
+        <w:tc>
+          <w:tcPr>
+            <w:tcW w:type="dxa" w:w="4200"/>
+            <w:tcMar>
+              <w:top w:w="90" w:type="dxa"/>
+              <w:start w:w="90" w:type="dxa"/>
+              <w:bottom w:w="90" w:type="dxa"/>
+              <w:end w:w="90" w:type="dxa"/>
+            </w:tcMar>
+            <w:vAlign w:val="top"/>
+            <w:shd w:fill="F1F2ED"/>
+          </w:tcPr>
+          <w:p>
+            <w:pPr>
+              <w:spacing w:after="0"/>
+            </w:pPr>
+            <w:r>
+              <w:rPr>
+                <w:rFonts w:ascii="Segoe UI" w:hAnsi="Segoe UI"/>
+                <w:sz w:val="16"/>
+              </w:rPr>
+              <w:t>LP/min-cost flow, MILP branch-and-cut, dynamic programming, CP-SAT</w:t>
+            </w:r>
+          </w:p>
+        </w:tc>
+        <w:tc>
+          <w:tcPr>
+            <w:tcW w:type="dxa" w:w="2010"/>
+            <w:tcMar>
+              <w:top w:w="90" w:type="dxa"/>
+              <w:start w:w="90" w:type="dxa"/>
+              <w:bottom w:w="90" w:type="dxa"/>
+              <w:end w:w="90" w:type="dxa"/>
+            </w:tcMar>
+            <w:vAlign w:val="top"/>
+            <w:shd w:fill="F1F2ED"/>
+          </w:tcPr>
+          <w:p>
+            <w:pPr>
+              <w:spacing w:after="0"/>
+            </w:pPr>
+            <w:r>
+              <w:rPr>
+                <w:rFonts w:ascii="Segoe UI" w:hAnsi="Segoe UI"/>
+                <w:sz w:val="16"/>
+              </w:rPr>
+              <w:t>Allocation, design, sourcing, production, scheduling</w:t>
+            </w:r>
+          </w:p>
+        </w:tc>
+      </w:tr>
+      <w:tr>
+        <w:tc>
+          <w:tcPr>
+            <w:tcW w:type="dxa" w:w="1250"/>
+            <w:tcMar>
+              <w:top w:w="90" w:type="dxa"/>
+              <w:start w:w="90" w:type="dxa"/>
+              <w:bottom w:w="90" w:type="dxa"/>
+              <w:end w:w="90" w:type="dxa"/>
+            </w:tcMar>
+            <w:vAlign w:val="top"/>
+          </w:tcPr>
+          <w:p>
+            <w:pPr>
+              <w:spacing w:after="0"/>
+            </w:pPr>
+            <w:r>
+              <w:rPr>
+                <w:rFonts w:ascii="Segoe UI" w:hAnsi="Segoe UI"/>
+                <w:sz w:val="16"/>
+              </w:rPr>
+              <w:t>M-09–M-12</w:t>
+            </w:r>
+          </w:p>
+        </w:tc>
+        <w:tc>
+          <w:tcPr>
+            <w:tcW w:type="dxa" w:w="1900"/>
+            <w:tcMar>
+              <w:top w:w="90" w:type="dxa"/>
+              <w:start w:w="90" w:type="dxa"/>
+              <w:bottom w:w="90" w:type="dxa"/>
+              <w:end w:w="90" w:type="dxa"/>
+            </w:tcMar>
+            <w:vAlign w:val="top"/>
+          </w:tcPr>
+          <w:p>
+            <w:pPr>
+              <w:spacing w:after="0"/>
+            </w:pPr>
+            <w:r>
+              <w:rPr>
+                <w:rFonts w:ascii="Segoe UI" w:hAnsi="Segoe UI"/>
+                <w:sz w:val="16"/>
+              </w:rPr>
+              <w:t>Fast search and scale</w:t>
+            </w:r>
+          </w:p>
+        </w:tc>
+        <w:tc>
+          <w:tcPr>
+            <w:tcW w:type="dxa" w:w="4200"/>
+            <w:tcMar>
+              <w:top w:w="90" w:type="dxa"/>
+              <w:start w:w="90" w:type="dxa"/>
+              <w:bottom w:w="90" w:type="dxa"/>
+              <w:end w:w="90" w:type="dxa"/>
+            </w:tcMar>
+            <w:vAlign w:val="top"/>
+          </w:tcPr>
+          <w:p>
+            <w:pPr>
+              <w:spacing w:after="0"/>
+            </w:pPr>
+            <w:r>
+              <w:rPr>
+                <w:rFonts w:ascii="Segoe UI" w:hAnsi="Segoe UI"/>
+                <w:sz w:val="16"/>
+              </w:rPr>
+              <w:t>Greedy dispatch, Clarke-Wright, 2-opt/3-opt, tabu, annealing, genetic/memetic, ALNS, Benders, column generation</w:t>
+            </w:r>
+          </w:p>
+        </w:tc>
+        <w:tc>
+          <w:tcPr>
+            <w:tcW w:type="dxa" w:w="2010"/>
+            <w:tcMar>
+              <w:top w:w="90" w:type="dxa"/>
+              <w:start w:w="90" w:type="dxa"/>
+              <w:bottom w:w="90" w:type="dxa"/>
+              <w:end w:w="90" w:type="dxa"/>
+            </w:tcMar>
+            <w:vAlign w:val="top"/>
+          </w:tcPr>
+          <w:p>
+            <w:pPr>
+              <w:spacing w:after="0"/>
+            </w:pPr>
+            <w:r>
+              <w:rPr>
+                <w:rFonts w:ascii="Segoe UI" w:hAnsi="Segoe UI"/>
+                <w:sz w:val="16"/>
+              </w:rPr>
+              <w:t>Real-time fallback and large discrete problems</w:t>
+            </w:r>
+          </w:p>
+        </w:tc>
+      </w:tr>
+      <w:tr>
+        <w:tc>
+          <w:tcPr>
+            <w:tcW w:type="dxa" w:w="1250"/>
+            <w:tcMar>
+              <w:top w:w="90" w:type="dxa"/>
+              <w:start w:w="90" w:type="dxa"/>
+              <w:bottom w:w="90" w:type="dxa"/>
+              <w:end w:w="90" w:type="dxa"/>
+            </w:tcMar>
+            <w:vAlign w:val="top"/>
+            <w:shd w:fill="F1F2ED"/>
+          </w:tcPr>
+          <w:p>
+            <w:pPr>
+              <w:spacing w:after="0"/>
+            </w:pPr>
+            <w:r>
+              <w:rPr>
+                <w:rFonts w:ascii="Segoe UI" w:hAnsi="Segoe UI"/>
+                <w:sz w:val="16"/>
+              </w:rPr>
+              <w:t>M-13–M-15</w:t>
+            </w:r>
+          </w:p>
+        </w:tc>
+        <w:tc>
+          <w:tcPr>
+            <w:tcW w:type="dxa" w:w="1900"/>
+            <w:tcMar>
+              <w:top w:w="90" w:type="dxa"/>
+              <w:start w:w="90" w:type="dxa"/>
+              <w:bottom w:w="90" w:type="dxa"/>
+              <w:end w:w="90" w:type="dxa"/>
+            </w:tcMar>
+            <w:vAlign w:val="top"/>
+            <w:shd w:fill="F1F2ED"/>
+          </w:tcPr>
+          <w:p>
+            <w:pPr>
+              <w:spacing w:after="0"/>
+            </w:pPr>
+            <w:r>
+              <w:rPr>
+                <w:rFonts w:ascii="Segoe UI" w:hAnsi="Segoe UI"/>
+                <w:sz w:val="16"/>
+              </w:rPr>
+              <w:t>Inventory, flow and reliability</w:t>
+            </w:r>
+          </w:p>
+        </w:tc>
+        <w:tc>
+          <w:tcPr>
+            <w:tcW w:type="dxa" w:w="4200"/>
+            <w:tcMar>
+              <w:top w:w="90" w:type="dxa"/>
+              <w:start w:w="90" w:type="dxa"/>
+              <w:bottom w:w="90" w:type="dxa"/>
+              <w:end w:w="90" w:type="dxa"/>
+            </w:tcMar>
+            <w:vAlign w:val="top"/>
+            <w:shd w:fill="F1F2ED"/>
+          </w:tcPr>
+          <w:p>
+            <w:pPr>
+              <w:spacing w:after="0"/>
+            </w:pPr>
+            <w:r>
+              <w:rPr>
+                <w:rFonts w:ascii="Segoe UI" w:hAnsi="Segoe UI"/>
+                <w:sz w:val="16"/>
+              </w:rPr>
+              <w:t>Newsvendor, EOQ, reorder point, multi-echelon service time, Little's Law, survival and maintenance</w:t>
+            </w:r>
+          </w:p>
+        </w:tc>
+        <w:tc>
+          <w:tcPr>
+            <w:tcW w:type="dxa" w:w="2010"/>
+            <w:tcMar>
+              <w:top w:w="90" w:type="dxa"/>
+              <w:start w:w="90" w:type="dxa"/>
+              <w:bottom w:w="90" w:type="dxa"/>
+              <w:end w:w="90" w:type="dxa"/>
+            </w:tcMar>
+            <w:vAlign w:val="top"/>
+            <w:shd w:fill="F1F2ED"/>
+          </w:tcPr>
+          <w:p>
+            <w:pPr>
+              <w:spacing w:after="0"/>
+            </w:pPr>
+            <w:r>
+              <w:rPr>
+                <w:rFonts w:ascii="Segoe UI" w:hAnsi="Segoe UI"/>
+                <w:sz w:val="16"/>
+              </w:rPr>
+              <w:t>Buffers, congestion, assets and spares</w:t>
+            </w:r>
+          </w:p>
+        </w:tc>
+      </w:tr>
+      <w:tr>
+        <w:tc>
+          <w:tcPr>
+            <w:tcW w:type="dxa" w:w="1250"/>
+            <w:tcMar>
+              <w:top w:w="90" w:type="dxa"/>
+              <w:start w:w="90" w:type="dxa"/>
+              <w:bottom w:w="90" w:type="dxa"/>
+              <w:end w:w="90" w:type="dxa"/>
+            </w:tcMar>
+            <w:vAlign w:val="top"/>
+          </w:tcPr>
+          <w:p>
+            <w:pPr>
+              <w:spacing w:after="0"/>
+            </w:pPr>
+            <w:r>
+              <w:rPr>
+                <w:rFonts w:ascii="Segoe UI" w:hAnsi="Segoe UI"/>
+                <w:sz w:val="16"/>
+              </w:rPr>
+              <w:t>M-16–M-19</w:t>
+            </w:r>
+          </w:p>
+        </w:tc>
+        <w:tc>
+          <w:tcPr>
+            <w:tcW w:type="dxa" w:w="1900"/>
+            <w:tcMar>
+              <w:top w:w="90" w:type="dxa"/>
+              <w:start w:w="90" w:type="dxa"/>
+              <w:bottom w:w="90" w:type="dxa"/>
+              <w:end w:w="90" w:type="dxa"/>
+            </w:tcMar>
+            <w:vAlign w:val="top"/>
+          </w:tcPr>
+          <w:p>
+            <w:pPr>
+              <w:spacing w:after="0"/>
+            </w:pPr>
+            <w:r>
+              <w:rPr>
+                <w:rFonts w:ascii="Segoe UI" w:hAnsi="Segoe UI"/>
+                <w:sz w:val="16"/>
+              </w:rPr>
+              <w:t>Simulation</w:t>
+            </w:r>
+          </w:p>
+        </w:tc>
+        <w:tc>
+          <w:tcPr>
+            <w:tcW w:type="dxa" w:w="4200"/>
+            <w:tcMar>
+              <w:top w:w="90" w:type="dxa"/>
+              <w:start w:w="90" w:type="dxa"/>
+              <w:bottom w:w="90" w:type="dxa"/>
+              <w:end w:w="90" w:type="dxa"/>
+            </w:tcMar>
+            <w:vAlign w:val="top"/>
+          </w:tcPr>
+          <w:p>
+            <w:pPr>
+              <w:spacing w:after="0"/>
+            </w:pPr>
+            <w:r>
+              <w:rPr>
+                <w:rFonts w:ascii="Segoe UI" w:hAnsi="Segoe UI"/>
+                <w:sz w:val="16"/>
+              </w:rPr>
+              <w:t>Monte Carlo, discrete-event, system dynamics, agent-based contagion</w:t>
+            </w:r>
+          </w:p>
+        </w:tc>
+        <w:tc>
+          <w:tcPr>
+            <w:tcW w:type="dxa" w:w="2010"/>
+            <w:tcMar>
+              <w:top w:w="90" w:type="dxa"/>
+              <w:start w:w="90" w:type="dxa"/>
+              <w:bottom w:w="90" w:type="dxa"/>
+              <w:end w:w="90" w:type="dxa"/>
+            </w:tcMar>
+            <w:vAlign w:val="top"/>
+          </w:tcPr>
+          <w:p>
+            <w:pPr>
+              <w:spacing w:after="0"/>
+            </w:pPr>
+            <w:r>
+              <w:rPr>
+                <w:rFonts w:ascii="Segoe UI" w:hAnsi="Segoe UI"/>
+                <w:sz w:val="16"/>
+              </w:rPr>
+              <w:t>Distributions, queues, feedback and cascades</w:t>
+            </w:r>
+          </w:p>
+        </w:tc>
+      </w:tr>
+      <w:tr>
+        <w:tc>
+          <w:tcPr>
+            <w:tcW w:type="dxa" w:w="1250"/>
+            <w:tcMar>
+              <w:top w:w="90" w:type="dxa"/>
+              <w:start w:w="90" w:type="dxa"/>
+              <w:bottom w:w="90" w:type="dxa"/>
+              <w:end w:w="90" w:type="dxa"/>
+            </w:tcMar>
+            <w:vAlign w:val="top"/>
+            <w:shd w:fill="F1F2ED"/>
+          </w:tcPr>
+          <w:p>
+            <w:pPr>
+              <w:spacing w:after="0"/>
+            </w:pPr>
+            <w:r>
+              <w:rPr>
+                <w:rFonts w:ascii="Segoe UI" w:hAnsi="Segoe UI"/>
+                <w:sz w:val="16"/>
+              </w:rPr>
+              <w:t>M-20–M-23</w:t>
+            </w:r>
+          </w:p>
+        </w:tc>
+        <w:tc>
+          <w:tcPr>
+            <w:tcW w:type="dxa" w:w="1900"/>
+            <w:tcMar>
+              <w:top w:w="90" w:type="dxa"/>
+              <w:start w:w="90" w:type="dxa"/>
+              <w:bottom w:w="90" w:type="dxa"/>
+              <w:end w:w="90" w:type="dxa"/>
+            </w:tcMar>
+            <w:vAlign w:val="top"/>
+            <w:shd w:fill="F1F2ED"/>
+          </w:tcPr>
+          <w:p>
+            <w:pPr>
+              <w:spacing w:after="0"/>
+            </w:pPr>
+            <w:r>
+              <w:rPr>
+                <w:rFonts w:ascii="Segoe UI" w:hAnsi="Segoe UI"/>
+                <w:sz w:val="16"/>
+              </w:rPr>
+              <w:t>Uncertainty and tail risk</w:t>
+            </w:r>
+          </w:p>
+        </w:tc>
+        <w:tc>
+          <w:tcPr>
+            <w:tcW w:type="dxa" w:w="4200"/>
+            <w:tcMar>
+              <w:top w:w="90" w:type="dxa"/>
+              <w:start w:w="90" w:type="dxa"/>
+              <w:bottom w:w="90" w:type="dxa"/>
+              <w:end w:w="90" w:type="dxa"/>
+            </w:tcMar>
+            <w:vAlign w:val="top"/>
+            <w:shd w:fill="F1F2ED"/>
+          </w:tcPr>
+          <w:p>
+            <w:pPr>
+              <w:spacing w:after="0"/>
+            </w:pPr>
+            <w:r>
+              <w:rPr>
+                <w:rFonts w:ascii="Segoe UI" w:hAnsi="Segoe UI"/>
+                <w:sz w:val="16"/>
+              </w:rPr>
+              <w:t>Stochastic programming, chance constraints, robust/DRO, CVaR</w:t>
+            </w:r>
+          </w:p>
+        </w:tc>
+        <w:tc>
+          <w:tcPr>
+            <w:tcW w:type="dxa" w:w="2010"/>
+            <w:tcMar>
+              <w:top w:w="90" w:type="dxa"/>
+              <w:start w:w="90" w:type="dxa"/>
+              <w:bottom w:w="90" w:type="dxa"/>
+              <w:end w:w="90" w:type="dxa"/>
+            </w:tcMar>
+            <w:vAlign w:val="top"/>
+            <w:shd w:fill="F1F2ED"/>
+          </w:tcPr>
+          <w:p>
+            <w:pPr>
+              <w:spacing w:after="0"/>
+            </w:pPr>
+            <w:r>
+              <w:rPr>
+                <w:rFonts w:ascii="Segoe UI" w:hAnsi="Segoe UI"/>
+                <w:sz w:val="16"/>
+              </w:rPr>
+              <w:t>Here-and-now decisions, recourse, confidence and worst tails</w:t>
+            </w:r>
+          </w:p>
+        </w:tc>
+      </w:tr>
+      <w:tr>
+        <w:tc>
+          <w:tcPr>
+            <w:tcW w:type="dxa" w:w="1250"/>
+            <w:tcMar>
+              <w:top w:w="90" w:type="dxa"/>
+              <w:start w:w="90" w:type="dxa"/>
+              <w:bottom w:w="90" w:type="dxa"/>
+              <w:end w:w="90" w:type="dxa"/>
+            </w:tcMar>
+            <w:vAlign w:val="top"/>
+          </w:tcPr>
+          <w:p>
+            <w:pPr>
+              <w:spacing w:after="0"/>
+            </w:pPr>
+            <w:r>
+              <w:rPr>
+                <w:rFonts w:ascii="Segoe UI" w:hAnsi="Segoe UI"/>
+                <w:sz w:val="16"/>
+              </w:rPr>
+              <w:t>M-24–M-30</w:t>
+            </w:r>
+          </w:p>
+        </w:tc>
+        <w:tc>
+          <w:tcPr>
+            <w:tcW w:type="dxa" w:w="1900"/>
+            <w:tcMar>
+              <w:top w:w="90" w:type="dxa"/>
+              <w:start w:w="90" w:type="dxa"/>
+              <w:bottom w:w="90" w:type="dxa"/>
+              <w:end w:w="90" w:type="dxa"/>
+            </w:tcMar>
+            <w:vAlign w:val="top"/>
+          </w:tcPr>
+          <w:p>
+            <w:pPr>
+              <w:spacing w:after="0"/>
+            </w:pPr>
+            <w:r>
+              <w:rPr>
+                <w:rFonts w:ascii="Segoe UI" w:hAnsi="Segoe UI"/>
+                <w:sz w:val="16"/>
+              </w:rPr>
+              <w:t>Decision systems and governance</w:t>
+            </w:r>
+          </w:p>
+        </w:tc>
+        <w:tc>
+          <w:tcPr>
+            <w:tcW w:type="dxa" w:w="4200"/>
+            <w:tcMar>
+              <w:top w:w="90" w:type="dxa"/>
+              <w:start w:w="90" w:type="dxa"/>
+              <w:bottom w:w="90" w:type="dxa"/>
+              <w:end w:w="90" w:type="dxa"/>
+            </w:tcMar>
+            <w:vAlign w:val="top"/>
+          </w:tcPr>
+          <w:p>
+            <w:pPr>
+              <w:spacing w:after="0"/>
+            </w:pPr>
+            <w:r>
+              <w:rPr>
+                <w:rFonts w:ascii="Segoe UI" w:hAnsi="Segoe UI"/>
+                <w:sz w:val="16"/>
+              </w:rPr>
+              <w:t>Pareto, MCDA/DEA, rolling-horizon twins, ADP/RL, DOE/causal, game theory, acceptance sampling</w:t>
+            </w:r>
+          </w:p>
+        </w:tc>
+        <w:tc>
+          <w:tcPr>
+            <w:tcW w:type="dxa" w:w="2010"/>
+            <w:tcMar>
+              <w:top w:w="90" w:type="dxa"/>
+              <w:start w:w="90" w:type="dxa"/>
+              <w:bottom w:w="90" w:type="dxa"/>
+              <w:end w:w="90" w:type="dxa"/>
+            </w:tcMar>
+            <w:vAlign w:val="top"/>
+          </w:tcPr>
+          <w:p>
+            <w:pPr>
+              <w:spacing w:after="0"/>
+            </w:pPr>
+            <w:r>
+              <w:rPr>
+                <w:rFonts w:ascii="Segoe UI" w:hAnsi="Segoe UI"/>
+                <w:sz w:val="16"/>
+              </w:rPr>
+              <w:t>Trade-offs, learning, contracts, quality and control</w:t>
+            </w:r>
+          </w:p>
+        </w:tc>
+      </w:tr>
+    </w:tbl>
+    <w:p/>
+    <w:p>
+      <w:pPr>
+        <w:pStyle w:val="Heading2"/>
+      </w:pPr>
+      <w:r>
+        <w:t>How to read a calculated response</w:t>
+      </w:r>
+    </w:p>
+    <w:p>
+      <w:pPr>
+        <w:pStyle w:val="ListBullet"/>
+        <w:spacing w:after="60"/>
+      </w:pPr>
+      <w:r>
+        <w:t>Pending decision-contract changes compare scope, case, selected network entity, pattern, horizon, method stack, scenario set, and assumptions with the last input fingerprint. Results remain attached to the prior fingerprint and are visibly stale until Recalculate changes is selected.</w:t>
+      </w:r>
+    </w:p>
+    <w:p>
+      <w:pPr>
+        <w:pStyle w:val="ListBullet"/>
+        <w:spacing w:after="60"/>
+      </w:pPr>
+      <w:r>
+        <w:t>A review-ready result means all 11 synthetic hard-family checks are clear. The twelfth family, MOQ, batch, and setup, is shown as a governed advisory. Every result still requires empirical and operational review and remains non-executable.</w:t>
+      </w:r>
+    </w:p>
+    <w:p>
+      <w:pPr>
+        <w:pStyle w:val="ListBullet"/>
+        <w:spacing w:after="60"/>
+      </w:pPr>
+      <w:r>
+        <w:t>A blocked result identifies the failed service, carbon, budget, qualification, or other hard constraint. The review action stays disabled until those conditions are resolved.</w:t>
+      </w:r>
+    </w:p>
+    <w:p>
+      <w:pPr>
+        <w:pStyle w:val="ListBullet"/>
+        <w:spacing w:after="60"/>
+      </w:pPr>
+      <w:r>
+        <w:t>The Pareto explorer exposes trade-offs; it does not select policy preferences. Lexicographic priorities and epsilon constraints are preferred. Weighted sums require approved units, weights, and sensitivity.</w:t>
+      </w:r>
+    </w:p>
+    <w:p>
+      <w:pPr>
+        <w:pStyle w:val="ListBullet"/>
+        <w:spacing w:after="60"/>
+      </w:pPr>
+      <w:r>
+        <w:t>Never describe Maya's candidate-space index, illustrative constraint checks, Pareto alternatives, or generated history fixtures as evaluated solver nodes, a certified gap, shadow prices, or an optimal solution.</w:t>
+      </w:r>
+    </w:p>
+    <w:p>
+      <w:r>
+        <w:br w:type="page"/>
+      </w:r>
+    </w:p>
+    <w:p>
+      <w:pPr>
+        <w:spacing w:before="80" w:after="60"/>
+      </w:pPr>
+      <w:r>
+        <w:rPr>
+          <w:rFonts w:ascii="Segoe UI" w:hAnsi="Segoe UI"/>
+          <w:b/>
+          <w:color w:val="4C5E54"/>
+          <w:sz w:val="18"/>
+        </w:rPr>
+        <w:t>09 / CHANGE AND LEARNING</w:t>
+      </w:r>
+    </w:p>
+    <w:p>
+      <w:pPr>
+        <w:pStyle w:val="Heading1"/>
+        <w:keepNext/>
+      </w:pPr>
+      <w:r>
+        <w:t>Explain how every application changes over time</w:t>
+      </w:r>
+    </w:p>
+    <w:p>
+      <w:r>
+        <w:t>Open the fifth tab of any application operating model. Each surface provides six app-specific causal records spanning now, 24 hours, 7 days, 30 days, and 90 days. Select a record to inspect the evidence chain and the decision consequence.</w:t>
+      </w:r>
+    </w:p>
+    <w:tbl>
+      <w:tblPr>
+        <w:tblStyle w:val="TableGrid"/>
+        <w:tblW w:type="dxa" w:w="9360"/>
+        <w:jc w:val="center"/>
+        <w:tblLayout w:type="fixed"/>
+        <w:tblLook w:firstColumn="1" w:firstRow="1" w:lastColumn="0" w:lastRow="0" w:noHBand="0" w:noVBand="1" w:val="04A0"/>
+        <w:tblInd w:w="90" w:type="dxa"/>
+      </w:tblPr>
+      <w:tblGrid>
+        <w:gridCol w:w="1800"/>
+        <w:gridCol w:w="4500"/>
+        <w:gridCol w:w="3060"/>
+      </w:tblGrid>
+      <w:tr>
+        <w:trPr>
+          <w:tblHeader w:val="true"/>
+        </w:trPr>
+        <w:tc>
+          <w:tcPr>
+            <w:tcW w:type="dxa" w:w="1800"/>
+            <w:shd w:fill="16211C"/>
+            <w:tcMar>
+              <w:top w:w="90" w:type="dxa"/>
+              <w:start w:w="90" w:type="dxa"/>
+              <w:bottom w:w="90" w:type="dxa"/>
+              <w:end w:w="90" w:type="dxa"/>
+            </w:tcMar>
+            <w:vAlign w:val="center"/>
+          </w:tcPr>
+          <w:p>
+            <w:r>
+              <w:rPr>
+                <w:rFonts w:ascii="Segoe UI" w:hAnsi="Segoe UI"/>
+                <w:b/>
+                <w:color w:val="FFFFFF"/>
+                <w:sz w:val="16"/>
+              </w:rPr>
+              <w:t>Application</w:t>
+            </w:r>
+          </w:p>
+        </w:tc>
+        <w:tc>
+          <w:tcPr>
+            <w:tcW w:type="dxa" w:w="4500"/>
+            <w:shd w:fill="16211C"/>
+            <w:tcMar>
+              <w:top w:w="90" w:type="dxa"/>
+              <w:start w:w="90" w:type="dxa"/>
+              <w:bottom w:w="90" w:type="dxa"/>
+              <w:end w:w="90" w:type="dxa"/>
+            </w:tcMar>
+            <w:vAlign w:val="center"/>
+          </w:tcPr>
+          <w:p>
+            <w:r>
+              <w:rPr>
+                <w:rFonts w:ascii="Segoe UI" w:hAnsi="Segoe UI"/>
+                <w:b/>
+                <w:color w:val="FFFFFF"/>
+                <w:sz w:val="16"/>
+              </w:rPr>
+              <w:t>Examples of monitored change</w:t>
+            </w:r>
+          </w:p>
+        </w:tc>
+        <w:tc>
+          <w:tcPr>
+            <w:tcW w:type="dxa" w:w="3060"/>
+            <w:shd w:fill="16211C"/>
+            <w:tcMar>
+              <w:top w:w="90" w:type="dxa"/>
+              <w:start w:w="90" w:type="dxa"/>
+              <w:bottom w:w="90" w:type="dxa"/>
+              <w:end w:w="90" w:type="dxa"/>
+            </w:tcMar>
+            <w:vAlign w:val="center"/>
+          </w:tcPr>
+          <w:p>
+            <w:r>
+              <w:rPr>
+                <w:rFonts w:ascii="Segoe UI" w:hAnsi="Segoe UI"/>
+                <w:b/>
+                <w:color w:val="FFFFFF"/>
+                <w:sz w:val="16"/>
+              </w:rPr>
+              <w:t>Learning destination</w:t>
+            </w:r>
+          </w:p>
+        </w:tc>
+      </w:tr>
+      <w:tr>
+        <w:tc>
+          <w:tcPr>
+            <w:tcW w:type="dxa" w:w="1800"/>
+            <w:tcMar>
+              <w:top w:w="90" w:type="dxa"/>
+              <w:start w:w="90" w:type="dxa"/>
+              <w:bottom w:w="90" w:type="dxa"/>
+              <w:end w:w="90" w:type="dxa"/>
+            </w:tcMar>
+            <w:vAlign w:val="top"/>
+          </w:tcPr>
+          <w:p>
+            <w:pPr>
+              <w:spacing w:after="0"/>
+            </w:pPr>
+            <w:r>
+              <w:rPr>
+                <w:rFonts w:ascii="Segoe UI" w:hAnsi="Segoe UI"/>
+                <w:sz w:val="16"/>
+              </w:rPr>
+              <w:t>RiskRadar</w:t>
+            </w:r>
+          </w:p>
+        </w:tc>
+        <w:tc>
+          <w:tcPr>
+            <w:tcW w:type="dxa" w:w="4500"/>
+            <w:tcMar>
+              <w:top w:w="90" w:type="dxa"/>
+              <w:start w:w="90" w:type="dxa"/>
+              <w:bottom w:w="90" w:type="dxa"/>
+              <w:end w:w="90" w:type="dxa"/>
+            </w:tcMar>
+            <w:vAlign w:val="top"/>
+          </w:tcPr>
+          <w:p>
+            <w:pPr>
+              <w:spacing w:after="0"/>
+            </w:pPr>
+            <w:r>
+              <w:rPr>
+                <w:rFonts w:ascii="Segoe UI" w:hAnsi="Segoe UI"/>
+                <w:sz w:val="16"/>
+              </w:rPr>
+              <w:t>Posterior disruption, P90 recovery, control strength, customer concentration and calibration</w:t>
+            </w:r>
+          </w:p>
+        </w:tc>
+        <w:tc>
+          <w:tcPr>
+            <w:tcW w:type="dxa" w:w="3060"/>
+            <w:tcMar>
+              <w:top w:w="90" w:type="dxa"/>
+              <w:start w:w="90" w:type="dxa"/>
+              <w:bottom w:w="90" w:type="dxa"/>
+              <w:end w:w="90" w:type="dxa"/>
+            </w:tcMar>
+            <w:vAlign w:val="top"/>
+          </w:tcPr>
+          <w:p>
+            <w:pPr>
+              <w:spacing w:after="0"/>
+            </w:pPr>
+            <w:r>
+              <w:rPr>
+                <w:rFonts w:ascii="Segoe UI" w:hAnsi="Segoe UI"/>
+                <w:sz w:val="16"/>
+              </w:rPr>
+              <w:t>Event priors, recovery distributions and control effectiveness</w:t>
+            </w:r>
+          </w:p>
+        </w:tc>
+      </w:tr>
+      <w:tr>
+        <w:tc>
+          <w:tcPr>
+            <w:tcW w:type="dxa" w:w="1800"/>
+            <w:tcMar>
+              <w:top w:w="90" w:type="dxa"/>
+              <w:start w:w="90" w:type="dxa"/>
+              <w:bottom w:w="90" w:type="dxa"/>
+              <w:end w:w="90" w:type="dxa"/>
+            </w:tcMar>
+            <w:vAlign w:val="top"/>
+            <w:shd w:fill="F1F2ED"/>
+          </w:tcPr>
+          <w:p>
+            <w:pPr>
+              <w:spacing w:after="0"/>
+            </w:pPr>
+            <w:r>
+              <w:rPr>
+                <w:rFonts w:ascii="Segoe UI" w:hAnsi="Segoe UI"/>
+                <w:sz w:val="16"/>
+              </w:rPr>
+              <w:t>Network Optimizer</w:t>
+            </w:r>
+          </w:p>
+        </w:tc>
+        <w:tc>
+          <w:tcPr>
+            <w:tcW w:type="dxa" w:w="4500"/>
+            <w:tcMar>
+              <w:top w:w="90" w:type="dxa"/>
+              <w:start w:w="90" w:type="dxa"/>
+              <w:bottom w:w="90" w:type="dxa"/>
+              <w:end w:w="90" w:type="dxa"/>
+            </w:tcMar>
+            <w:vAlign w:val="top"/>
+            <w:shd w:fill="F1F2ED"/>
+          </w:tcPr>
+          <w:p>
+            <w:pPr>
+              <w:spacing w:after="0"/>
+            </w:pPr>
+            <w:r>
+              <w:rPr>
+                <w:rFonts w:ascii="Segoe UI" w:hAnsi="Segoe UI"/>
+                <w:sz w:val="16"/>
+              </w:rPr>
+              <w:t>Feasible candidate set, carbon slack, robust service, plan churn, fallback regret and scenario reduction</w:t>
+            </w:r>
+          </w:p>
+        </w:tc>
+        <w:tc>
+          <w:tcPr>
+            <w:tcW w:type="dxa" w:w="3060"/>
+            <w:tcMar>
+              <w:top w:w="90" w:type="dxa"/>
+              <w:start w:w="90" w:type="dxa"/>
+              <w:bottom w:w="90" w:type="dxa"/>
+              <w:end w:w="90" w:type="dxa"/>
+            </w:tcMar>
+            <w:vAlign w:val="top"/>
+            <w:shd w:fill="F1F2ED"/>
+          </w:tcPr>
+          <w:p>
+            <w:pPr>
+              <w:spacing w:after="0"/>
+            </w:pPr>
+            <w:r>
+              <w:rPr>
+                <w:rFonts w:ascii="Segoe UI" w:hAnsi="Segoe UI"/>
+                <w:sz w:val="16"/>
+              </w:rPr>
+              <w:t>Formulation, parameters, scenarios and fallback policy</w:t>
+            </w:r>
+          </w:p>
+        </w:tc>
+      </w:tr>
+      <w:tr>
+        <w:tc>
+          <w:tcPr>
+            <w:tcW w:type="dxa" w:w="1800"/>
+            <w:tcMar>
+              <w:top w:w="90" w:type="dxa"/>
+              <w:start w:w="90" w:type="dxa"/>
+              <w:bottom w:w="90" w:type="dxa"/>
+              <w:end w:w="90" w:type="dxa"/>
+            </w:tcMar>
+            <w:vAlign w:val="top"/>
+          </w:tcPr>
+          <w:p>
+            <w:pPr>
+              <w:spacing w:after="0"/>
+            </w:pPr>
+            <w:r>
+              <w:rPr>
+                <w:rFonts w:ascii="Segoe UI" w:hAnsi="Segoe UI"/>
+                <w:sz w:val="16"/>
+              </w:rPr>
+              <w:t>FlowLens</w:t>
+            </w:r>
+          </w:p>
+        </w:tc>
+        <w:tc>
+          <w:tcPr>
+            <w:tcW w:type="dxa" w:w="4500"/>
+            <w:tcMar>
+              <w:top w:w="90" w:type="dxa"/>
+              <w:start w:w="90" w:type="dxa"/>
+              <w:bottom w:w="90" w:type="dxa"/>
+              <w:end w:w="90" w:type="dxa"/>
+            </w:tcMar>
+            <w:vAlign w:val="top"/>
+          </w:tcPr>
+          <w:p>
+            <w:pPr>
+              <w:spacing w:after="0"/>
+            </w:pPr>
+            <w:r>
+              <w:rPr>
+                <w:rFonts w:ascii="Segoe UI" w:hAnsi="Segoe UI"/>
+                <w:sz w:val="16"/>
+              </w:rPr>
+              <w:t>Cash date, margin leakage, inventory aging, contract timing, forecast bias and reconciliation</w:t>
+            </w:r>
+          </w:p>
+        </w:tc>
+        <w:tc>
+          <w:tcPr>
+            <w:tcW w:type="dxa" w:w="3060"/>
+            <w:tcMar>
+              <w:top w:w="90" w:type="dxa"/>
+              <w:start w:w="90" w:type="dxa"/>
+              <w:bottom w:w="90" w:type="dxa"/>
+              <w:end w:w="90" w:type="dxa"/>
+            </w:tcMar>
+            <w:vAlign w:val="top"/>
+          </w:tcPr>
+          <w:p>
+            <w:pPr>
+              <w:spacing w:after="0"/>
+            </w:pPr>
+            <w:r>
+              <w:rPr>
+                <w:rFonts w:ascii="Segoe UI" w:hAnsi="Segoe UI"/>
+                <w:sz w:val="16"/>
+              </w:rPr>
+              <w:t>Cash timing, recognition and realized action benefit</w:t>
+            </w:r>
+          </w:p>
+        </w:tc>
+      </w:tr>
+      <w:tr>
+        <w:tc>
+          <w:tcPr>
+            <w:tcW w:type="dxa" w:w="1800"/>
+            <w:tcMar>
+              <w:top w:w="90" w:type="dxa"/>
+              <w:start w:w="90" w:type="dxa"/>
+              <w:bottom w:w="90" w:type="dxa"/>
+              <w:end w:w="90" w:type="dxa"/>
+            </w:tcMar>
+            <w:vAlign w:val="top"/>
+            <w:shd w:fill="F1F2ED"/>
+          </w:tcPr>
+          <w:p>
+            <w:pPr>
+              <w:spacing w:after="0"/>
+            </w:pPr>
+            <w:r>
+              <w:rPr>
+                <w:rFonts w:ascii="Segoe UI" w:hAnsi="Segoe UI"/>
+                <w:sz w:val="16"/>
+              </w:rPr>
+              <w:t>DemandSense</w:t>
+            </w:r>
+          </w:p>
+        </w:tc>
+        <w:tc>
+          <w:tcPr>
+            <w:tcW w:type="dxa" w:w="4500"/>
+            <w:tcMar>
+              <w:top w:w="90" w:type="dxa"/>
+              <w:start w:w="90" w:type="dxa"/>
+              <w:bottom w:w="90" w:type="dxa"/>
+              <w:end w:w="90" w:type="dxa"/>
+            </w:tcMar>
+            <w:vAlign w:val="top"/>
+            <w:shd w:fill="F1F2ED"/>
+          </w:tcPr>
+          <w:p>
+            <w:pPr>
+              <w:spacing w:after="0"/>
+            </w:pPr>
+            <w:r>
+              <w:rPr>
+                <w:rFonts w:ascii="Segoe UI" w:hAnsi="Segoe UI"/>
+                <w:sz w:val="16"/>
+              </w:rPr>
+              <w:t>Consensus, launch probability, bias, intermittent uncertainty, interval coverage and upside</w:t>
+            </w:r>
+          </w:p>
+        </w:tc>
+        <w:tc>
+          <w:tcPr>
+            <w:tcW w:type="dxa" w:w="3060"/>
+            <w:tcMar>
+              <w:top w:w="90" w:type="dxa"/>
+              <w:start w:w="90" w:type="dxa"/>
+              <w:bottom w:w="90" w:type="dxa"/>
+              <w:end w:w="90" w:type="dxa"/>
+            </w:tcMar>
+            <w:vAlign w:val="top"/>
+            <w:shd w:fill="F1F2ED"/>
+          </w:tcPr>
+          <w:p>
+            <w:pPr>
+              <w:spacing w:after="0"/>
+            </w:pPr>
+            <w:r>
+              <w:rPr>
+                <w:rFonts w:ascii="Segoe UI" w:hAnsi="Segoe UI"/>
+                <w:sz w:val="16"/>
+              </w:rPr>
+              <w:t>Features, overrides, hierarchy and scenario library</w:t>
+            </w:r>
+          </w:p>
+        </w:tc>
+      </w:tr>
+      <w:tr>
+        <w:tc>
+          <w:tcPr>
+            <w:tcW w:type="dxa" w:w="1800"/>
+            <w:tcMar>
+              <w:top w:w="90" w:type="dxa"/>
+              <w:start w:w="90" w:type="dxa"/>
+              <w:bottom w:w="90" w:type="dxa"/>
+              <w:end w:w="90" w:type="dxa"/>
+            </w:tcMar>
+            <w:vAlign w:val="top"/>
+          </w:tcPr>
+          <w:p>
+            <w:pPr>
+              <w:spacing w:after="0"/>
+            </w:pPr>
+            <w:r>
+              <w:rPr>
+                <w:rFonts w:ascii="Segoe UI" w:hAnsi="Segoe UI"/>
+                <w:sz w:val="16"/>
+              </w:rPr>
+              <w:t>SupplierGraph</w:t>
+            </w:r>
+          </w:p>
+        </w:tc>
+        <w:tc>
+          <w:tcPr>
+            <w:tcW w:type="dxa" w:w="4500"/>
+            <w:tcMar>
+              <w:top w:w="90" w:type="dxa"/>
+              <w:start w:w="90" w:type="dxa"/>
+              <w:bottom w:w="90" w:type="dxa"/>
+              <w:end w:w="90" w:type="dxa"/>
+            </w:tcMar>
+            <w:vAlign w:val="top"/>
+          </w:tcPr>
+          <w:p>
+            <w:pPr>
+              <w:spacing w:after="0"/>
+            </w:pPr>
+            <w:r>
+              <w:rPr>
+                <w:rFonts w:ascii="Segoe UI" w:hAnsi="Segoe UI"/>
+                <w:sz w:val="16"/>
+              </w:rPr>
+              <w:t>Ownership, capability match, headroom, certification, rank stability and single-source paths</w:t>
+            </w:r>
+          </w:p>
+        </w:tc>
+        <w:tc>
+          <w:tcPr>
+            <w:tcW w:type="dxa" w:w="3060"/>
+            <w:tcMar>
+              <w:top w:w="90" w:type="dxa"/>
+              <w:start w:w="90" w:type="dxa"/>
+              <w:bottom w:w="90" w:type="dxa"/>
+              <w:end w:w="90" w:type="dxa"/>
+            </w:tcMar>
+            <w:vAlign w:val="top"/>
+          </w:tcPr>
+          <w:p>
+            <w:pPr>
+              <w:spacing w:after="0"/>
+            </w:pPr>
+            <w:r>
+              <w:rPr>
+                <w:rFonts w:ascii="Segoe UI" w:hAnsi="Segoe UI"/>
+                <w:sz w:val="16"/>
+              </w:rPr>
+              <w:t>Capability ontology, MCDA weights and evidence decay</w:t>
+            </w:r>
+          </w:p>
+        </w:tc>
+      </w:tr>
+      <w:tr>
+        <w:tc>
+          <w:tcPr>
+            <w:tcW w:type="dxa" w:w="1800"/>
+            <w:tcMar>
+              <w:top w:w="90" w:type="dxa"/>
+              <w:start w:w="90" w:type="dxa"/>
+              <w:bottom w:w="90" w:type="dxa"/>
+              <w:end w:w="90" w:type="dxa"/>
+            </w:tcMar>
+            <w:vAlign w:val="top"/>
+            <w:shd w:fill="F1F2ED"/>
+          </w:tcPr>
+          <w:p>
+            <w:pPr>
+              <w:spacing w:after="0"/>
+            </w:pPr>
+            <w:r>
+              <w:rPr>
+                <w:rFonts w:ascii="Segoe UI" w:hAnsi="Segoe UI"/>
+                <w:sz w:val="16"/>
+              </w:rPr>
+              <w:t>Data Agent Hub</w:t>
+            </w:r>
+          </w:p>
+        </w:tc>
+        <w:tc>
+          <w:tcPr>
+            <w:tcW w:type="dxa" w:w="4500"/>
+            <w:tcMar>
+              <w:top w:w="90" w:type="dxa"/>
+              <w:start w:w="90" w:type="dxa"/>
+              <w:bottom w:w="90" w:type="dxa"/>
+              <w:end w:w="90" w:type="dxa"/>
+            </w:tcMar>
+            <w:vAlign w:val="top"/>
+            <w:shd w:fill="F1F2ED"/>
+          </w:tcPr>
+          <w:p>
+            <w:pPr>
+              <w:spacing w:after="0"/>
+            </w:pPr>
+            <w:r>
+              <w:rPr>
+                <w:rFonts w:ascii="Segoe UI" w:hAnsi="Segoe UI"/>
+                <w:sz w:val="16"/>
+              </w:rPr>
+              <w:t>Schema quarantine, policy hold, throughput, SLO burn, field denials and merge latency</w:t>
+            </w:r>
+          </w:p>
+        </w:tc>
+        <w:tc>
+          <w:tcPr>
+            <w:tcW w:type="dxa" w:w="3060"/>
+            <w:tcMar>
+              <w:top w:w="90" w:type="dxa"/>
+              <w:start w:w="90" w:type="dxa"/>
+              <w:bottom w:w="90" w:type="dxa"/>
+              <w:end w:w="90" w:type="dxa"/>
+            </w:tcMar>
+            <w:vAlign w:val="top"/>
+            <w:shd w:fill="F1F2ED"/>
+          </w:tcPr>
+          <w:p>
+            <w:pPr>
+              <w:spacing w:after="0"/>
+            </w:pPr>
+            <w:r>
+              <w:rPr>
+                <w:rFonts w:ascii="Segoe UI" w:hAnsi="Segoe UI"/>
+                <w:sz w:val="16"/>
+              </w:rPr>
+              <w:t>Connector contracts, mappings and policy manifests</w:t>
+            </w:r>
+          </w:p>
+        </w:tc>
+      </w:tr>
+      <w:tr>
+        <w:tc>
+          <w:tcPr>
+            <w:tcW w:type="dxa" w:w="1800"/>
+            <w:tcMar>
+              <w:top w:w="90" w:type="dxa"/>
+              <w:start w:w="90" w:type="dxa"/>
+              <w:bottom w:w="90" w:type="dxa"/>
+              <w:end w:w="90" w:type="dxa"/>
+            </w:tcMar>
+            <w:vAlign w:val="top"/>
+          </w:tcPr>
+          <w:p>
+            <w:pPr>
+              <w:spacing w:after="0"/>
+            </w:pPr>
+            <w:r>
+              <w:rPr>
+                <w:rFonts w:ascii="Segoe UI" w:hAnsi="Segoe UI"/>
+                <w:sz w:val="16"/>
+              </w:rPr>
+              <w:t>Knowledge Graph</w:t>
+            </w:r>
+          </w:p>
+        </w:tc>
+        <w:tc>
+          <w:tcPr>
+            <w:tcW w:type="dxa" w:w="4500"/>
+            <w:tcMar>
+              <w:top w:w="90" w:type="dxa"/>
+              <w:start w:w="90" w:type="dxa"/>
+              <w:bottom w:w="90" w:type="dxa"/>
+              <w:end w:w="90" w:type="dxa"/>
+            </w:tcMar>
+            <w:vAlign w:val="top"/>
+          </w:tcPr>
+          <w:p>
+            <w:pPr>
+              <w:spacing w:after="0"/>
+            </w:pPr>
+            <w:r>
+              <w:rPr>
+                <w:rFonts w:ascii="Segoe UI" w:hAnsi="Segoe UI"/>
+                <w:sz w:val="16"/>
+              </w:rPr>
+              <w:t>Entity merge, source disagreement, evidence decay, margin-link coverage, ontology and queue</w:t>
+            </w:r>
+          </w:p>
+        </w:tc>
+        <w:tc>
+          <w:tcPr>
+            <w:tcW w:type="dxa" w:w="3060"/>
+            <w:tcMar>
+              <w:top w:w="90" w:type="dxa"/>
+              <w:start w:w="90" w:type="dxa"/>
+              <w:bottom w:w="90" w:type="dxa"/>
+              <w:end w:w="90" w:type="dxa"/>
+            </w:tcMar>
+            <w:vAlign w:val="top"/>
+          </w:tcPr>
+          <w:p>
+            <w:pPr>
+              <w:spacing w:after="0"/>
+            </w:pPr>
+            <w:r>
+              <w:rPr>
+                <w:rFonts w:ascii="Segoe UI" w:hAnsi="Segoe UI"/>
+                <w:sz w:val="16"/>
+              </w:rPr>
+              <w:t>Resolution, ontology, source reliability and temporal assertions</w:t>
+            </w:r>
+          </w:p>
+        </w:tc>
+      </w:tr>
+    </w:tbl>
+    <w:p/>
+    <w:p>
+      <w:pPr>
+        <w:pStyle w:val="Heading2"/>
+      </w:pPr>
+      <w:r>
+        <w:t>Closed-loop interpretation</w:t>
+      </w:r>
+    </w:p>
+    <w:p>
+      <w:pPr>
+        <w:pStyle w:val="ListBullet"/>
+        <w:spacing w:after="60"/>
+      </w:pPr>
+      <w:r>
+        <w:t>Before, Current, and Forecast are values attached to a specific as-of timestamp and deterministic concept scenario—not live telemetry.</w:t>
+      </w:r>
+    </w:p>
+    <w:p>
+      <w:pPr>
+        <w:pStyle w:val="ListBullet"/>
+        <w:spacing w:after="60"/>
+      </w:pPr>
+      <w:r>
+        <w:t>Why it changed describes the modeled causal chain; Evidence + confidence identifies the source blend and its confidence; Decision trigger states the threshold that changes workflow.</w:t>
+      </w:r>
+    </w:p>
+    <w:p>
+      <w:pPr>
+        <w:pStyle w:val="ListBullet"/>
+        <w:spacing w:after="60"/>
+      </w:pPr>
+      <w:r>
+        <w:t>Accountable owner and downstream handoff establish who reviews the implication and which application or case consumes it.</w:t>
+      </w:r>
+    </w:p>
+    <w:p>
+      <w:pPr>
+        <w:pStyle w:val="ListBullet"/>
+        <w:spacing w:after="60"/>
+      </w:pPr>
+      <w:r>
+        <w:t>The learning contract records champion, challenger, last validation, next review, drift trigger, outcome window, and feedback destination. No challenger becomes active automatically.</w:t>
+      </w:r>
+    </w:p>
+    <w:p>
+      <w:pPr>
+        <w:spacing w:before="80" w:after="60"/>
+      </w:pPr>
+      <w:r>
+        <w:rPr>
+          <w:rFonts w:ascii="Segoe UI" w:hAnsi="Segoe UI"/>
+          <w:b/>
+          <w:color w:val="4C5E54"/>
+          <w:sz w:val="18"/>
+        </w:rPr>
+        <w:t>10 / SYNTHETIC DATA REFERENCE</w:t>
+      </w:r>
+    </w:p>
+    <w:p>
+      <w:pPr>
+        <w:pStyle w:val="Heading1"/>
+        <w:keepNext/>
+      </w:pPr>
+      <w:r>
+        <w:t>Know what the concept contains—and what it does not</w:t>
+      </w:r>
+    </w:p>
+    <w:tbl>
+      <w:tblPr>
+        <w:tblStyle w:val="TableGrid"/>
+        <w:tblW w:type="dxa" w:w="9360"/>
+        <w:jc w:val="center"/>
+        <w:tblLayout w:type="fixed"/>
+        <w:tblLook w:firstColumn="1" w:firstRow="1" w:lastColumn="0" w:lastRow="0" w:noHBand="0" w:noVBand="1" w:val="04A0"/>
+        <w:tblInd w:w="90" w:type="dxa"/>
+      </w:tblPr>
+      <w:tblGrid>
+        <w:gridCol w:w="1900"/>
+        <w:gridCol w:w="2300"/>
+        <w:gridCol w:w="5160"/>
+      </w:tblGrid>
+      <w:tr>
+        <w:trPr>
+          <w:tblHeader w:val="true"/>
+        </w:trPr>
+        <w:tc>
+          <w:tcPr>
+            <w:tcW w:type="dxa" w:w="1900"/>
+            <w:shd w:fill="16211C"/>
+            <w:tcMar>
+              <w:top w:w="90" w:type="dxa"/>
+              <w:start w:w="90" w:type="dxa"/>
+              <w:bottom w:w="90" w:type="dxa"/>
+              <w:end w:w="90" w:type="dxa"/>
+            </w:tcMar>
+            <w:vAlign w:val="center"/>
+          </w:tcPr>
+          <w:p>
+            <w:r>
+              <w:rPr>
+                <w:rFonts w:ascii="Segoe UI" w:hAnsi="Segoe UI"/>
+                <w:b/>
+                <w:color w:val="FFFFFF"/>
+                <w:sz w:val="16"/>
+              </w:rPr>
+              <w:t>Domain</w:t>
+            </w:r>
+          </w:p>
+        </w:tc>
+        <w:tc>
+          <w:tcPr>
+            <w:tcW w:type="dxa" w:w="2300"/>
+            <w:shd w:fill="16211C"/>
+            <w:tcMar>
+              <w:top w:w="90" w:type="dxa"/>
+              <w:start w:w="90" w:type="dxa"/>
+              <w:bottom w:w="90" w:type="dxa"/>
+              <w:end w:w="90" w:type="dxa"/>
+            </w:tcMar>
+            <w:vAlign w:val="center"/>
+          </w:tcPr>
+          <w:p>
+            <w:r>
+              <w:rPr>
+                <w:rFonts w:ascii="Segoe UI" w:hAnsi="Segoe UI"/>
+                <w:b/>
+                <w:color w:val="FFFFFF"/>
+                <w:sz w:val="16"/>
+              </w:rPr>
+              <w:t>Concept volume</w:t>
+            </w:r>
+          </w:p>
+        </w:tc>
+        <w:tc>
+          <w:tcPr>
+            <w:tcW w:type="dxa" w:w="5160"/>
+            <w:shd w:fill="16211C"/>
+            <w:tcMar>
+              <w:top w:w="90" w:type="dxa"/>
+              <w:start w:w="90" w:type="dxa"/>
+              <w:bottom w:w="90" w:type="dxa"/>
+              <w:end w:w="90" w:type="dxa"/>
+            </w:tcMar>
+            <w:vAlign w:val="center"/>
+          </w:tcPr>
+          <w:p>
+            <w:r>
+              <w:rPr>
+                <w:rFonts w:ascii="Segoe UI" w:hAnsi="Segoe UI"/>
+                <w:b/>
+                <w:color w:val="FFFFFF"/>
+                <w:sz w:val="16"/>
+              </w:rPr>
+              <w:t>What is linked</w:t>
+            </w:r>
+          </w:p>
+        </w:tc>
+      </w:tr>
+      <w:tr>
+        <w:tc>
+          <w:tcPr>
+            <w:tcW w:type="dxa" w:w="1900"/>
+            <w:tcMar>
+              <w:top w:w="90" w:type="dxa"/>
+              <w:start w:w="90" w:type="dxa"/>
+              <w:bottom w:w="90" w:type="dxa"/>
+              <w:end w:w="90" w:type="dxa"/>
+            </w:tcMar>
+            <w:vAlign w:val="top"/>
+          </w:tcPr>
+          <w:p>
+            <w:pPr>
+              <w:spacing w:after="0"/>
+            </w:pPr>
+            <w:r>
+              <w:rPr>
+                <w:rFonts w:ascii="Segoe UI" w:hAnsi="Segoe UI"/>
+                <w:sz w:val="16"/>
+              </w:rPr>
+              <w:t>Network geography</w:t>
+            </w:r>
+          </w:p>
+        </w:tc>
+        <w:tc>
+          <w:tcPr>
+            <w:tcW w:type="dxa" w:w="2300"/>
+            <w:tcMar>
+              <w:top w:w="90" w:type="dxa"/>
+              <w:start w:w="90" w:type="dxa"/>
+              <w:bottom w:w="90" w:type="dxa"/>
+              <w:end w:w="90" w:type="dxa"/>
+            </w:tcMar>
+            <w:vAlign w:val="top"/>
+          </w:tcPr>
+          <w:p>
+            <w:pPr>
+              <w:spacing w:after="0"/>
+            </w:pPr>
+            <w:r>
+              <w:rPr>
+                <w:rFonts w:ascii="Segoe UI" w:hAnsi="Segoe UI"/>
+                <w:sz w:val="16"/>
+              </w:rPr>
+              <w:t>43 locations · 42 corridors</w:t>
+            </w:r>
+          </w:p>
+        </w:tc>
+        <w:tc>
+          <w:tcPr>
+            <w:tcW w:type="dxa" w:w="5160"/>
+            <w:tcMar>
+              <w:top w:w="90" w:type="dxa"/>
+              <w:start w:w="90" w:type="dxa"/>
+              <w:bottom w:w="90" w:type="dxa"/>
+              <w:end w:w="90" w:type="dxa"/>
+            </w:tcMar>
+            <w:vAlign w:val="top"/>
+          </w:tcPr>
+          <w:p>
+            <w:pPr>
+              <w:spacing w:after="0"/>
+            </w:pPr>
+            <w:r>
+              <w:rPr>
+                <w:rFonts w:ascii="Segoe UI" w:hAnsi="Segoe UI"/>
+                <w:sz w:val="16"/>
+              </w:rPr>
+              <w:t>Latitude/longitude, facility attributes, waypoints, capacity, volume, value, freight, ETA, carbon and owner</w:t>
+            </w:r>
+          </w:p>
+        </w:tc>
+      </w:tr>
+      <w:tr>
+        <w:tc>
+          <w:tcPr>
+            <w:tcW w:type="dxa" w:w="1900"/>
+            <w:tcMar>
+              <w:top w:w="90" w:type="dxa"/>
+              <w:start w:w="90" w:type="dxa"/>
+              <w:bottom w:w="90" w:type="dxa"/>
+              <w:end w:w="90" w:type="dxa"/>
+            </w:tcMar>
+            <w:vAlign w:val="top"/>
+            <w:shd w:fill="F1F2ED"/>
+          </w:tcPr>
+          <w:p>
+            <w:pPr>
+              <w:spacing w:after="0"/>
+            </w:pPr>
+            <w:r>
+              <w:rPr>
+                <w:rFonts w:ascii="Segoe UI" w:hAnsi="Segoe UI"/>
+                <w:sz w:val="16"/>
+              </w:rPr>
+              <w:t>Movement radar</w:t>
+            </w:r>
+          </w:p>
+        </w:tc>
+        <w:tc>
+          <w:tcPr>
+            <w:tcW w:type="dxa" w:w="2300"/>
+            <w:tcMar>
+              <w:top w:w="90" w:type="dxa"/>
+              <w:start w:w="90" w:type="dxa"/>
+              <w:bottom w:w="90" w:type="dxa"/>
+              <w:end w:w="90" w:type="dxa"/>
+            </w:tcMar>
+            <w:vAlign w:val="top"/>
+            <w:shd w:fill="F1F2ED"/>
+          </w:tcPr>
+          <w:p>
+            <w:pPr>
+              <w:spacing w:after="0"/>
+            </w:pPr>
+            <w:r>
+              <w:rPr>
+                <w:rFonts w:ascii="Segoe UI" w:hAnsi="Segoe UI"/>
+                <w:sz w:val="16"/>
+              </w:rPr>
+              <w:t>96 tracked assets · 240 cargo lots</w:t>
+            </w:r>
+          </w:p>
+        </w:tc>
+        <w:tc>
+          <w:tcPr>
+            <w:tcW w:type="dxa" w:w="5160"/>
+            <w:tcMar>
+              <w:top w:w="90" w:type="dxa"/>
+              <w:start w:w="90" w:type="dxa"/>
+              <w:bottom w:w="90" w:type="dxa"/>
+              <w:end w:w="90" w:type="dxa"/>
+            </w:tcMar>
+            <w:vAlign w:val="top"/>
+            <w:shd w:fill="F1F2ED"/>
+          </w:tcPr>
+          <w:p>
+            <w:pPr>
+              <w:spacing w:after="0"/>
+            </w:pPr>
+            <w:r>
+              <w:rPr>
+                <w:rFonts w:ascii="Segoe UI" w:hAnsi="Segoe UI"/>
+                <w:sz w:val="16"/>
+              </w:rPr>
+              <w:t>Mode telemetry, progress, speed, freshness, SKU, quantity/UOM, weight, cube, unit price, value, freight, duty, margin and orders</w:t>
+            </w:r>
+          </w:p>
+        </w:tc>
+      </w:tr>
+      <w:tr>
+        <w:tc>
+          <w:tcPr>
+            <w:tcW w:type="dxa" w:w="1900"/>
+            <w:tcMar>
+              <w:top w:w="90" w:type="dxa"/>
+              <w:start w:w="90" w:type="dxa"/>
+              <w:bottom w:w="90" w:type="dxa"/>
+              <w:end w:w="90" w:type="dxa"/>
+            </w:tcMar>
+            <w:vAlign w:val="top"/>
+          </w:tcPr>
+          <w:p>
+            <w:pPr>
+              <w:spacing w:after="0"/>
+            </w:pPr>
+            <w:r>
+              <w:rPr>
+                <w:rFonts w:ascii="Segoe UI" w:hAnsi="Segoe UI"/>
+                <w:sz w:val="16"/>
+              </w:rPr>
+              <w:t>Transfers and change</w:t>
+            </w:r>
+          </w:p>
+        </w:tc>
+        <w:tc>
+          <w:tcPr>
+            <w:tcW w:type="dxa" w:w="2300"/>
+            <w:tcMar>
+              <w:top w:w="90" w:type="dxa"/>
+              <w:start w:w="90" w:type="dxa"/>
+              <w:bottom w:w="90" w:type="dxa"/>
+              <w:end w:w="90" w:type="dxa"/>
+            </w:tcMar>
+            <w:vAlign w:val="top"/>
+          </w:tcPr>
+          <w:p>
+            <w:pPr>
+              <w:spacing w:after="0"/>
+            </w:pPr>
+            <w:r>
+              <w:rPr>
+                <w:rFonts w:ascii="Segoe UI" w:hAnsi="Segoe UI"/>
+                <w:sz w:val="16"/>
+              </w:rPr>
+              <w:t>72 transfers · 72 causal events</w:t>
+            </w:r>
+          </w:p>
+        </w:tc>
+        <w:tc>
+          <w:tcPr>
+            <w:tcW w:type="dxa" w:w="5160"/>
+            <w:tcMar>
+              <w:top w:w="90" w:type="dxa"/>
+              <w:start w:w="90" w:type="dxa"/>
+              <w:bottom w:w="90" w:type="dxa"/>
+              <w:end w:w="90" w:type="dxa"/>
+            </w:tcMar>
+            <w:vAlign w:val="top"/>
+          </w:tcPr>
+          <w:p>
+            <w:pPr>
+              <w:spacing w:after="0"/>
+            </w:pPr>
+            <w:r>
+              <w:rPr>
+                <w:rFonts w:ascii="Segoe UI" w:hAnsi="Segoe UI"/>
+                <w:sz w:val="16"/>
+              </w:rPr>
+              <w:t>Inbound/outbound custody, cutoff, dwell, value, before/current values, reason, evidence, confidence and impact</w:t>
+            </w:r>
+          </w:p>
+        </w:tc>
+      </w:tr>
+      <w:tr>
+        <w:tc>
+          <w:tcPr>
+            <w:tcW w:type="dxa" w:w="1900"/>
+            <w:tcMar>
+              <w:top w:w="90" w:type="dxa"/>
+              <w:start w:w="90" w:type="dxa"/>
+              <w:bottom w:w="90" w:type="dxa"/>
+              <w:end w:w="90" w:type="dxa"/>
+            </w:tcMar>
+            <w:vAlign w:val="top"/>
+            <w:shd w:fill="F1F2ED"/>
+          </w:tcPr>
+          <w:p>
+            <w:pPr>
+              <w:spacing w:after="0"/>
+            </w:pPr>
+            <w:r>
+              <w:rPr>
+                <w:rFonts w:ascii="Segoe UI" w:hAnsi="Segoe UI"/>
+                <w:sz w:val="16"/>
+              </w:rPr>
+              <w:t>Data plane</w:t>
+            </w:r>
+          </w:p>
+        </w:tc>
+        <w:tc>
+          <w:tcPr>
+            <w:tcW w:type="dxa" w:w="2300"/>
+            <w:tcMar>
+              <w:top w:w="90" w:type="dxa"/>
+              <w:start w:w="90" w:type="dxa"/>
+              <w:bottom w:w="90" w:type="dxa"/>
+              <w:end w:w="90" w:type="dxa"/>
+            </w:tcMar>
+            <w:vAlign w:val="top"/>
+            <w:shd w:fill="F1F2ED"/>
+          </w:tcPr>
+          <w:p>
+            <w:pPr>
+              <w:spacing w:after="0"/>
+            </w:pPr>
+            <w:r>
+              <w:rPr>
+                <w:rFonts w:ascii="Segoe UI" w:hAnsi="Segoe UI"/>
+                <w:sz w:val="16"/>
+              </w:rPr>
+              <w:t>12 synthetic agents</w:t>
+            </w:r>
+          </w:p>
+        </w:tc>
+        <w:tc>
+          <w:tcPr>
+            <w:tcW w:type="dxa" w:w="5160"/>
+            <w:tcMar>
+              <w:top w:w="90" w:type="dxa"/>
+              <w:start w:w="90" w:type="dxa"/>
+              <w:bottom w:w="90" w:type="dxa"/>
+              <w:end w:w="90" w:type="dxa"/>
+            </w:tcMar>
+            <w:vAlign w:val="top"/>
+            <w:shd w:fill="F1F2ED"/>
+          </w:tcPr>
+          <w:p>
+            <w:pPr>
+              <w:spacing w:after="0"/>
+            </w:pPr>
+            <w:r>
+              <w:rPr>
+                <w:rFonts w:ascii="Segoe UI" w:hAnsi="Segoe UI"/>
+                <w:sz w:val="16"/>
+              </w:rPr>
+              <w:t>Sources, mode, boundary, status, freshness, quality, record scale, run/change learning</w:t>
+            </w:r>
+          </w:p>
+        </w:tc>
+      </w:tr>
+      <w:tr>
+        <w:tc>
+          <w:tcPr>
+            <w:tcW w:type="dxa" w:w="1900"/>
+            <w:tcMar>
+              <w:top w:w="90" w:type="dxa"/>
+              <w:start w:w="90" w:type="dxa"/>
+              <w:bottom w:w="90" w:type="dxa"/>
+              <w:end w:w="90" w:type="dxa"/>
+            </w:tcMar>
+            <w:vAlign w:val="top"/>
+          </w:tcPr>
+          <w:p>
+            <w:pPr>
+              <w:spacing w:after="0"/>
+            </w:pPr>
+            <w:r>
+              <w:rPr>
+                <w:rFonts w:ascii="Segoe UI" w:hAnsi="Segoe UI"/>
+                <w:sz w:val="16"/>
+              </w:rPr>
+              <w:t>Application learning</w:t>
+            </w:r>
+          </w:p>
+        </w:tc>
+        <w:tc>
+          <w:tcPr>
+            <w:tcW w:type="dxa" w:w="2300"/>
+            <w:tcMar>
+              <w:top w:w="90" w:type="dxa"/>
+              <w:start w:w="90" w:type="dxa"/>
+              <w:bottom w:w="90" w:type="dxa"/>
+              <w:end w:w="90" w:type="dxa"/>
+            </w:tcMar>
+            <w:vAlign w:val="top"/>
+          </w:tcPr>
+          <w:p>
+            <w:pPr>
+              <w:spacing w:after="0"/>
+            </w:pPr>
+            <w:r>
+              <w:rPr>
+                <w:rFonts w:ascii="Segoe UI" w:hAnsi="Segoe UI"/>
+                <w:sz w:val="16"/>
+              </w:rPr>
+              <w:t>42 causal records</w:t>
+            </w:r>
+          </w:p>
+        </w:tc>
+        <w:tc>
+          <w:tcPr>
+            <w:tcW w:type="dxa" w:w="5160"/>
+            <w:tcMar>
+              <w:top w:w="90" w:type="dxa"/>
+              <w:start w:w="90" w:type="dxa"/>
+              <w:bottom w:w="90" w:type="dxa"/>
+              <w:end w:w="90" w:type="dxa"/>
+            </w:tcMar>
+            <w:vAlign w:val="top"/>
+          </w:tcPr>
+          <w:p>
+            <w:pPr>
+              <w:spacing w:after="0"/>
+            </w:pPr>
+            <w:r>
+              <w:rPr>
+                <w:rFonts w:ascii="Segoe UI" w:hAnsi="Segoe UI"/>
+                <w:sz w:val="16"/>
+              </w:rPr>
+              <w:t>Six before-current-forecast records and one learning contract for each of seven surfaces</w:t>
+            </w:r>
+          </w:p>
+        </w:tc>
+      </w:tr>
+      <w:tr>
+        <w:tc>
+          <w:tcPr>
+            <w:tcW w:type="dxa" w:w="1900"/>
+            <w:tcMar>
+              <w:top w:w="90" w:type="dxa"/>
+              <w:start w:w="90" w:type="dxa"/>
+              <w:bottom w:w="90" w:type="dxa"/>
+              <w:end w:w="90" w:type="dxa"/>
+            </w:tcMar>
+            <w:vAlign w:val="top"/>
+            <w:shd w:fill="F1F2ED"/>
+          </w:tcPr>
+          <w:p>
+            <w:pPr>
+              <w:spacing w:after="0"/>
+            </w:pPr>
+            <w:r>
+              <w:rPr>
+                <w:rFonts w:ascii="Segoe UI" w:hAnsi="Segoe UI"/>
+                <w:sz w:val="16"/>
+              </w:rPr>
+              <w:t>OR workbench</w:t>
+            </w:r>
+          </w:p>
+        </w:tc>
+        <w:tc>
+          <w:tcPr>
+            <w:tcW w:type="dxa" w:w="2300"/>
+            <w:tcMar>
+              <w:top w:w="90" w:type="dxa"/>
+              <w:start w:w="90" w:type="dxa"/>
+              <w:bottom w:w="90" w:type="dxa"/>
+              <w:end w:w="90" w:type="dxa"/>
+            </w:tcMar>
+            <w:vAlign w:val="top"/>
+            <w:shd w:fill="F1F2ED"/>
+          </w:tcPr>
+          <w:p>
+            <w:pPr>
+              <w:spacing w:after="0"/>
+            </w:pPr>
+            <w:r>
+              <w:rPr>
+                <w:rFonts w:ascii="Segoe UI" w:hAnsi="Segoe UI"/>
+                <w:sz w:val="16"/>
+              </w:rPr>
+              <w:t>30 methods · 12 patterns · 57 constraint rows</w:t>
+            </w:r>
+          </w:p>
+        </w:tc>
+        <w:tc>
+          <w:tcPr>
+            <w:tcW w:type="dxa" w:w="5160"/>
+            <w:tcMar>
+              <w:top w:w="90" w:type="dxa"/>
+              <w:start w:w="90" w:type="dxa"/>
+              <w:bottom w:w="90" w:type="dxa"/>
+              <w:end w:w="90" w:type="dxa"/>
+            </w:tcMar>
+            <w:vAlign w:val="top"/>
+            <w:shd w:fill="F1F2ED"/>
+          </w:tcPr>
+          <w:p>
+            <w:pPr>
+              <w:spacing w:after="0"/>
+            </w:pPr>
+            <w:r>
+              <w:rPr>
+                <w:rFonts w:ascii="Segoe UI" w:hAnsi="Segoe UI"/>
+                <w:sz w:val="16"/>
+              </w:rPr>
+              <w:t>Technique selection, uncertainty, Pareto alternatives, validation and reproducibility</w:t>
+            </w:r>
+          </w:p>
+        </w:tc>
+      </w:tr>
+      <w:tr>
+        <w:tc>
+          <w:tcPr>
+            <w:tcW w:type="dxa" w:w="1900"/>
+            <w:tcMar>
+              <w:top w:w="90" w:type="dxa"/>
+              <w:start w:w="90" w:type="dxa"/>
+              <w:bottom w:w="90" w:type="dxa"/>
+              <w:end w:w="90" w:type="dxa"/>
+            </w:tcMar>
+            <w:vAlign w:val="top"/>
+          </w:tcPr>
+          <w:p>
+            <w:pPr>
+              <w:spacing w:after="0"/>
+            </w:pPr>
+            <w:r>
+              <w:rPr>
+                <w:rFonts w:ascii="Segoe UI" w:hAnsi="Segoe UI"/>
+                <w:sz w:val="16"/>
+              </w:rPr>
+              <w:t>Decision operations</w:t>
+            </w:r>
+          </w:p>
+        </w:tc>
+        <w:tc>
+          <w:tcPr>
+            <w:tcW w:type="dxa" w:w="2300"/>
+            <w:tcMar>
+              <w:top w:w="90" w:type="dxa"/>
+              <w:start w:w="90" w:type="dxa"/>
+              <w:bottom w:w="90" w:type="dxa"/>
+              <w:end w:w="90" w:type="dxa"/>
+            </w:tcMar>
+            <w:vAlign w:val="top"/>
+          </w:tcPr>
+          <w:p>
+            <w:pPr>
+              <w:spacing w:after="0"/>
+            </w:pPr>
+            <w:r>
+              <w:rPr>
+                <w:rFonts w:ascii="Segoe UI" w:hAnsi="Segoe UI"/>
+                <w:sz w:val="16"/>
+              </w:rPr>
+              <w:t>9 cases · 54 response alternatives</w:t>
+            </w:r>
+          </w:p>
+        </w:tc>
+        <w:tc>
+          <w:tcPr>
+            <w:tcW w:type="dxa" w:w="5160"/>
+            <w:tcMar>
+              <w:top w:w="90" w:type="dxa"/>
+              <w:start w:w="90" w:type="dxa"/>
+              <w:bottom w:w="90" w:type="dxa"/>
+              <w:end w:w="90" w:type="dxa"/>
+            </w:tcMar>
+            <w:vAlign w:val="top"/>
+          </w:tcPr>
+          <w:p>
+            <w:pPr>
+              <w:spacing w:after="0"/>
+            </w:pPr>
+            <w:r>
+              <w:rPr>
+                <w:rFonts w:ascii="Segoe UI" w:hAnsi="Segoe UI"/>
+                <w:sz w:val="16"/>
+              </w:rPr>
+              <w:t>Five-app contribution, variables, methods, six evidence records, six tasks, authority and outcome contract</w:t>
+            </w:r>
+          </w:p>
+        </w:tc>
+      </w:tr>
+    </w:tbl>
+    <w:p/>
+    <w:p>
+      <w:pPr>
+        <w:pStyle w:val="Heading2"/>
+      </w:pPr>
+      <w:r>
+        <w:t>Final concept boundary</w:t>
+      </w:r>
+    </w:p>
+    <w:p>
+      <w:r>
+        <w:rPr>
+          <w:b/>
+        </w:rPr>
+        <w:t xml:space="preserve">Maya is a concept experience. </w:t>
+      </w:r>
+      <w:r>
+        <w:t>All organizations, people, identifiers, suppliers, facilities, cargo, prices, quantities, telemetry, evidence, models, scenarios, recommendations, approvals, and outcomes are synthetic. Nothing in the experience is a navigation instruction, live tracking record, solver certificate, legal decision, commercial commitment, or system-of-record write-back.</w:t>
+      </w:r>
     </w:p>
     <w:sectPr>
       <w:headerReference w:type="default" r:id="rId9"/>

</xml_diff>

<commit_message>
Build project-first Maya workspace experience
</commit_message>
<xml_diff>
--- a/docs/Maya_Navigation_Guide.docx
+++ b/docs/Maya_Navigation_Guide.docx
@@ -13,7 +13,7 @@
           <w:color w:val="FF6B35"/>
           <w:sz w:val="17"/>
         </w:rPr>
-        <w:t>CONCEPT EXPERIENCE USER GUIDE</w:t>
+        <w:t>WORKSPACE USER GUIDE</w:t>
       </w:r>
     </w:p>
     <w:p>
@@ -21,7 +21,7 @@
         <w:pStyle w:val="Title"/>
       </w:pPr>
       <w:r>
-        <w:t>Maya Concept Experience Navigation Guide</w:t>
+        <w:t>Maya Workspace Navigation Guide</w:t>
       </w:r>
     </w:p>
     <w:p>
@@ -29,7 +29,7 @@
         <w:pStyle w:val="Subtitle"/>
       </w:pPr>
       <w:r>
-        <w:t>Workspace  Applications  Evidence  Agents  Network Operations</w:t>
+        <w:t>Workspace  Projects  Operations World  Evidence</w:t>
       </w:r>
     </w:p>
     <w:p>
@@ -43,7 +43,7 @@
           <w:color w:val="5E6862"/>
           <w:sz w:val="18"/>
         </w:rPr>
-        <w:t>Version 3  |  4 September 2026  |  Front end concept</w:t>
+        <w:t>Version 4  |  5 September 2026  |  Front-end concept</w:t>
       </w:r>
     </w:p>
     <w:p>
@@ -55,7 +55,7 @@
           <w:rFonts w:ascii="Arial" w:hAnsi="Arial" w:eastAsia="Arial"/>
           <w:sz w:val="24"/>
         </w:rPr>
-        <w:t>This guide shows how to move from a global signal to a client project, assemble specialist applications, inspect evidence, steer an expert agent trace, compare an operations research response, and stop at a human decision gate. It also marks the boundary between interactive concept behavior and future production services.</w:t>
+        <w:t>This guide explains the complete Maya Workspace journey: onboard a client, create a collaborative project, bring in governed data and IoT signals, mount specialist apps, inspect evidence, work with expert agents, compare an operations-research response, and stop at a human decision gate.</w:t>
       </w:r>
     </w:p>
     <w:p>
@@ -112,7 +112,7 @@
         <w:t xml:space="preserve">3.  </w:t>
       </w:r>
       <w:r>
-        <w:t>For trust and governance, read Evidence receipts, Agent society, and Concept boundaries before demonstrating an approval or optimization flow.</w:t>
+        <w:t>For trust and governance, read Evidence receipts, Agents, and Concept boundaries before demonstrating an approval or optimization flow.</w:t>
       </w:r>
     </w:p>
     <w:p>
@@ -174,7 +174,7 @@
           <w:color w:val="111815"/>
           <w:sz w:val="16"/>
         </w:rPr>
-        <w:t>Global intelligence</w:t>
+        <w:t>Workspace</w:t>
       </w:r>
     </w:p>
     <w:p>
@@ -188,7 +188,7 @@
           <w:color w:val="111815"/>
           <w:sz w:val="16"/>
         </w:rPr>
-        <w:t xml:space="preserve">  Sector tower</w:t>
+        <w:t xml:space="preserve">  Operations World (Global or Regional)</w:t>
       </w:r>
     </w:p>
     <w:p>
@@ -202,7 +202,7 @@
           <w:color w:val="111815"/>
           <w:sz w:val="16"/>
         </w:rPr>
-        <w:t xml:space="preserve">    Client tenant</w:t>
+        <w:t xml:space="preserve">  Sector</w:t>
       </w:r>
     </w:p>
     <w:p>
@@ -216,7 +216,7 @@
           <w:color w:val="111815"/>
           <w:sz w:val="16"/>
         </w:rPr>
-        <w:t xml:space="preserve">      Project workspace</w:t>
+        <w:t xml:space="preserve">    Client</w:t>
       </w:r>
     </w:p>
     <w:p>
@@ -230,7 +230,7 @@
           <w:color w:val="111815"/>
           <w:sz w:val="16"/>
         </w:rPr>
-        <w:t xml:space="preserve">        Project data and knowledge graph</w:t>
+        <w:t xml:space="preserve">      Project</w:t>
       </w:r>
     </w:p>
     <w:p>
@@ -244,7 +244,7 @@
           <w:color w:val="111815"/>
           <w:sz w:val="16"/>
         </w:rPr>
-        <w:t xml:space="preserve">        Mounted specialist applications</w:t>
+        <w:t xml:space="preserve">        Overview and collaborators</w:t>
       </w:r>
     </w:p>
     <w:p>
@@ -258,7 +258,7 @@
           <w:color w:val="111815"/>
           <w:sz w:val="16"/>
         </w:rPr>
-        <w:t xml:space="preserve">        Decision tree and case workspace</w:t>
+        <w:t xml:space="preserve">        Decisions and review</w:t>
       </w:r>
     </w:p>
     <w:p>
@@ -272,7 +272,7 @@
           <w:color w:val="111815"/>
           <w:sz w:val="16"/>
         </w:rPr>
-        <w:t xml:space="preserve">        Expert agent society and human team</w:t>
+        <w:t xml:space="preserve">        Apps, data and IoT requests</w:t>
       </w:r>
     </w:p>
     <w:p>
@@ -286,7 +286,7 @@
           <w:color w:val="111815"/>
           <w:sz w:val="16"/>
         </w:rPr>
-        <w:t xml:space="preserve">        Evidence receipts and governance</w:t>
+        <w:t xml:space="preserve">        Knowledge graph and agents</w:t>
       </w:r>
     </w:p>
     <w:p>
@@ -300,7 +300,7 @@
           <w:color w:val="111815"/>
           <w:sz w:val="16"/>
         </w:rPr>
-        <w:t xml:space="preserve">          Session-only outcome or blocked gate</w:t>
+        <w:t xml:space="preserve">        Evidence and controls</w:t>
       </w:r>
     </w:p>
     <w:p>
@@ -498,7 +498,7 @@
                 <w:color w:val="111815"/>
                 <w:sz w:val="16"/>
               </w:rPr>
-              <w:t>Expert workspace</w:t>
+              <w:t>Workspace</w:t>
             </w:r>
           </w:p>
         </w:tc>
@@ -523,7 +523,7 @@
                 <w:color w:val="111815"/>
                 <w:sz w:val="16"/>
               </w:rPr>
-              <w:t>The left tree is Sector, Client, Project rather than a generic company dashboard.</w:t>
+              <w:t>The left tree is Sector, Client, Project; the application opens here by default.</w:t>
             </w:r>
           </w:p>
         </w:tc>
@@ -548,7 +548,7 @@
                 <w:color w:val="111815"/>
                 <w:sz w:val="16"/>
               </w:rPr>
-              <w:t>Anode Shield project home</w:t>
+              <w:t>Client and project workspace</w:t>
             </w:r>
           </w:p>
         </w:tc>
@@ -714,7 +714,7 @@
                 <w:color w:val="111815"/>
                 <w:sz w:val="16"/>
               </w:rPr>
-              <w:t>Mounted apps</w:t>
+              <w:t>Apps</w:t>
             </w:r>
           </w:p>
         </w:tc>
@@ -764,7 +764,7 @@
                 <w:color w:val="111815"/>
                 <w:sz w:val="16"/>
               </w:rPr>
-              <w:t>App mount graph</w:t>
+              <w:t>Project app graph</w:t>
             </w:r>
           </w:p>
         </w:tc>
@@ -930,7 +930,7 @@
                 <w:color w:val="111815"/>
                 <w:sz w:val="16"/>
               </w:rPr>
-              <w:t>Agent society</w:t>
+              <w:t>Agents</w:t>
             </w:r>
           </w:p>
         </w:tc>
@@ -1038,7 +1038,7 @@
                 <w:color w:val="111815"/>
                 <w:sz w:val="16"/>
               </w:rPr>
-              <w:t>Project data</w:t>
+              <w:t>Data</w:t>
             </w:r>
           </w:p>
         </w:tc>
@@ -1064,7 +1064,7 @@
                 <w:color w:val="111815"/>
                 <w:sz w:val="16"/>
               </w:rPr>
-              <w:t>Upload is project-scoped and demonstrates staged metadata, mapping, review, and receipt states.</w:t>
+              <w:t>Uploads and IoT source requests stay inside the project boundary.</w:t>
             </w:r>
           </w:p>
         </w:tc>
@@ -1090,7 +1090,7 @@
                 <w:color w:val="111815"/>
                 <w:sz w:val="16"/>
               </w:rPr>
-              <w:t>Session dataset receipt</w:t>
+              <w:t>Dataset or connector receipt</w:t>
             </w:r>
           </w:p>
         </w:tc>
@@ -1254,7 +1254,7 @@
                 <w:color w:val="111815"/>
                 <w:sz w:val="16"/>
               </w:rPr>
-              <w:t>Global platform then Network map</w:t>
+              <w:t>Operations World</w:t>
             </w:r>
           </w:p>
         </w:tc>
@@ -1280,7 +1280,7 @@
                 <w:color w:val="111815"/>
                 <w:sz w:val="16"/>
               </w:rPr>
-              <w:t>The radar supports pan, zoom, region presets, time frames, layers, hover details, pinned entities, and app handoff.</w:t>
+              <w:t>Toggle Global or Regional, choose a region, inspect the map, and start a dependency, route, or value intake from retained context.</w:t>
             </w:r>
           </w:p>
         </w:tc>
@@ -1306,7 +1306,7 @@
                 <w:color w:val="111815"/>
                 <w:sz w:val="16"/>
               </w:rPr>
-              <w:t>Retained network context</w:t>
+              <w:t>Project intake draft</w:t>
             </w:r>
           </w:p>
         </w:tc>
@@ -1350,7 +1350,7 @@
         <w:spacing w:after="200"/>
       </w:pPr>
       <w:r>
-        <w:t>The Expert workspace replaces the former Company platform. A specialist selects a sector, a client, and a project. Every project owns its data, apps, agents, decisions, experts, evidence, and governance context.</w:t>
+        <w:t>Workspace is the application root. A specialist selects a sector, client, and project. Every project owns its data, apps, agents, decisions, collaborators, evidence, and controls.</w:t>
       </w:r>
     </w:p>
     <w:tbl>
@@ -1837,7 +1837,7 @@
                 <w:color w:val="111815"/>
                 <w:sz w:val="16"/>
               </w:rPr>
-              <w:t>Decision case</w:t>
+              <w:t>Decision</w:t>
             </w:r>
           </w:p>
         </w:tc>
@@ -1889,7 +1889,7 @@
                 <w:color w:val="111815"/>
                 <w:sz w:val="16"/>
               </w:rPr>
-              <w:t>The case retains variables, methods, scenarios, owners, approvals, evidence, and outcome measures.</w:t>
+              <w:t>The decision retains variables, methods, scenarios, owners, approvals, evidence, and outcome measures.</w:t>
             </w:r>
           </w:p>
         </w:tc>
@@ -2078,7 +2078,80 @@
         <w:pStyle w:val="ListBullet"/>
       </w:pPr>
       <w:r>
-        <w:t>Each project preserves its own browser-session app mounts, uploads, agent chat, trace state, steering instructions, draft agents, and team assignments while the page remains open.</w:t>
+        <w:t>Each project preserves its own browser-session app mounts, uploads, connector requests, agent chat, trace state, steering instructions, draft agents, and team assignments while the page remains open.</w:t>
+      </w:r>
+    </w:p>
+    <w:p>
+      <w:pPr>
+        <w:pStyle w:val="Heading2"/>
+        <w:keepNext/>
+      </w:pPr>
+      <w:r>
+        <w:t>Onboard a client and project</w:t>
+      </w:r>
+    </w:p>
+    <w:p>
+      <w:pPr>
+        <w:spacing w:after="80"/>
+        <w:ind w:left="346" w:hanging="346"/>
+      </w:pPr>
+      <w:r>
+        <w:rPr>
+          <w:rFonts w:ascii="Arial" w:hAnsi="Arial" w:eastAsia="Arial"/>
+          <w:b/>
+        </w:rPr>
+        <w:t xml:space="preserve">1.  </w:t>
+      </w:r>
+      <w:r>
+        <w:t>Choose New client to register a session-only client under a sector, with a named client lead and engagement context.</w:t>
+      </w:r>
+    </w:p>
+    <w:p>
+      <w:pPr>
+        <w:spacing w:after="80"/>
+        <w:ind w:left="346" w:hanging="346"/>
+      </w:pPr>
+      <w:r>
+        <w:rPr>
+          <w:rFonts w:ascii="Arial" w:hAnsi="Arial" w:eastAsia="Arial"/>
+          <w:b/>
+        </w:rPr>
+        <w:t xml:space="preserve">2.  </w:t>
+      </w:r>
+      <w:r>
+        <w:t>Choose New project to select the client, define the problem and outcome, and assign one client collaborator plus one Kearney specialist.</w:t>
+      </w:r>
+    </w:p>
+    <w:p>
+      <w:pPr>
+        <w:spacing w:after="80"/>
+        <w:ind w:left="346" w:hanging="346"/>
+      </w:pPr>
+      <w:r>
+        <w:rPr>
+          <w:rFonts w:ascii="Arial" w:hAnsi="Arial" w:eastAsia="Arial"/>
+          <w:b/>
+        </w:rPr>
+        <w:t xml:space="preserve">3.  </w:t>
+      </w:r>
+      <w:r>
+        <w:t>A new project starts empty: zero datasets, apps, agents, decisions, graph nodes, and runs until the team adds them explicitly.</w:t>
+      </w:r>
+    </w:p>
+    <w:p>
+      <w:pPr>
+        <w:spacing w:after="80"/>
+        <w:ind w:left="346" w:hanging="346"/>
+      </w:pPr>
+      <w:r>
+        <w:rPr>
+          <w:rFonts w:ascii="Arial" w:hAnsi="Arial" w:eastAsia="Arial"/>
+          <w:b/>
+        </w:rPr>
+        <w:t xml:space="preserve">4.  </w:t>
+      </w:r>
+      <w:r>
+        <w:t>Creation ends at a project overview and a browser-session receipt; no tenant, identity, cloud resource, or production record is provisioned.</w:t>
       </w:r>
     </w:p>
     <w:p>
@@ -3403,7 +3476,7 @@
         <w:spacing w:after="200"/>
       </w:pPr>
       <w:r>
-        <w:t>The tabs separate the jobs that specialists perform while keeping one project memory underneath them.</w:t>
+        <w:t>The tabs separate specialist tasks while keeping one project context underneath them. Tabs wrap to the available width; there is no horizontal tab scroller.</w:t>
       </w:r>
     </w:p>
     <w:tbl>
@@ -3567,7 +3640,7 @@
                 <w:color w:val="111815"/>
                 <w:sz w:val="15"/>
               </w:rPr>
-              <w:t>Project home</w:t>
+              <w:t>Overview</w:t>
             </w:r>
           </w:p>
         </w:tc>
@@ -3592,7 +3665,7 @@
                 <w:color w:val="111815"/>
                 <w:sz w:val="15"/>
               </w:rPr>
-              <w:t>Read outcome, project KPIs, mounted app summary, decision preview, and knowledge footprint.</w:t>
+              <w:t>Read outcome, project KPIs, app summary, decision preview, collaborators, and knowledge footprint.</w:t>
             </w:r>
           </w:p>
         </w:tc>
@@ -3617,7 +3690,7 @@
                 <w:color w:val="111815"/>
                 <w:sz w:val="15"/>
               </w:rPr>
-              <w:t>Open KPI evidence, governed case, app, agent society, or project data.</w:t>
+              <w:t>Open KPI evidence, decision, app, agent, or project data.</w:t>
             </w:r>
           </w:p>
         </w:tc>
@@ -3783,7 +3856,7 @@
                 <w:color w:val="111815"/>
                 <w:sz w:val="15"/>
               </w:rPr>
-              <w:t>Mounted apps</w:t>
+              <w:t>Apps</w:t>
             </w:r>
           </w:p>
         </w:tc>
@@ -3833,7 +3906,7 @@
                 <w:color w:val="111815"/>
                 <w:sz w:val="15"/>
               </w:rPr>
-              <w:t>Mount or unmount eligible apps, inspect mount manifest, open an app studio.</w:t>
+              <w:t>Mount or unmount eligible apps, inspect the manifest, open an app studio.</w:t>
             </w:r>
           </w:p>
         </w:tc>
@@ -3890,7 +3963,7 @@
                 <w:color w:val="111815"/>
                 <w:sz w:val="15"/>
               </w:rPr>
-              <w:t>Project data</w:t>
+              <w:t>Data</w:t>
             </w:r>
           </w:p>
         </w:tc>
@@ -3916,7 +3989,7 @@
                 <w:color w:val="111815"/>
                 <w:sz w:val="15"/>
               </w:rPr>
-              <w:t>Stage project-owned data and inspect dataset contracts.</w:t>
+              <w:t>Stage project-owned data and request governed IoT or enterprise sources.</w:t>
             </w:r>
           </w:p>
         </w:tc>
@@ -3942,7 +4015,7 @@
                 <w:color w:val="111815"/>
                 <w:sz w:val="15"/>
               </w:rPr>
-              <w:t>Choose local file metadata or sample, advance stages, open dataset evidence and adapter previews.</w:t>
+              <w:t>Advance file stages, inspect contracts, request a source, test a fixed sample, submit for policy review.</w:t>
             </w:r>
           </w:p>
         </w:tc>
@@ -3968,7 +4041,7 @@
                 <w:color w:val="111815"/>
                 <w:sz w:val="15"/>
               </w:rPr>
-              <w:t>Session dataset receipt</w:t>
+              <w:t>Dataset or connector receipt</w:t>
             </w:r>
           </w:p>
         </w:tc>
@@ -3999,7 +4072,7 @@
                 <w:color w:val="111815"/>
                 <w:sz w:val="15"/>
               </w:rPr>
-              <w:t>Knowledge graph</w:t>
+              <w:t>Graph</w:t>
             </w:r>
           </w:p>
         </w:tc>
@@ -4106,7 +4179,7 @@
                 <w:color w:val="111815"/>
                 <w:sz w:val="15"/>
               </w:rPr>
-              <w:t>Agent society</w:t>
+              <w:t>Agents</w:t>
             </w:r>
           </w:p>
         </w:tc>
@@ -4158,7 +4231,7 @@
                 <w:color w:val="111815"/>
                 <w:sz w:val="15"/>
               </w:rPr>
-              <w:t>Select agent, enter prompt, advance or cancel trace, steer, inspect experience, create draft agent.</w:t>
+              <w:t>Create or select an agent, enter a prompt, advance or cancel trace, steer, and inspect experience.</w:t>
             </w:r>
           </w:p>
         </w:tc>
@@ -4215,7 +4288,7 @@
                 <w:color w:val="111815"/>
                 <w:sz w:val="15"/>
               </w:rPr>
-              <w:t>Expert team</w:t>
+              <w:t>Team</w:t>
             </w:r>
           </w:p>
         </w:tc>
@@ -4240,7 +4313,7 @@
                 <w:color w:val="111815"/>
                 <w:sz w:val="15"/>
               </w:rPr>
-              <w:t>Put human specialists in the loop.</w:t>
+              <w:t>Put client and Kearney collaborators in the loop.</w:t>
             </w:r>
           </w:p>
         </w:tc>
@@ -4265,7 +4338,7 @@
                 <w:color w:val="111815"/>
                 <w:sz w:val="15"/>
               </w:rPr>
-              <w:t>Inspect experience, specialties, active work, decision rights, and assign or remove experts.</w:t>
+              <w:t>Inspect affiliation, role, capability grants, experience, decision rights, and assignments.</w:t>
             </w:r>
           </w:p>
         </w:tc>
@@ -4290,7 +4363,7 @@
                 <w:color w:val="111815"/>
                 <w:sz w:val="15"/>
               </w:rPr>
-              <w:t>Session assignment receipt</w:t>
+              <w:t>Membership or assignment receipt</w:t>
             </w:r>
           </w:p>
         </w:tc>
@@ -4322,7 +4395,7 @@
                 <w:color w:val="111815"/>
                 <w:sz w:val="15"/>
               </w:rPr>
-              <w:t>Governance</w:t>
+              <w:t>Controls</w:t>
             </w:r>
           </w:p>
         </w:tc>
@@ -4348,7 +4421,7 @@
                 <w:color w:val="111815"/>
                 <w:sz w:val="15"/>
               </w:rPr>
-              <w:t>Review current concept controls and production gaps.</w:t>
+              <w:t>Review concept controls and production gaps.</w:t>
             </w:r>
           </w:p>
         </w:tc>
@@ -4374,7 +4447,7 @@
                 <w:color w:val="111815"/>
                 <w:sz w:val="15"/>
               </w:rPr>
-              <w:t>Inspect evidence, control status, and boundary statements.</w:t>
+              <w:t>Inspect evidence, access, control status, and boundary statements.</w:t>
             </w:r>
           </w:p>
         </w:tc>
@@ -4400,7 +4473,7 @@
                 <w:color w:val="111815"/>
                 <w:sz w:val="15"/>
               </w:rPr>
-              <w:t>Governance receipt</w:t>
+              <w:t>Control receipt</w:t>
             </w:r>
           </w:p>
         </w:tc>
@@ -4422,7 +4495,7 @@
     </w:p>
     <w:p>
       <w:r>
-        <w:t>The concept preserves per-project state in browser memory only. A production implementation needs authenticated tenant context, project authorization, encrypted object storage, a project registry, lineage storage, versioned event history, retention policies, and audit controls. Do not interpret session restoration as backend persistence.</w:t>
+        <w:t>The concept preserves per-project state in browser memory only. The signed-in Maya Rao fixture is one Kearney portfolio collaborator with an explicit membership in each seeded project. Project entry and governed session mutations evaluate that identity's declared capability grants; the interface never borrows a client owner's rights. A production implementation still needs authenticated tenant context, server-side project authorization, encrypted object storage, a project registry, lineage storage, versioned event history, retention policies, and audit controls. Do not interpret session restoration as backend persistence.</w:t>
       </w:r>
     </w:p>
     <w:p>
@@ -4647,7 +4720,7 @@
                 <w:color w:val="111815"/>
                 <w:sz w:val="16"/>
               </w:rPr>
-              <w:t>Open the selected platform, project, tab, app, case, graph, or agent surface and update the URL.</w:t>
+              <w:t>Open Workspace, Operations World, a project, tab, app, decision, graph, or agent surface and update the URL.</w:t>
             </w:r>
           </w:p>
         </w:tc>
@@ -5295,7 +5368,7 @@
                 <w:color w:val="111815"/>
                 <w:sz w:val="16"/>
               </w:rPr>
-              <w:t>Apply the case lifecycle gate and named human authority.</w:t>
+              <w:t>Apply the decision lifecycle gate and named human authority.</w:t>
             </w:r>
           </w:p>
         </w:tc>
@@ -5405,7 +5478,7 @@
           <w:color w:val="FF6B35"/>
           <w:sz w:val="17"/>
         </w:rPr>
-        <w:t>DECISION OPERATIONS</w:t>
+        <w:t>PROJECT DECISIONS</w:t>
       </w:r>
     </w:p>
     <w:p>
@@ -5422,7 +5495,7 @@
         <w:spacing w:after="200"/>
       </w:pPr>
       <w:r>
-        <w:t>Decision operations sit inside the project workspace. They connect app evidence to a case, human authority, execution package, and measurable outcome.</w:t>
+        <w:t>Decisions and review live inside a project. They connect app evidence to a governed choice, human authority, execution package, and measurable outcome.</w:t>
       </w:r>
     </w:p>
     <w:tbl>
@@ -5661,7 +5734,7 @@
                 <w:color w:val="111815"/>
                 <w:sz w:val="16"/>
               </w:rPr>
-              <w:t>Named case exists</w:t>
+              <w:t>Named decision exists</w:t>
             </w:r>
           </w:p>
         </w:tc>
@@ -7613,7 +7686,7 @@
           <w:color w:val="FF6B35"/>
           <w:sz w:val="17"/>
         </w:rPr>
-        <w:t>APP OPERATING MODEL</w:t>
+        <w:t>USING A SPECIALIST APP</w:t>
       </w:r>
     </w:p>
     <w:p>
@@ -7630,7 +7703,7 @@
         <w:spacing w:after="200"/>
       </w:pPr>
       <w:r>
-        <w:t>The first screen answers the specialist question. The operating model beneath it explains how that app should function as a governed product.</w:t>
+        <w:t>Each app opens on the specialist's task, with concise controls and inspectable methods, data, measures, and handoffs rather than a presentation layer.</w:t>
       </w:r>
     </w:p>
     <w:tbl>
@@ -7766,7 +7839,7 @@
                 <w:color w:val="111815"/>
                 <w:sz w:val="16"/>
               </w:rPr>
-              <w:t>Operating model</w:t>
+              <w:t>Task surface</w:t>
             </w:r>
           </w:p>
         </w:tc>
@@ -7791,7 +7864,7 @@
                 <w:color w:val="111815"/>
                 <w:sz w:val="16"/>
               </w:rPr>
-              <w:t>Decision question, primary users, cadence, horizon, decision rights, workflow gates, accountable roles, and exit criteria</w:t>
+              <w:t>Decision scope, horizon, workflow state, accountable roles, and current constraint</w:t>
             </w:r>
           </w:p>
         </w:tc>
@@ -7816,7 +7889,7 @@
                 <w:color w:val="111815"/>
                 <w:sz w:val="16"/>
               </w:rPr>
-              <w:t>Use the app-specific controls and case links</w:t>
+              <w:t>Use the app-specific controls and decision links</w:t>
             </w:r>
           </w:p>
         </w:tc>
@@ -8176,7 +8249,7 @@
         <w:pStyle w:val="ListBullet"/>
       </w:pPr>
       <w:r>
-        <w:t>Open an app from Mounted apps to keep the project context and selected case.</w:t>
+        <w:t>Open an app from Apps to keep the project context and selected decision.</w:t>
       </w:r>
     </w:p>
     <w:p>
@@ -8211,7 +8284,7 @@
           <w:color w:val="FF6B35"/>
           <w:sz w:val="17"/>
         </w:rPr>
-        <w:t>AGENT SOCIETY</w:t>
+        <w:t>PROJECT AGENTS</w:t>
       </w:r>
     </w:p>
     <w:p>
@@ -8228,7 +8301,7 @@
         <w:spacing w:after="200"/>
       </w:pPr>
       <w:r>
-        <w:t>The Agent society uses a minimal code-style workspace. It exposes what the agent is doing, which project entities it touches, which evidence it cites, and where a human must decide.</w:t>
+        <w:t>Agents use a minimal code-style workspace. It exposes what the agent is doing, which project entities it touches, which evidence it cites, and where a human must decide.</w:t>
       </w:r>
     </w:p>
     <w:tbl>
@@ -8442,7 +8515,7 @@
                 <w:color w:val="111815"/>
                 <w:sz w:val="15"/>
               </w:rPr>
-              <w:t>Select a domain profile such as OR scientist, procurement strategist, mineral scout, or evidence auditor</w:t>
+              <w:t>Create the first agent in a new project or select an existing project specialist</w:t>
             </w:r>
           </w:p>
         </w:tc>
@@ -10113,7 +10186,7 @@
         <w:pStyle w:val="ListBullet"/>
       </w:pPr>
       <w:r>
-        <w:t>Project home KPIs and app studio metrics open the full evidence drawer.</w:t>
+        <w:t>Overview KPIs and app studio metrics open the full evidence drawer.</w:t>
       </w:r>
     </w:p>
     <w:p>
@@ -10121,7 +10194,7 @@
         <w:pStyle w:val="ListBullet"/>
       </w:pPr>
       <w:r>
-        <w:t>Decision case evidence, scenarios, outcomes, and app operating-model facts create a browser-session action receipt.</w:t>
+        <w:t>Decision evidence, scenarios, outcomes, and app method or control facts create a browser-session action receipt.</w:t>
       </w:r>
     </w:p>
     <w:p>
@@ -10137,7 +10210,7 @@
         <w:pStyle w:val="ListBullet"/>
       </w:pPr>
       <w:r>
-        <w:t>Network selections retain the selected entity and frame when opening a compatible app.</w:t>
+        <w:t>Operations World dependency, route, and value intakes retain the selected entity, frame, scenario, and evidence key when starting a project.</w:t>
       </w:r>
     </w:p>
     <w:p>
@@ -10979,12 +11052,12 @@
         <w:keepNext/>
       </w:pPr>
       <w:r>
-        <w:t>Future edge data flow</w:t>
+        <w:t>Request an IoT or enterprise source</w:t>
       </w:r>
     </w:p>
     <w:p>
       <w:r>
-        <w:t>The product direction supports simple operational updates from ports, cargo handlers, warehouses, factories, suppliers, vehicles, robots, and field teams. QR scans, signed custody events, sensor telemetry, robot events, carrier milestones, and manual exceptions should enter through authenticated project or client contracts. Production ingestion must validate identity, device trust, timestamp, location, signature, unit, schema, consent, and access before updating the operational graph.</w:t>
+        <w:t>The Data tab includes explicit request templates for operational updates from ports, cargo handlers, warehouses, factories, suppliers, vehicles, robots, and field teams. QR scans, signed custody events, sensor telemetry, robot events, carrier milestones, CDC, and manual exceptions remain request drafts. Policy-review status and fixed-sample replay status are tracked independently, so completing one does not erase the other. Production ingestion must validate identity, device trust, timestamp, location, signature, unit, schema, consent, and access before updating the operational graph.</w:t>
       </w:r>
     </w:p>
     <w:tbl>
@@ -11223,7 +11296,7 @@
                 <w:color w:val="111815"/>
                 <w:sz w:val="15"/>
               </w:rPr>
-              <w:t>LogisticsRadar and case evidence</w:t>
+              <w:t>LogisticsRadar and decision evidence</w:t>
             </w:r>
           </w:p>
         </w:tc>
@@ -11691,7 +11764,7 @@
         <w:keepNext/>
       </w:pPr>
       <w:r>
-        <w:t>Use the world network radar</w:t>
+        <w:t>Use Operations World</w:t>
       </w:r>
     </w:p>
     <w:p>
@@ -11699,7 +11772,7 @@
         <w:spacing w:after="200"/>
       </w:pPr>
       <w:r>
-        <w:t>The world map is a synthetic operational radar. It combines geography, routes, assets, cargo, transfers, time, scenarios, and app handoffs in one scrollable and zoomable surface.</w:t>
+        <w:t>Operations World is a synthetic operational radar with Global and Regional modes. Its pannable, zoomable map combines geography, routes, assets, cargo, transfers, time, scenarios, and project intake. In Regional mode, the region selector changes the map, KPIs, signals, cash, suppliers, movements, and evidence scope together.</w:t>
       </w:r>
     </w:p>
     <w:tbl>
@@ -11835,7 +11908,7 @@
                 <w:color w:val="111815"/>
                 <w:sz w:val="16"/>
               </w:rPr>
-              <w:t>Region presets</w:t>
+              <w:t>Global or Regional</w:t>
             </w:r>
           </w:p>
         </w:tc>
@@ -11860,7 +11933,7 @@
                 <w:color w:val="111815"/>
                 <w:sz w:val="16"/>
               </w:rPr>
-              <w:t>Centers the world, Americas, Europe and Africa, Middle East and India, or APAC</w:t>
+              <w:t>Switches between the full network and a selected regional operating picture</w:t>
             </w:r>
           </w:p>
         </w:tc>
@@ -11885,7 +11958,7 @@
                 <w:color w:val="111815"/>
                 <w:sz w:val="16"/>
               </w:rPr>
-              <w:t>Ports, plants, airports, roads, rail nodes, and relevant corridors</w:t>
+              <w:t>Global totals or the selected APAC, Europe, Americas, or Middle East and Africa slice</w:t>
             </w:r>
           </w:p>
         </w:tc>
@@ -12380,7 +12453,7 @@
                 <w:color w:val="111815"/>
                 <w:sz w:val="16"/>
               </w:rPr>
-              <w:t>Evidence, current state, related facts, and compatible app handoff</w:t>
+              <w:t>Evidence, current state, related facts, and project intake context</w:t>
             </w:r>
           </w:p>
         </w:tc>
@@ -12412,7 +12485,7 @@
                 <w:color w:val="111815"/>
                 <w:sz w:val="16"/>
               </w:rPr>
-              <w:t>Open in app</w:t>
+              <w:t>Dependency intake</w:t>
             </w:r>
           </w:p>
         </w:tc>
@@ -12438,7 +12511,7 @@
                 <w:color w:val="111815"/>
                 <w:sz w:val="16"/>
               </w:rPr>
-              <w:t>Moves the retained selection into RiskRadar, Network Optimizer, FlowLens, or SupplierGraph</w:t>
+              <w:t>Carries the selected dependency, entity ID, frame, scenario, and evidence key into New project</w:t>
             </w:r>
           </w:p>
         </w:tc>
@@ -12464,7 +12537,172 @@
                 <w:color w:val="111815"/>
                 <w:sz w:val="16"/>
               </w:rPr>
-              <w:t>The project and map context remain visible in the app command bar</w:t>
+              <w:t>Creates an empty governed project shell; no case or dataset is fabricated</w:t>
+            </w:r>
+          </w:p>
+        </w:tc>
+      </w:tr>
+      <w:tr>
+        <w:trPr>
+          <w:cantSplit/>
+        </w:trPr>
+        <w:tc>
+          <w:tcPr>
+            <w:tcW w:type="dxa" w:w="1944"/>
+            <w:vAlign w:val="center"/>
+            <w:tcMar>
+              <w:top w:w="90" w:type="dxa"/>
+              <w:start w:w="100" w:type="dxa"/>
+              <w:bottom w:w="90" w:type="dxa"/>
+              <w:end w:w="100" w:type="dxa"/>
+            </w:tcMar>
+          </w:tcPr>
+          <w:p>
+            <w:pPr>
+              <w:keepNext w:val="0"/>
+              <w:spacing w:after="0" w:line="259" w:lineRule="auto"/>
+            </w:pPr>
+            <w:r>
+              <w:rPr>
+                <w:rFonts w:ascii="Arial" w:hAnsi="Arial" w:eastAsia="Arial"/>
+                <w:color w:val="111815"/>
+                <w:sz w:val="16"/>
+              </w:rPr>
+              <w:t>Route intake</w:t>
+            </w:r>
+          </w:p>
+        </w:tc>
+        <w:tc>
+          <w:tcPr>
+            <w:tcW w:type="dxa" w:w="3528"/>
+            <w:vAlign w:val="center"/>
+            <w:tcMar>
+              <w:top w:w="90" w:type="dxa"/>
+              <w:start w:w="100" w:type="dxa"/>
+              <w:bottom w:w="90" w:type="dxa"/>
+              <w:end w:w="100" w:type="dxa"/>
+            </w:tcMar>
+          </w:tcPr>
+          <w:p>
+            <w:pPr>
+              <w:spacing w:after="0" w:line="259" w:lineRule="auto"/>
+            </w:pPr>
+            <w:r>
+              <w:rPr>
+                <w:rFonts w:ascii="Arial" w:hAnsi="Arial" w:eastAsia="Arial"/>
+                <w:color w:val="111815"/>
+                <w:sz w:val="16"/>
+              </w:rPr>
+              <w:t>Carries the selected corridor or movement and route-planning context into New project</w:t>
+            </w:r>
+          </w:p>
+        </w:tc>
+        <w:tc>
+          <w:tcPr>
+            <w:tcW w:type="dxa" w:w="4392"/>
+            <w:vAlign w:val="center"/>
+            <w:tcMar>
+              <w:top w:w="90" w:type="dxa"/>
+              <w:start w:w="100" w:type="dxa"/>
+              <w:bottom w:w="90" w:type="dxa"/>
+              <w:end w:w="100" w:type="dxa"/>
+            </w:tcMar>
+          </w:tcPr>
+          <w:p>
+            <w:pPr>
+              <w:spacing w:after="0" w:line="259" w:lineRule="auto"/>
+            </w:pPr>
+            <w:r>
+              <w:rPr>
+                <w:rFonts w:ascii="Arial" w:hAnsi="Arial" w:eastAsia="Arial"/>
+                <w:color w:val="111815"/>
+                <w:sz w:val="16"/>
+              </w:rPr>
+              <w:t>Creates a traceable route-intake record</w:t>
+            </w:r>
+          </w:p>
+        </w:tc>
+      </w:tr>
+      <w:tr>
+        <w:trPr>
+          <w:cantSplit/>
+        </w:trPr>
+        <w:tc>
+          <w:tcPr>
+            <w:tcW w:type="dxa" w:w="1944"/>
+            <w:vAlign w:val="center"/>
+            <w:tcMar>
+              <w:top w:w="90" w:type="dxa"/>
+              <w:start w:w="100" w:type="dxa"/>
+              <w:bottom w:w="90" w:type="dxa"/>
+              <w:end w:w="100" w:type="dxa"/>
+            </w:tcMar>
+            <w:shd w:fill="F4F5F1"/>
+          </w:tcPr>
+          <w:p>
+            <w:pPr>
+              <w:keepNext w:val="0"/>
+              <w:spacing w:after="0" w:line="259" w:lineRule="auto"/>
+            </w:pPr>
+            <w:r>
+              <w:rPr>
+                <w:rFonts w:ascii="Arial" w:hAnsi="Arial" w:eastAsia="Arial"/>
+                <w:color w:val="111815"/>
+                <w:sz w:val="16"/>
+              </w:rPr>
+              <w:t>Value intake</w:t>
+            </w:r>
+          </w:p>
+        </w:tc>
+        <w:tc>
+          <w:tcPr>
+            <w:tcW w:type="dxa" w:w="3528"/>
+            <w:vAlign w:val="center"/>
+            <w:tcMar>
+              <w:top w:w="90" w:type="dxa"/>
+              <w:start w:w="100" w:type="dxa"/>
+              <w:bottom w:w="90" w:type="dxa"/>
+              <w:end w:w="100" w:type="dxa"/>
+            </w:tcMar>
+            <w:shd w:fill="F4F5F1"/>
+          </w:tcPr>
+          <w:p>
+            <w:pPr>
+              <w:spacing w:after="0" w:line="259" w:lineRule="auto"/>
+            </w:pPr>
+            <w:r>
+              <w:rPr>
+                <w:rFonts w:ascii="Arial" w:hAnsi="Arial" w:eastAsia="Arial"/>
+                <w:color w:val="111815"/>
+                <w:sz w:val="16"/>
+              </w:rPr>
+              <w:t>Carries the selected entity and value-protection context into New project</w:t>
+            </w:r>
+          </w:p>
+        </w:tc>
+        <w:tc>
+          <w:tcPr>
+            <w:tcW w:type="dxa" w:w="4392"/>
+            <w:vAlign w:val="center"/>
+            <w:tcMar>
+              <w:top w:w="90" w:type="dxa"/>
+              <w:start w:w="100" w:type="dxa"/>
+              <w:bottom w:w="90" w:type="dxa"/>
+              <w:end w:w="100" w:type="dxa"/>
+            </w:tcMar>
+            <w:shd w:fill="F4F5F1"/>
+          </w:tcPr>
+          <w:p>
+            <w:pPr>
+              <w:spacing w:after="0" w:line="259" w:lineRule="auto"/>
+            </w:pPr>
+            <w:r>
+              <w:rPr>
+                <w:rFonts w:ascii="Arial" w:hAnsi="Arial" w:eastAsia="Arial"/>
+                <w:color w:val="111815"/>
+                <w:sz w:val="16"/>
+              </w:rPr>
+              <w:t>Creates a traceable value-intake record</w:t>
             </w:r>
           </w:p>
         </w:tc>
@@ -12683,7 +12921,7 @@
                 <w:color w:val="111815"/>
                 <w:sz w:val="16"/>
               </w:rPr>
-              <w:t>Define case, horizon, selected entity, decision pattern, objective hierarchy, and assumptions</w:t>
+              <w:t>Define decision, horizon, selected entity, decision pattern, objective hierarchy, and assumptions</w:t>
             </w:r>
           </w:p>
         </w:tc>
@@ -12708,7 +12946,7 @@
                 <w:color w:val="111815"/>
                 <w:sz w:val="16"/>
               </w:rPr>
-              <w:t>Project, case, user, timestamp, variable and constraint version</w:t>
+              <w:t>Project, decision, user, timestamp, variable and constraint version</w:t>
             </w:r>
           </w:p>
         </w:tc>
@@ -14434,7 +14672,7 @@
                 <w:color w:val="111815"/>
                 <w:sz w:val="15"/>
               </w:rPr>
-              <w:t>Open Knowledge graph</w:t>
+              <w:t>Open Graph</w:t>
             </w:r>
           </w:p>
         </w:tc>
@@ -14542,7 +14780,7 @@
                 <w:color w:val="111815"/>
                 <w:sz w:val="15"/>
               </w:rPr>
-              <w:t>Open Agent society and select the OR specialist</w:t>
+              <w:t>Open Agents and select the OR specialist</w:t>
             </w:r>
           </w:p>
         </w:tc>
@@ -14784,7 +15022,7 @@
                 <w:color w:val="111815"/>
                 <w:sz w:val="15"/>
               </w:rPr>
-              <w:t>The app carries the same project and case context into formulation and scenario comparison.</w:t>
+              <w:t>The app carries the same project and selected decision context into formulation and scenario comparison.</w:t>
             </w:r>
           </w:p>
         </w:tc>
@@ -15082,7 +15320,7 @@
                 <w:color w:val="111815"/>
                 <w:sz w:val="15"/>
               </w:rPr>
-              <w:t>Open Case Workspace and scenario receipts</w:t>
+              <w:t>Open Decision and scenario receipts</w:t>
             </w:r>
           </w:p>
         </w:tc>
@@ -15107,7 +15345,7 @@
                 <w:color w:val="111815"/>
                 <w:sz w:val="15"/>
               </w:rPr>
-              <w:t>The case compares alternatives without calling a solver or labeling a result optimal.</w:t>
+              <w:t>The decision compares alternatives without calling a solver or labeling a result optimal.</w:t>
             </w:r>
           </w:p>
         </w:tc>
@@ -15190,7 +15428,7 @@
                 <w:color w:val="111815"/>
                 <w:sz w:val="15"/>
               </w:rPr>
-              <w:t>Open Action Room</w:t>
+              <w:t>Open Review</w:t>
             </w:r>
           </w:p>
         </w:tc>
@@ -15216,7 +15454,7 @@
                 <w:color w:val="111815"/>
                 <w:sz w:val="15"/>
               </w:rPr>
-              <w:t>The release either changes the browser-session case stage or explains the failed prerequisite.</w:t>
+              <w:t>The release either changes the browser-session decision stage or explains the failed prerequisite.</w:t>
             </w:r>
           </w:p>
         </w:tc>
@@ -15264,7 +15502,7 @@
     </w:p>
     <w:p>
       <w:r>
-        <w:t>For ports and cargo, select P-008 Global Berth to Door. Open LogisticsRadar, choose route and transfer layers, focus a port region, pin a cargo or handoff, inspect quantity and value, then open the retained context in Network Optimizer or RiskRadar. Return to Project data to demonstrate how a future QR custody event or port update would be staged under the client and project boundary.</w:t>
+        <w:t>For ports and cargo, select P-008 Global Berth to Door. Open LogisticsRadar, choose route and transfer layers, focus a port region, pin a cargo or handoff, and inspect quantity and value. Return to Data to request a future QR custody feed or port update under the client and project boundary.</w:t>
       </w:r>
     </w:p>
     <w:p>
@@ -15612,7 +15850,7 @@
                 <w:color w:val="111815"/>
                 <w:sz w:val="16"/>
               </w:rPr>
-              <w:t>Restore URL-addressed views, scope, case, project, tab, and app studio</w:t>
+              <w:t>Restore URL-addressed views, scope, decision, project, tab, and app studio</w:t>
             </w:r>
           </w:p>
         </w:tc>
@@ -17491,7 +17729,7 @@
     </w:p>
     <w:p>
       <w:r>
-        <w:t>Use the concept to demonstrate the intended operating model: one project context, distinct specialist apps, visible agent activity, human expertise, canonical variables, explicit OR methods, and traceable claims. When a screen shows a fixture, target contract, missing connector, or blocked gate, preserve that label. It is part of the trust model.</w:t>
+        <w:t>Use the concept as one coherent workspace: Operations World for global or regional awareness, then Sector, Client, and Project for delivery. Keep apps, data, IoT requests, agents, decisions, collaborators, variables, OR methods, and evidence inside the selected project. When a screen shows a fixture, target contract, missing connector, or blocked gate, preserve that label; it is part of the trust model.</w:t>
       </w:r>
     </w:p>
     <w:sectPr>
@@ -17519,7 +17757,7 @@
         <w:color w:val="5E6862"/>
         <w:sz w:val="16"/>
       </w:rPr>
-      <w:t xml:space="preserve">Maya concept experience  |  Synthetic data  |  Page </w:t>
+      <w:t xml:space="preserve">Maya Workspace  |  Synthetic data  |  Page </w:t>
     </w:r>
     <w:r>
       <w:rPr>

</xml_diff>

<commit_message>
Maya workspace navigation and traceability release
</commit_message>
<xml_diff>
--- a/docs/Maya_Navigation_Guide.docx
+++ b/docs/Maya_Navigation_Guide.docx
@@ -29,7 +29,7 @@
         <w:pStyle w:val="Subtitle"/>
       </w:pPr>
       <w:r>
-        <w:t>Workspace  Projects  Operations World  Evidence</w:t>
+        <w:t>Projects  Mounted work  Data and graph  Evidence</w:t>
       </w:r>
     </w:p>
     <w:p>
@@ -43,7 +43,7 @@
           <w:color w:val="5E6862"/>
           <w:sz w:val="18"/>
         </w:rPr>
-        <w:t>Version 4  |  5 September 2026  |  Front-end concept</w:t>
+        <w:t>Version 5  |  5 September 2026  |  Front-end concept</w:t>
       </w:r>
     </w:p>
     <w:p>
@@ -55,7 +55,7 @@
           <w:rFonts w:ascii="Arial" w:hAnsi="Arial" w:eastAsia="Arial"/>
           <w:sz w:val="24"/>
         </w:rPr>
-        <w:t>This guide explains the complete Maya Workspace journey: onboard a client, create a collaborative project, bring in governed data and IoT signals, mount specialist apps, inspect evidence, work with expert agents, compare an operations-research response, and stop at a human decision gate.</w:t>
+        <w:t>This guide explains the complete Maya Workspace journey: choose a client and project, bring in governed data and IoT signals, navigate mounted specialist apps, work in Playground, inspect accountable agents and team members, compare an operations-research response, and stop at a human decision gate.</w:t>
       </w:r>
     </w:p>
     <w:p>
@@ -96,7 +96,7 @@
         <w:t xml:space="preserve">2.  </w:t>
       </w:r>
       <w:r>
-        <w:t>For project delivery, start with Workspace hierarchy and Project tabs.</w:t>
+        <w:t>For project delivery, start with Workspace hierarchy and Project surfaces.</w:t>
       </w:r>
     </w:p>
     <w:p>
@@ -112,7 +112,7 @@
         <w:t xml:space="preserve">3.  </w:t>
       </w:r>
       <w:r>
-        <w:t>For trust and governance, read Evidence receipts, Agents, and Concept boundaries before demonstrating an approval or optimization flow.</w:t>
+        <w:t>For trust and governance, read Evidence receipts, Playground and accountability, and Concept boundaries before demonstrating an approval or optimization flow.</w:t>
       </w:r>
     </w:p>
     <w:p>
@@ -188,7 +188,7 @@
           <w:color w:val="111815"/>
           <w:sz w:val="16"/>
         </w:rPr>
-        <w:t xml:space="preserve">  Operations World (Global or Regional)</w:t>
+        <w:t xml:space="preserve">  Clients and projects</w:t>
       </w:r>
     </w:p>
     <w:p>
@@ -202,7 +202,7 @@
           <w:color w:val="111815"/>
           <w:sz w:val="16"/>
         </w:rPr>
-        <w:t xml:space="preserve">  Sector</w:t>
+        <w:t xml:space="preserve">    By client: Client &gt; Tower &gt; Project</w:t>
       </w:r>
     </w:p>
     <w:p>
@@ -216,7 +216,7 @@
           <w:color w:val="111815"/>
           <w:sz w:val="16"/>
         </w:rPr>
-        <w:t xml:space="preserve">    Client</w:t>
+        <w:t xml:space="preserve">    By tower: Tower &gt; Client &gt; Project</w:t>
       </w:r>
     </w:p>
     <w:p>
@@ -230,7 +230,7 @@
           <w:color w:val="111815"/>
           <w:sz w:val="16"/>
         </w:rPr>
-        <w:t xml:space="preserve">      Project</w:t>
+        <w:t xml:space="preserve">      Project context bar</w:t>
       </w:r>
     </w:p>
     <w:p>
@@ -244,7 +244,7 @@
           <w:color w:val="111815"/>
           <w:sz w:val="16"/>
         </w:rPr>
-        <w:t xml:space="preserve">        Overview and collaborators</w:t>
+        <w:t xml:space="preserve">        Apps and mounted app shortcuts</w:t>
       </w:r>
     </w:p>
     <w:p>
@@ -258,7 +258,7 @@
           <w:color w:val="111815"/>
           <w:sz w:val="16"/>
         </w:rPr>
-        <w:t xml:space="preserve">        Decisions and review</w:t>
+        <w:t xml:space="preserve">        Agent and team accountability launchers</w:t>
       </w:r>
     </w:p>
     <w:p>
@@ -272,7 +272,7 @@
           <w:color w:val="111815"/>
           <w:sz w:val="16"/>
         </w:rPr>
-        <w:t xml:space="preserve">        Apps, data and IoT requests</w:t>
+        <w:t xml:space="preserve">      Project workspace</w:t>
       </w:r>
     </w:p>
     <w:p>
@@ -286,7 +286,35 @@
           <w:color w:val="111815"/>
           <w:sz w:val="16"/>
         </w:rPr>
-        <w:t xml:space="preserve">        Knowledge graph and agents</w:t>
+        <w:t xml:space="preserve">        Overview and decisions</w:t>
+      </w:r>
+    </w:p>
+    <w:p>
+      <w:pPr>
+        <w:spacing w:after="40"/>
+        <w:ind w:left="360"/>
+      </w:pPr>
+      <w:r>
+        <w:rPr>
+          <w:rFonts w:ascii="Consolas" w:hAnsi="Consolas" w:eastAsia="Consolas"/>
+          <w:color w:val="111815"/>
+          <w:sz w:val="16"/>
+        </w:rPr>
+        <w:t xml:space="preserve">        Data and graph</w:t>
+      </w:r>
+    </w:p>
+    <w:p>
+      <w:pPr>
+        <w:spacing w:after="40"/>
+        <w:ind w:left="360"/>
+      </w:pPr>
+      <w:r>
+        <w:rPr>
+          <w:rFonts w:ascii="Consolas" w:hAnsi="Consolas" w:eastAsia="Consolas"/>
+          <w:color w:val="111815"/>
+          <w:sz w:val="16"/>
+        </w:rPr>
+        <w:t xml:space="preserve">        Playground sessions</w:t>
       </w:r>
     </w:p>
     <w:p>
@@ -301,6 +329,20 @@
           <w:sz w:val="16"/>
         </w:rPr>
         <w:t xml:space="preserve">        Evidence and controls</w:t>
+      </w:r>
+    </w:p>
+    <w:p>
+      <w:pPr>
+        <w:spacing w:after="40"/>
+        <w:ind w:left="360"/>
+      </w:pPr>
+      <w:r>
+        <w:rPr>
+          <w:rFonts w:ascii="Consolas" w:hAnsi="Consolas" w:eastAsia="Consolas"/>
+          <w:color w:val="111815"/>
+          <w:sz w:val="16"/>
+        </w:rPr>
+        <w:t xml:space="preserve">  Operations World (Global or Regional)</w:t>
       </w:r>
     </w:p>
     <w:p>
@@ -523,7 +565,7 @@
                 <w:color w:val="111815"/>
                 <w:sz w:val="16"/>
               </w:rPr>
-              <w:t>The left tree is Sector, Client, Project; the application opens here by default.</w:t>
+              <w:t>The outer left rail contains the only project hierarchy. It opens By client and can switch to By tower without changing the selected project.</w:t>
             </w:r>
           </w:p>
         </w:tc>
@@ -714,7 +756,7 @@
                 <w:color w:val="111815"/>
                 <w:sz w:val="16"/>
               </w:rPr>
-              <w:t>Apps</w:t>
+              <w:t>Apps in the mounted-work bar</w:t>
             </w:r>
           </w:p>
         </w:tc>
@@ -739,7 +781,7 @@
                 <w:color w:val="111815"/>
                 <w:sz w:val="16"/>
               </w:rPr>
-              <w:t>Ten apps have different visual languages, interaction models, outputs, methods, and variables.</w:t>
+              <w:t>The strip shows only apps mounted to this project; Apps opens the complete project catalog without adding another project tab.</w:t>
             </w:r>
           </w:p>
         </w:tc>
@@ -764,7 +806,7 @@
                 <w:color w:val="111815"/>
                 <w:sz w:val="16"/>
               </w:rPr>
-              <w:t>Project app graph</w:t>
+              <w:t>Project app catalog</w:t>
             </w:r>
           </w:p>
         </w:tc>
@@ -930,7 +972,7 @@
                 <w:color w:val="111815"/>
                 <w:sz w:val="16"/>
               </w:rPr>
-              <w:t>Agents</w:t>
+              <w:t>Playground</w:t>
             </w:r>
           </w:p>
         </w:tc>
@@ -955,7 +997,7 @@
                 <w:color w:val="111815"/>
                 <w:sz w:val="16"/>
               </w:rPr>
-              <w:t>A code-style session shows a bounded agent trace, skill and tool profile, steering controls, and a human gate.</w:t>
+              <w:t>Open a stable session ID, inspect its message IDs and app calls, steer an active child, and stop at the human gate.</w:t>
             </w:r>
           </w:p>
         </w:tc>
@@ -980,7 +1022,7 @@
                 <w:color w:val="111815"/>
                 <w:sz w:val="16"/>
               </w:rPr>
-              <w:t>Session run receipt</w:t>
+              <w:t>Session result and trace</w:t>
             </w:r>
           </w:p>
         </w:tc>
@@ -1038,7 +1080,7 @@
                 <w:color w:val="111815"/>
                 <w:sz w:val="16"/>
               </w:rPr>
-              <w:t>Data</w:t>
+              <w:t>Data &amp; graph</w:t>
             </w:r>
           </w:p>
         </w:tc>
@@ -1064,7 +1106,7 @@
                 <w:color w:val="111815"/>
                 <w:sz w:val="16"/>
               </w:rPr>
-              <w:t>Uploads and IoT source requests stay inside the project boundary.</w:t>
+              <w:t>Uploads, IoT requests, data search, source records, and knowledge graph inspection stay in one project surface.</w:t>
             </w:r>
           </w:p>
         </w:tc>
@@ -1090,7 +1132,7 @@
                 <w:color w:val="111815"/>
                 <w:sz w:val="16"/>
               </w:rPr>
-              <w:t>Dataset or connector receipt</w:t>
+              <w:t>Dataset, connector, or evidence receipt</w:t>
             </w:r>
           </w:p>
         </w:tc>
@@ -1350,7 +1392,7 @@
         <w:spacing w:after="200"/>
       </w:pPr>
       <w:r>
-        <w:t>Workspace is the application root. A specialist selects a sector, client, and project. Every project owns its data, apps, agents, decisions, collaborators, evidence, and controls.</w:t>
+        <w:t>Workspace is the application root. The outer project rail can organize the same records by client or by tower. Every selected project owns its data, apps, agents, decisions, collaborators, evidence, and controls.</w:t>
       </w:r>
     </w:p>
     <w:tbl>
@@ -2046,7 +2088,7 @@
         <w:pStyle w:val="ListBullet"/>
       </w:pPr>
       <w:r>
-        <w:t>Use the workspace tree on a large screen. Expand a sector, expand its client, and select the project.</w:t>
+        <w:t>Use the Project path rail. By client expands Client &gt; Tower &gt; Project; By tower expands Tower &gt; Client &gt; Project. The toggle changes the grouping, not the active project.</w:t>
       </w:r>
     </w:p>
     <w:p>
@@ -2054,7 +2096,7 @@
         <w:pStyle w:val="ListBullet"/>
       </w:pPr>
       <w:r>
-        <w:t>Use the Sector, Client, and Project selectors above the workspace on smaller screens.</w:t>
+        <w:t>The hierarchy is rendered once, in the outer rail. Project pages do not repeat a second client/tower/project tree inside the working canvas.</w:t>
       </w:r>
     </w:p>
     <w:p>
@@ -2062,7 +2104,7 @@
         <w:pStyle w:val="ListBullet"/>
       </w:pPr>
       <w:r>
-        <w:t>Use Search anything or Command K to jump directly to a project by sector, client, project name, or project code.</w:t>
+        <w:t>Search inside the project rail by client, tower, project name, project code, or problem. Matching paths expand automatically.</w:t>
       </w:r>
     </w:p>
     <w:p>
@@ -2070,7 +2112,7 @@
         <w:pStyle w:val="ListBullet"/>
       </w:pPr>
       <w:r>
-        <w:t>The URL records the sector, client, project, active tab, and app studio. Browser Back and Forward restore the same route.</w:t>
+        <w:t>New client, New project, and Collapse sit together at the top of the rail. Collapse with that control or Command B. On a narrow screen, use the menu button to open the rail as a drawer.</w:t>
       </w:r>
     </w:p>
     <w:p>
@@ -2078,7 +2120,44 @@
         <w:pStyle w:val="ListBullet"/>
       </w:pPr>
       <w:r>
-        <w:t>Each project preserves its own browser-session app mounts, uploads, connector requests, agent chat, trace state, steering instructions, draft agents, and team assignments while the page remains open.</w:t>
+        <w:t>Read the top breadcrumb for the complete Client, Tower, Project path. The bar below identifies the current surface, mounted apps, accountable agents and team members, and the active Playground session.</w:t>
+      </w:r>
+    </w:p>
+    <w:p>
+      <w:pPr>
+        <w:pStyle w:val="ListBullet"/>
+      </w:pPr>
+      <w:r>
+        <w:t>Use Search workspace or Command K to jump directly to a project or to a capability inside the selected project.</w:t>
+      </w:r>
+    </w:p>
+    <w:p>
+      <w:pPr>
+        <w:pStyle w:val="ListBullet"/>
+      </w:pPr>
+      <w:r>
+        <w:t>The URL records the project ancestry, surface, mounted app studio, Playground session, and app run when those records are visible. Browser Back and Forward restore the same valid project-scoped route.</w:t>
+      </w:r>
+    </w:p>
+    <w:p>
+      <w:pPr>
+        <w:pStyle w:val="ListBullet"/>
+      </w:pPr>
+      <w:r>
+        <w:t>Opening a specialist application keeps one return point. Use Back to project in the context bar or Browser Back to return to the project tab that launched it.</w:t>
+      </w:r>
+    </w:p>
+    <w:p>
+      <w:pPr>
+        <w:pStyle w:val="ListBullet"/>
+      </w:pPr>
+      <w:r>
+        <w:t>Each project preserves its own browser-session app mounts, uploads, connector requests, agent messages, traces, reruns, draft agents, and team assignments while the page remains open.</w:t>
+      </w:r>
+    </w:p>
+    <w:p>
+      <w:r>
+        <w:br w:type="page"/>
       </w:r>
     </w:p>
     <w:p>
@@ -2155,11 +2234,6 @@
       </w:r>
     </w:p>
     <w:p>
-      <w:r>
-        <w:br w:type="page"/>
-      </w:r>
-    </w:p>
-    <w:p>
       <w:pPr>
         <w:spacing w:after="100"/>
       </w:pPr>
@@ -3468,7 +3542,7 @@
         <w:keepNext/>
       </w:pPr>
       <w:r>
-        <w:t>Project tabs</w:t>
+        <w:t>Project surfaces</w:t>
       </w:r>
     </w:p>
     <w:p>
@@ -3476,7 +3550,7 @@
         <w:spacing w:after="200"/>
       </w:pPr>
       <w:r>
-        <w:t>The tabs separate specialist tasks while keeping one project context underneath them. Tabs wrap to the available width; there is no horizontal tab scroller.</w:t>
+        <w:t>Five compact tabs stay in the same position and size as the user changes tasks. The tab grid adapts to the available width without a horizontal scroller; apps and people are launched from the mounted-work bar above it.</w:t>
       </w:r>
     </w:p>
     <w:tbl>
@@ -3665,7 +3739,7 @@
                 <w:color w:val="111815"/>
                 <w:sz w:val="15"/>
               </w:rPr>
-              <w:t>Read outcome, project KPIs, app summary, decision preview, collaborators, and knowledge footprint.</w:t>
+              <w:t>Read outcome, project KPIs, mounted-work summary, decisions, and recent session history.</w:t>
             </w:r>
           </w:p>
         </w:tc>
@@ -3690,7 +3764,7 @@
                 <w:color w:val="111815"/>
                 <w:sz w:val="15"/>
               </w:rPr>
-              <w:t>Open KPI evidence, decision, app, agent, or project data.</w:t>
+              <w:t>Open KPI evidence, a decision, an app, a person, a prior session, or project data.</w:t>
             </w:r>
           </w:p>
         </w:tc>
@@ -3715,7 +3789,7 @@
                 <w:color w:val="111815"/>
                 <w:sz w:val="15"/>
               </w:rPr>
-              <w:t>Evidence drawer or destination workspace</w:t>
+              <w:t>Evidence drawer or exact work record</w:t>
             </w:r>
           </w:p>
         </w:tc>
@@ -3856,7 +3930,7 @@
                 <w:color w:val="111815"/>
                 <w:sz w:val="15"/>
               </w:rPr>
-              <w:t>Apps</w:t>
+              <w:t>Data &amp; graph</w:t>
             </w:r>
           </w:p>
         </w:tc>
@@ -3881,7 +3955,7 @@
                 <w:color w:val="111815"/>
                 <w:sz w:val="15"/>
               </w:rPr>
-              <w:t>See the dependency graph and project-specific app contracts.</w:t>
+              <w:t>Search, stage, and inspect project-owned sources and their connected entities in one place.</w:t>
             </w:r>
           </w:p>
         </w:tc>
@@ -3906,7 +3980,7 @@
                 <w:color w:val="111815"/>
                 <w:sz w:val="15"/>
               </w:rPr>
-              <w:t>Mount or unmount eligible apps, inspect the manifest, open an app studio.</w:t>
+              <w:t>Upload or request data, query files and records, switch to Knowledge graph, select a node, and open evidence.</w:t>
             </w:r>
           </w:p>
         </w:tc>
@@ -3931,7 +4005,7 @@
                 <w:color w:val="111815"/>
                 <w:sz w:val="15"/>
               </w:rPr>
-              <w:t>Project app studio</w:t>
+              <w:t>Dataset, connector, graph, or evidence receipt</w:t>
             </w:r>
           </w:p>
         </w:tc>
@@ -3963,7 +4037,7 @@
                 <w:color w:val="111815"/>
                 <w:sz w:val="15"/>
               </w:rPr>
-              <w:t>Data</w:t>
+              <w:t>Playground</w:t>
             </w:r>
           </w:p>
         </w:tc>
@@ -3989,7 +4063,7 @@
                 <w:color w:val="111815"/>
                 <w:sz w:val="15"/>
               </w:rPr>
-              <w:t>Stage project-owned data and request governed IoT or enterprise sources.</w:t>
+              <w:t>Continue agent-first work in a full session workspace.</w:t>
             </w:r>
           </w:p>
         </w:tc>
@@ -4015,7 +4089,7 @@
                 <w:color w:val="111815"/>
                 <w:sz w:val="15"/>
               </w:rPr>
-              <w:t>Advance file stages, inspect contracts, request a source, test a fixed sample, submit for policy review.</w:t>
+              <w:t>Open or create a session, enter a prompt, advance or cancel trace, steer, inspect app calls, and reopen immutable results.</w:t>
             </w:r>
           </w:p>
         </w:tc>
@@ -4041,7 +4115,7 @@
                 <w:color w:val="111815"/>
                 <w:sz w:val="15"/>
               </w:rPr>
-              <w:t>Dataset or connector receipt</w:t>
+              <w:t>Human gate, session result, or draft agent manifest</w:t>
             </w:r>
           </w:p>
         </w:tc>
@@ -4072,7 +4146,7 @@
                 <w:color w:val="111815"/>
                 <w:sz w:val="15"/>
               </w:rPr>
-              <w:t>Graph</w:t>
+              <w:t>Controls</w:t>
             </w:r>
           </w:p>
         </w:tc>
@@ -4097,7 +4171,7 @@
                 <w:color w:val="111815"/>
                 <w:sz w:val="15"/>
               </w:rPr>
-              <w:t>Inspect project entities and trace an agent path across evidence, variables, calculations, and decisions.</w:t>
+              <w:t>Review concept controls and production gaps.</w:t>
             </w:r>
           </w:p>
         </w:tc>
@@ -4122,7 +4196,7 @@
                 <w:color w:val="111815"/>
                 <w:sz w:val="15"/>
               </w:rPr>
-              <w:t>Select nodes, open receipts, play trace, add visual steering constraints.</w:t>
+              <w:t>Inspect evidence, access, control status, and boundary statements.</w:t>
             </w:r>
           </w:p>
         </w:tc>
@@ -4136,332 +4210,6 @@
               <w:bottom w:w="90" w:type="dxa"/>
               <w:end w:w="100" w:type="dxa"/>
             </w:tcMar>
-          </w:tcPr>
-          <w:p>
-            <w:pPr>
-              <w:spacing w:after="0" w:line="259" w:lineRule="auto"/>
-            </w:pPr>
-            <w:r>
-              <w:rPr>
-                <w:rFonts w:ascii="Arial" w:hAnsi="Arial" w:eastAsia="Arial"/>
-                <w:color w:val="111815"/>
-                <w:sz w:val="15"/>
-              </w:rPr>
-              <w:t>Trace context updated</w:t>
-            </w:r>
-          </w:p>
-        </w:tc>
-      </w:tr>
-      <w:tr>
-        <w:trPr>
-          <w:cantSplit/>
-        </w:trPr>
-        <w:tc>
-          <w:tcPr>
-            <w:tcW w:type="dxa" w:w="1440"/>
-            <w:vAlign w:val="center"/>
-            <w:tcMar>
-              <w:top w:w="90" w:type="dxa"/>
-              <w:start w:w="100" w:type="dxa"/>
-              <w:bottom w:w="90" w:type="dxa"/>
-              <w:end w:w="100" w:type="dxa"/>
-            </w:tcMar>
-            <w:shd w:fill="F4F5F1"/>
-          </w:tcPr>
-          <w:p>
-            <w:pPr>
-              <w:keepNext w:val="0"/>
-              <w:spacing w:after="0" w:line="259" w:lineRule="auto"/>
-            </w:pPr>
-            <w:r>
-              <w:rPr>
-                <w:rFonts w:ascii="Arial" w:hAnsi="Arial" w:eastAsia="Arial"/>
-                <w:color w:val="111815"/>
-                <w:sz w:val="15"/>
-              </w:rPr>
-              <w:t>Agents</w:t>
-            </w:r>
-          </w:p>
-        </w:tc>
-        <w:tc>
-          <w:tcPr>
-            <w:tcW w:type="dxa" w:w="3168"/>
-            <w:vAlign w:val="center"/>
-            <w:tcMar>
-              <w:top w:w="90" w:type="dxa"/>
-              <w:start w:w="100" w:type="dxa"/>
-              <w:bottom w:w="90" w:type="dxa"/>
-              <w:end w:w="100" w:type="dxa"/>
-            </w:tcMar>
-            <w:shd w:fill="F4F5F1"/>
-          </w:tcPr>
-          <w:p>
-            <w:pPr>
-              <w:spacing w:after="0" w:line="259" w:lineRule="auto"/>
-            </w:pPr>
-            <w:r>
-              <w:rPr>
-                <w:rFonts w:ascii="Arial" w:hAnsi="Arial" w:eastAsia="Arial"/>
-                <w:color w:val="111815"/>
-                <w:sz w:val="15"/>
-              </w:rPr>
-              <w:t>Work in a minimal code-style chat with specialist profiles.</w:t>
-            </w:r>
-          </w:p>
-        </w:tc>
-        <w:tc>
-          <w:tcPr>
-            <w:tcW w:type="dxa" w:w="3816"/>
-            <w:vAlign w:val="center"/>
-            <w:tcMar>
-              <w:top w:w="90" w:type="dxa"/>
-              <w:start w:w="100" w:type="dxa"/>
-              <w:bottom w:w="90" w:type="dxa"/>
-              <w:end w:w="100" w:type="dxa"/>
-            </w:tcMar>
-            <w:shd w:fill="F4F5F1"/>
-          </w:tcPr>
-          <w:p>
-            <w:pPr>
-              <w:spacing w:after="0" w:line="259" w:lineRule="auto"/>
-            </w:pPr>
-            <w:r>
-              <w:rPr>
-                <w:rFonts w:ascii="Arial" w:hAnsi="Arial" w:eastAsia="Arial"/>
-                <w:color w:val="111815"/>
-                <w:sz w:val="15"/>
-              </w:rPr>
-              <w:t>Create or select an agent, enter a prompt, advance or cancel trace, steer, and inspect experience.</w:t>
-            </w:r>
-          </w:p>
-        </w:tc>
-        <w:tc>
-          <w:tcPr>
-            <w:tcW w:type="dxa" w:w="1440"/>
-            <w:vAlign w:val="center"/>
-            <w:tcMar>
-              <w:top w:w="90" w:type="dxa"/>
-              <w:start w:w="100" w:type="dxa"/>
-              <w:bottom w:w="90" w:type="dxa"/>
-              <w:end w:w="100" w:type="dxa"/>
-            </w:tcMar>
-            <w:shd w:fill="F4F5F1"/>
-          </w:tcPr>
-          <w:p>
-            <w:pPr>
-              <w:spacing w:after="0" w:line="259" w:lineRule="auto"/>
-            </w:pPr>
-            <w:r>
-              <w:rPr>
-                <w:rFonts w:ascii="Arial" w:hAnsi="Arial" w:eastAsia="Arial"/>
-                <w:color w:val="111815"/>
-                <w:sz w:val="15"/>
-              </w:rPr>
-              <w:t>Human gate or draft manifest receipt</w:t>
-            </w:r>
-          </w:p>
-        </w:tc>
-      </w:tr>
-      <w:tr>
-        <w:trPr>
-          <w:cantSplit/>
-        </w:trPr>
-        <w:tc>
-          <w:tcPr>
-            <w:tcW w:type="dxa" w:w="1440"/>
-            <w:vAlign w:val="center"/>
-            <w:tcMar>
-              <w:top w:w="90" w:type="dxa"/>
-              <w:start w:w="100" w:type="dxa"/>
-              <w:bottom w:w="90" w:type="dxa"/>
-              <w:end w:w="100" w:type="dxa"/>
-            </w:tcMar>
-          </w:tcPr>
-          <w:p>
-            <w:pPr>
-              <w:keepNext w:val="0"/>
-              <w:spacing w:after="0" w:line="259" w:lineRule="auto"/>
-            </w:pPr>
-            <w:r>
-              <w:rPr>
-                <w:rFonts w:ascii="Arial" w:hAnsi="Arial" w:eastAsia="Arial"/>
-                <w:color w:val="111815"/>
-                <w:sz w:val="15"/>
-              </w:rPr>
-              <w:t>Team</w:t>
-            </w:r>
-          </w:p>
-        </w:tc>
-        <w:tc>
-          <w:tcPr>
-            <w:tcW w:type="dxa" w:w="3168"/>
-            <w:vAlign w:val="center"/>
-            <w:tcMar>
-              <w:top w:w="90" w:type="dxa"/>
-              <w:start w:w="100" w:type="dxa"/>
-              <w:bottom w:w="90" w:type="dxa"/>
-              <w:end w:w="100" w:type="dxa"/>
-            </w:tcMar>
-          </w:tcPr>
-          <w:p>
-            <w:pPr>
-              <w:spacing w:after="0" w:line="259" w:lineRule="auto"/>
-            </w:pPr>
-            <w:r>
-              <w:rPr>
-                <w:rFonts w:ascii="Arial" w:hAnsi="Arial" w:eastAsia="Arial"/>
-                <w:color w:val="111815"/>
-                <w:sz w:val="15"/>
-              </w:rPr>
-              <w:t>Put client and Kearney collaborators in the loop.</w:t>
-            </w:r>
-          </w:p>
-        </w:tc>
-        <w:tc>
-          <w:tcPr>
-            <w:tcW w:type="dxa" w:w="3816"/>
-            <w:vAlign w:val="center"/>
-            <w:tcMar>
-              <w:top w:w="90" w:type="dxa"/>
-              <w:start w:w="100" w:type="dxa"/>
-              <w:bottom w:w="90" w:type="dxa"/>
-              <w:end w:w="100" w:type="dxa"/>
-            </w:tcMar>
-          </w:tcPr>
-          <w:p>
-            <w:pPr>
-              <w:spacing w:after="0" w:line="259" w:lineRule="auto"/>
-            </w:pPr>
-            <w:r>
-              <w:rPr>
-                <w:rFonts w:ascii="Arial" w:hAnsi="Arial" w:eastAsia="Arial"/>
-                <w:color w:val="111815"/>
-                <w:sz w:val="15"/>
-              </w:rPr>
-              <w:t>Inspect affiliation, role, capability grants, experience, decision rights, and assignments.</w:t>
-            </w:r>
-          </w:p>
-        </w:tc>
-        <w:tc>
-          <w:tcPr>
-            <w:tcW w:type="dxa" w:w="1440"/>
-            <w:vAlign w:val="center"/>
-            <w:tcMar>
-              <w:top w:w="90" w:type="dxa"/>
-              <w:start w:w="100" w:type="dxa"/>
-              <w:bottom w:w="90" w:type="dxa"/>
-              <w:end w:w="100" w:type="dxa"/>
-            </w:tcMar>
-          </w:tcPr>
-          <w:p>
-            <w:pPr>
-              <w:spacing w:after="0" w:line="259" w:lineRule="auto"/>
-            </w:pPr>
-            <w:r>
-              <w:rPr>
-                <w:rFonts w:ascii="Arial" w:hAnsi="Arial" w:eastAsia="Arial"/>
-                <w:color w:val="111815"/>
-                <w:sz w:val="15"/>
-              </w:rPr>
-              <w:t>Membership or assignment receipt</w:t>
-            </w:r>
-          </w:p>
-        </w:tc>
-      </w:tr>
-      <w:tr>
-        <w:trPr>
-          <w:cantSplit/>
-        </w:trPr>
-        <w:tc>
-          <w:tcPr>
-            <w:tcW w:type="dxa" w:w="1440"/>
-            <w:vAlign w:val="center"/>
-            <w:tcMar>
-              <w:top w:w="90" w:type="dxa"/>
-              <w:start w:w="100" w:type="dxa"/>
-              <w:bottom w:w="90" w:type="dxa"/>
-              <w:end w:w="100" w:type="dxa"/>
-            </w:tcMar>
-            <w:shd w:fill="F4F5F1"/>
-          </w:tcPr>
-          <w:p>
-            <w:pPr>
-              <w:keepNext w:val="0"/>
-              <w:spacing w:after="0" w:line="259" w:lineRule="auto"/>
-            </w:pPr>
-            <w:r>
-              <w:rPr>
-                <w:rFonts w:ascii="Arial" w:hAnsi="Arial" w:eastAsia="Arial"/>
-                <w:color w:val="111815"/>
-                <w:sz w:val="15"/>
-              </w:rPr>
-              <w:t>Controls</w:t>
-            </w:r>
-          </w:p>
-        </w:tc>
-        <w:tc>
-          <w:tcPr>
-            <w:tcW w:type="dxa" w:w="3168"/>
-            <w:vAlign w:val="center"/>
-            <w:tcMar>
-              <w:top w:w="90" w:type="dxa"/>
-              <w:start w:w="100" w:type="dxa"/>
-              <w:bottom w:w="90" w:type="dxa"/>
-              <w:end w:w="100" w:type="dxa"/>
-            </w:tcMar>
-            <w:shd w:fill="F4F5F1"/>
-          </w:tcPr>
-          <w:p>
-            <w:pPr>
-              <w:spacing w:after="0" w:line="259" w:lineRule="auto"/>
-            </w:pPr>
-            <w:r>
-              <w:rPr>
-                <w:rFonts w:ascii="Arial" w:hAnsi="Arial" w:eastAsia="Arial"/>
-                <w:color w:val="111815"/>
-                <w:sz w:val="15"/>
-              </w:rPr>
-              <w:t>Review concept controls and production gaps.</w:t>
-            </w:r>
-          </w:p>
-        </w:tc>
-        <w:tc>
-          <w:tcPr>
-            <w:tcW w:type="dxa" w:w="3816"/>
-            <w:vAlign w:val="center"/>
-            <w:tcMar>
-              <w:top w:w="90" w:type="dxa"/>
-              <w:start w:w="100" w:type="dxa"/>
-              <w:bottom w:w="90" w:type="dxa"/>
-              <w:end w:w="100" w:type="dxa"/>
-            </w:tcMar>
-            <w:shd w:fill="F4F5F1"/>
-          </w:tcPr>
-          <w:p>
-            <w:pPr>
-              <w:spacing w:after="0" w:line="259" w:lineRule="auto"/>
-            </w:pPr>
-            <w:r>
-              <w:rPr>
-                <w:rFonts w:ascii="Arial" w:hAnsi="Arial" w:eastAsia="Arial"/>
-                <w:color w:val="111815"/>
-                <w:sz w:val="15"/>
-              </w:rPr>
-              <w:t>Inspect evidence, access, control status, and boundary statements.</w:t>
-            </w:r>
-          </w:p>
-        </w:tc>
-        <w:tc>
-          <w:tcPr>
-            <w:tcW w:type="dxa" w:w="1440"/>
-            <w:vAlign w:val="center"/>
-            <w:tcMar>
-              <w:top w:w="90" w:type="dxa"/>
-              <w:start w:w="100" w:type="dxa"/>
-              <w:bottom w:w="90" w:type="dxa"/>
-              <w:end w:w="100" w:type="dxa"/>
-            </w:tcMar>
-            <w:shd w:fill="F4F5F1"/>
           </w:tcPr>
           <w:p>
             <w:pPr>
@@ -4490,17 +4238,550 @@
         <w:keepNext/>
       </w:pPr>
       <w:r>
+        <w:t>Mounted work bar</w:t>
+      </w:r>
+    </w:p>
+    <w:tbl>
+      <w:tblPr>
+        <w:tblW w:type="auto" w:w="0"/>
+        <w:jc w:val="center"/>
+        <w:tblLayout w:type="fixed"/>
+        <w:tblLook w:firstColumn="1" w:firstRow="1" w:lastColumn="0" w:lastRow="0" w:noHBand="0" w:noVBand="1" w:val="04A0"/>
+        <w:tblBorders>
+          <w:top w:val="single" w:sz="6" w:color="D9D9D9"/>
+          <w:left w:val="single" w:sz="6" w:color="D9D9D9"/>
+          <w:bottom w:val="single" w:sz="6" w:color="D9D9D9"/>
+          <w:right w:val="single" w:sz="6" w:color="D9D9D9"/>
+          <w:insideH w:val="single" w:sz="6" w:color="D9D9D9"/>
+          <w:insideV w:val="single" w:sz="6" w:color="D9D9D9"/>
+        </w:tblBorders>
+      </w:tblPr>
+      <w:tblGrid>
+        <w:gridCol w:w="3389"/>
+        <w:gridCol w:w="3389"/>
+        <w:gridCol w:w="3389"/>
+      </w:tblGrid>
+      <w:tr>
+        <w:trPr>
+          <w:tblHeader w:val="true"/>
+          <w:cantSplit/>
+        </w:trPr>
+        <w:tc>
+          <w:tcPr>
+            <w:tcW w:type="dxa" w:w="1944"/>
+            <w:vAlign w:val="center"/>
+            <w:tcMar>
+              <w:top w:w="90" w:type="dxa"/>
+              <w:start w:w="100" w:type="dxa"/>
+              <w:bottom w:w="90" w:type="dxa"/>
+              <w:end w:w="100" w:type="dxa"/>
+            </w:tcMar>
+            <w:shd w:fill="111815"/>
+          </w:tcPr>
+          <w:p>
+            <w:pPr>
+              <w:spacing w:after="0" w:line="259" w:lineRule="auto"/>
+            </w:pPr>
+            <w:r>
+              <w:rPr>
+                <w:rFonts w:ascii="Arial" w:hAnsi="Arial" w:eastAsia="Arial"/>
+                <w:b/>
+                <w:color w:val="FFFFFF"/>
+                <w:sz w:val="16"/>
+              </w:rPr>
+              <w:t>Launcher</w:t>
+            </w:r>
+          </w:p>
+        </w:tc>
+        <w:tc>
+          <w:tcPr>
+            <w:tcW w:type="dxa" w:w="5472"/>
+            <w:vAlign w:val="center"/>
+            <w:tcMar>
+              <w:top w:w="90" w:type="dxa"/>
+              <w:start w:w="100" w:type="dxa"/>
+              <w:bottom w:w="90" w:type="dxa"/>
+              <w:end w:w="100" w:type="dxa"/>
+            </w:tcMar>
+            <w:shd w:fill="111815"/>
+          </w:tcPr>
+          <w:p>
+            <w:pPr>
+              <w:spacing w:after="0" w:line="259" w:lineRule="auto"/>
+            </w:pPr>
+            <w:r>
+              <w:rPr>
+                <w:rFonts w:ascii="Arial" w:hAnsi="Arial" w:eastAsia="Arial"/>
+                <w:b/>
+                <w:color w:val="FFFFFF"/>
+                <w:sz w:val="16"/>
+              </w:rPr>
+              <w:t>Purpose</w:t>
+            </w:r>
+          </w:p>
+        </w:tc>
+        <w:tc>
+          <w:tcPr>
+            <w:tcW w:type="dxa" w:w="2520"/>
+            <w:vAlign w:val="center"/>
+            <w:tcMar>
+              <w:top w:w="90" w:type="dxa"/>
+              <w:start w:w="100" w:type="dxa"/>
+              <w:bottom w:w="90" w:type="dxa"/>
+              <w:end w:w="100" w:type="dxa"/>
+            </w:tcMar>
+            <w:shd w:fill="111815"/>
+          </w:tcPr>
+          <w:p>
+            <w:pPr>
+              <w:spacing w:after="0" w:line="259" w:lineRule="auto"/>
+            </w:pPr>
+            <w:r>
+              <w:rPr>
+                <w:rFonts w:ascii="Arial" w:hAnsi="Arial" w:eastAsia="Arial"/>
+                <w:b/>
+                <w:color w:val="FFFFFF"/>
+                <w:sz w:val="16"/>
+              </w:rPr>
+              <w:t>Where it opens</w:t>
+            </w:r>
+          </w:p>
+        </w:tc>
+      </w:tr>
+      <w:tr>
+        <w:trPr>
+          <w:cantSplit/>
+        </w:trPr>
+        <w:tc>
+          <w:tcPr>
+            <w:tcW w:type="dxa" w:w="1944"/>
+            <w:vAlign w:val="center"/>
+            <w:tcMar>
+              <w:top w:w="90" w:type="dxa"/>
+              <w:start w:w="100" w:type="dxa"/>
+              <w:bottom w:w="90" w:type="dxa"/>
+              <w:end w:w="100" w:type="dxa"/>
+            </w:tcMar>
+          </w:tcPr>
+          <w:p>
+            <w:pPr>
+              <w:keepNext w:val="0"/>
+              <w:spacing w:after="0" w:line="259" w:lineRule="auto"/>
+            </w:pPr>
+            <w:r>
+              <w:rPr>
+                <w:rFonts w:ascii="Arial" w:hAnsi="Arial" w:eastAsia="Arial"/>
+                <w:color w:val="111815"/>
+                <w:sz w:val="16"/>
+              </w:rPr>
+              <w:t>Apps</w:t>
+            </w:r>
+          </w:p>
+        </w:tc>
+        <w:tc>
+          <w:tcPr>
+            <w:tcW w:type="dxa" w:w="5472"/>
+            <w:vAlign w:val="center"/>
+            <w:tcMar>
+              <w:top w:w="90" w:type="dxa"/>
+              <w:start w:w="100" w:type="dxa"/>
+              <w:bottom w:w="90" w:type="dxa"/>
+              <w:end w:w="100" w:type="dxa"/>
+            </w:tcMar>
+          </w:tcPr>
+          <w:p>
+            <w:pPr>
+              <w:spacing w:after="0" w:line="259" w:lineRule="auto"/>
+            </w:pPr>
+            <w:r>
+              <w:rPr>
+                <w:rFonts w:ascii="Arial" w:hAnsi="Arial" w:eastAsia="Arial"/>
+                <w:color w:val="111815"/>
+                <w:sz w:val="16"/>
+              </w:rPr>
+              <w:t>Open the full app dependency and mount catalog for this project.</w:t>
+            </w:r>
+          </w:p>
+        </w:tc>
+        <w:tc>
+          <w:tcPr>
+            <w:tcW w:type="dxa" w:w="2520"/>
+            <w:vAlign w:val="center"/>
+            <w:tcMar>
+              <w:top w:w="90" w:type="dxa"/>
+              <w:start w:w="100" w:type="dxa"/>
+              <w:bottom w:w="90" w:type="dxa"/>
+              <w:end w:w="100" w:type="dxa"/>
+            </w:tcMar>
+          </w:tcPr>
+          <w:p>
+            <w:pPr>
+              <w:spacing w:after="0" w:line="259" w:lineRule="auto"/>
+            </w:pPr>
+            <w:r>
+              <w:rPr>
+                <w:rFonts w:ascii="Arial" w:hAnsi="Arial" w:eastAsia="Arial"/>
+                <w:color w:val="111815"/>
+                <w:sz w:val="16"/>
+              </w:rPr>
+              <w:t>The project workspace</w:t>
+            </w:r>
+          </w:p>
+        </w:tc>
+      </w:tr>
+      <w:tr>
+        <w:trPr>
+          <w:cantSplit/>
+        </w:trPr>
+        <w:tc>
+          <w:tcPr>
+            <w:tcW w:type="dxa" w:w="1944"/>
+            <w:vAlign w:val="center"/>
+            <w:tcMar>
+              <w:top w:w="90" w:type="dxa"/>
+              <w:start w:w="100" w:type="dxa"/>
+              <w:bottom w:w="90" w:type="dxa"/>
+              <w:end w:w="100" w:type="dxa"/>
+            </w:tcMar>
+            <w:shd w:fill="F4F5F1"/>
+          </w:tcPr>
+          <w:p>
+            <w:pPr>
+              <w:keepNext w:val="0"/>
+              <w:spacing w:after="0" w:line="259" w:lineRule="auto"/>
+            </w:pPr>
+            <w:r>
+              <w:rPr>
+                <w:rFonts w:ascii="Arial" w:hAnsi="Arial" w:eastAsia="Arial"/>
+                <w:color w:val="111815"/>
+                <w:sz w:val="16"/>
+              </w:rPr>
+              <w:t>Mounted app chips</w:t>
+            </w:r>
+          </w:p>
+        </w:tc>
+        <w:tc>
+          <w:tcPr>
+            <w:tcW w:type="dxa" w:w="5472"/>
+            <w:vAlign w:val="center"/>
+            <w:tcMar>
+              <w:top w:w="90" w:type="dxa"/>
+              <w:start w:w="100" w:type="dxa"/>
+              <w:bottom w:w="90" w:type="dxa"/>
+              <w:end w:w="100" w:type="dxa"/>
+            </w:tcMar>
+            <w:shd w:fill="F4F5F1"/>
+          </w:tcPr>
+          <w:p>
+            <w:pPr>
+              <w:spacing w:after="0" w:line="259" w:lineRule="auto"/>
+            </w:pPr>
+            <w:r>
+              <w:rPr>
+                <w:rFonts w:ascii="Arial" w:hAnsi="Arial" w:eastAsia="Arial"/>
+                <w:color w:val="111815"/>
+                <w:sz w:val="16"/>
+              </w:rPr>
+              <w:t>Jump directly to the apps this project actually uses. The active app remains visible; the overflow count opens Apps.</w:t>
+            </w:r>
+          </w:p>
+        </w:tc>
+        <w:tc>
+          <w:tcPr>
+            <w:tcW w:type="dxa" w:w="2520"/>
+            <w:vAlign w:val="center"/>
+            <w:tcMar>
+              <w:top w:w="90" w:type="dxa"/>
+              <w:start w:w="100" w:type="dxa"/>
+              <w:bottom w:w="90" w:type="dxa"/>
+              <w:end w:w="100" w:type="dxa"/>
+            </w:tcMar>
+            <w:shd w:fill="F4F5F1"/>
+          </w:tcPr>
+          <w:p>
+            <w:pPr>
+              <w:spacing w:after="0" w:line="259" w:lineRule="auto"/>
+            </w:pPr>
+            <w:r>
+              <w:rPr>
+                <w:rFonts w:ascii="Arial" w:hAnsi="Arial" w:eastAsia="Arial"/>
+                <w:color w:val="111815"/>
+                <w:sz w:val="16"/>
+              </w:rPr>
+              <w:t>A distinct app studio with the same project frame</w:t>
+            </w:r>
+          </w:p>
+        </w:tc>
+      </w:tr>
+      <w:tr>
+        <w:trPr>
+          <w:cantSplit/>
+        </w:trPr>
+        <w:tc>
+          <w:tcPr>
+            <w:tcW w:type="dxa" w:w="1944"/>
+            <w:vAlign w:val="center"/>
+            <w:tcMar>
+              <w:top w:w="90" w:type="dxa"/>
+              <w:start w:w="100" w:type="dxa"/>
+              <w:bottom w:w="90" w:type="dxa"/>
+              <w:end w:w="100" w:type="dxa"/>
+            </w:tcMar>
+          </w:tcPr>
+          <w:p>
+            <w:pPr>
+              <w:keepNext w:val="0"/>
+              <w:spacing w:after="0" w:line="259" w:lineRule="auto"/>
+            </w:pPr>
+            <w:r>
+              <w:rPr>
+                <w:rFonts w:ascii="Arial" w:hAnsi="Arial" w:eastAsia="Arial"/>
+                <w:color w:val="111815"/>
+                <w:sz w:val="16"/>
+              </w:rPr>
+              <w:t>Agents</w:t>
+            </w:r>
+          </w:p>
+        </w:tc>
+        <w:tc>
+          <w:tcPr>
+            <w:tcW w:type="dxa" w:w="5472"/>
+            <w:vAlign w:val="center"/>
+            <w:tcMar>
+              <w:top w:w="90" w:type="dxa"/>
+              <w:start w:w="100" w:type="dxa"/>
+              <w:bottom w:w="90" w:type="dxa"/>
+              <w:end w:w="100" w:type="dxa"/>
+            </w:tcMar>
+          </w:tcPr>
+          <w:p>
+            <w:pPr>
+              <w:spacing w:after="0" w:line="259" w:lineRule="auto"/>
+            </w:pPr>
+            <w:r>
+              <w:rPr>
+                <w:rFonts w:ascii="Arial" w:hAnsi="Arial" w:eastAsia="Arial"/>
+                <w:color w:val="111815"/>
+                <w:sz w:val="16"/>
+              </w:rPr>
+              <w:t>See project agents and who is running which work. Compact names expose the most relevant identities.</w:t>
+            </w:r>
+          </w:p>
+        </w:tc>
+        <w:tc>
+          <w:tcPr>
+            <w:tcW w:type="dxa" w:w="2520"/>
+            <w:vAlign w:val="center"/>
+            <w:tcMar>
+              <w:top w:w="90" w:type="dxa"/>
+              <w:start w:w="100" w:type="dxa"/>
+              <w:bottom w:w="90" w:type="dxa"/>
+              <w:end w:w="100" w:type="dxa"/>
+            </w:tcMar>
+          </w:tcPr>
+          <w:p>
+            <w:pPr>
+              <w:spacing w:after="0" w:line="259" w:lineRule="auto"/>
+            </w:pPr>
+            <w:r>
+              <w:rPr>
+                <w:rFonts w:ascii="Arial" w:hAnsi="Arial" w:eastAsia="Arial"/>
+                <w:color w:val="111815"/>
+                <w:sz w:val="16"/>
+              </w:rPr>
+              <w:t>One right-side accountability panel</w:t>
+            </w:r>
+          </w:p>
+        </w:tc>
+      </w:tr>
+      <w:tr>
+        <w:trPr>
+          <w:cantSplit/>
+        </w:trPr>
+        <w:tc>
+          <w:tcPr>
+            <w:tcW w:type="dxa" w:w="1944"/>
+            <w:vAlign w:val="center"/>
+            <w:tcMar>
+              <w:top w:w="90" w:type="dxa"/>
+              <w:start w:w="100" w:type="dxa"/>
+              <w:bottom w:w="90" w:type="dxa"/>
+              <w:end w:w="100" w:type="dxa"/>
+            </w:tcMar>
+            <w:shd w:fill="F4F5F1"/>
+          </w:tcPr>
+          <w:p>
+            <w:pPr>
+              <w:keepNext w:val="0"/>
+              <w:spacing w:after="0" w:line="259" w:lineRule="auto"/>
+            </w:pPr>
+            <w:r>
+              <w:rPr>
+                <w:rFonts w:ascii="Arial" w:hAnsi="Arial" w:eastAsia="Arial"/>
+                <w:color w:val="111815"/>
+                <w:sz w:val="16"/>
+              </w:rPr>
+              <w:t>Team</w:t>
+            </w:r>
+          </w:p>
+        </w:tc>
+        <w:tc>
+          <w:tcPr>
+            <w:tcW w:type="dxa" w:w="5472"/>
+            <w:vAlign w:val="center"/>
+            <w:tcMar>
+              <w:top w:w="90" w:type="dxa"/>
+              <w:start w:w="100" w:type="dxa"/>
+              <w:bottom w:w="90" w:type="dxa"/>
+              <w:end w:w="100" w:type="dxa"/>
+            </w:tcMar>
+            <w:shd w:fill="F4F5F1"/>
+          </w:tcPr>
+          <w:p>
+            <w:pPr>
+              <w:spacing w:after="0" w:line="259" w:lineRule="auto"/>
+            </w:pPr>
+            <w:r>
+              <w:rPr>
+                <w:rFonts w:ascii="Arial" w:hAnsi="Arial" w:eastAsia="Arial"/>
+                <w:color w:val="111815"/>
+                <w:sz w:val="16"/>
+              </w:rPr>
+              <w:t>See client and Kearney collaborators, their project rights, and attributed activity.</w:t>
+            </w:r>
+          </w:p>
+        </w:tc>
+        <w:tc>
+          <w:tcPr>
+            <w:tcW w:type="dxa" w:w="2520"/>
+            <w:vAlign w:val="center"/>
+            <w:tcMar>
+              <w:top w:w="90" w:type="dxa"/>
+              <w:start w:w="100" w:type="dxa"/>
+              <w:bottom w:w="90" w:type="dxa"/>
+              <w:end w:w="100" w:type="dxa"/>
+            </w:tcMar>
+            <w:shd w:fill="F4F5F1"/>
+          </w:tcPr>
+          <w:p>
+            <w:pPr>
+              <w:spacing w:after="0" w:line="259" w:lineRule="auto"/>
+            </w:pPr>
+            <w:r>
+              <w:rPr>
+                <w:rFonts w:ascii="Arial" w:hAnsi="Arial" w:eastAsia="Arial"/>
+                <w:color w:val="111815"/>
+                <w:sz w:val="16"/>
+              </w:rPr>
+              <w:t>The same right-side accountability panel</w:t>
+            </w:r>
+          </w:p>
+        </w:tc>
+      </w:tr>
+      <w:tr>
+        <w:trPr>
+          <w:cantSplit/>
+        </w:trPr>
+        <w:tc>
+          <w:tcPr>
+            <w:tcW w:type="dxa" w:w="1944"/>
+            <w:vAlign w:val="center"/>
+            <w:tcMar>
+              <w:top w:w="90" w:type="dxa"/>
+              <w:start w:w="100" w:type="dxa"/>
+              <w:bottom w:w="90" w:type="dxa"/>
+              <w:end w:w="100" w:type="dxa"/>
+            </w:tcMar>
+          </w:tcPr>
+          <w:p>
+            <w:pPr>
+              <w:keepNext w:val="0"/>
+              <w:spacing w:after="0" w:line="259" w:lineRule="auto"/>
+            </w:pPr>
+            <w:r>
+              <w:rPr>
+                <w:rFonts w:ascii="Arial" w:hAnsi="Arial" w:eastAsia="Arial"/>
+                <w:color w:val="111815"/>
+                <w:sz w:val="16"/>
+              </w:rPr>
+              <w:t>Playground session</w:t>
+            </w:r>
+          </w:p>
+        </w:tc>
+        <w:tc>
+          <w:tcPr>
+            <w:tcW w:type="dxa" w:w="5472"/>
+            <w:vAlign w:val="center"/>
+            <w:tcMar>
+              <w:top w:w="90" w:type="dxa"/>
+              <w:start w:w="100" w:type="dxa"/>
+              <w:bottom w:w="90" w:type="dxa"/>
+              <w:end w:w="100" w:type="dxa"/>
+            </w:tcMar>
+          </w:tcPr>
+          <w:p>
+            <w:pPr>
+              <w:spacing w:after="0" w:line="259" w:lineRule="auto"/>
+            </w:pPr>
+            <w:r>
+              <w:rPr>
+                <w:rFonts w:ascii="Arial" w:hAnsi="Arial" w:eastAsia="Arial"/>
+                <w:color w:val="111815"/>
+                <w:sz w:val="16"/>
+              </w:rPr>
+              <w:t>Return to the current agent conversation or session history.</w:t>
+            </w:r>
+          </w:p>
+        </w:tc>
+        <w:tc>
+          <w:tcPr>
+            <w:tcW w:type="dxa" w:w="2520"/>
+            <w:vAlign w:val="center"/>
+            <w:tcMar>
+              <w:top w:w="90" w:type="dxa"/>
+              <w:start w:w="100" w:type="dxa"/>
+              <w:bottom w:w="90" w:type="dxa"/>
+              <w:end w:w="100" w:type="dxa"/>
+            </w:tcMar>
+          </w:tcPr>
+          <w:p>
+            <w:pPr>
+              <w:spacing w:after="0" w:line="259" w:lineRule="auto"/>
+            </w:pPr>
+            <w:r>
+              <w:rPr>
+                <w:rFonts w:ascii="Arial" w:hAnsi="Arial" w:eastAsia="Arial"/>
+                <w:color w:val="111815"/>
+                <w:sz w:val="16"/>
+              </w:rPr>
+              <w:t>Playground in the project workspace</w:t>
+            </w:r>
+          </w:p>
+        </w:tc>
+      </w:tr>
+    </w:tbl>
+    <w:p>
+      <w:pPr>
+        <w:spacing w:after="0" w:before="0"/>
+      </w:pPr>
+    </w:p>
+    <w:p>
+      <w:r>
+        <w:t>The Agents and Team launchers are mutually exclusive: opening one identity replaces the other in the right panel. Each profile shows only explicitly attributed project activity. Production attribution requires authenticated identities and signed, durable audit events.</w:t>
+      </w:r>
+    </w:p>
+    <w:p>
+      <w:pPr>
+        <w:pStyle w:val="Heading2"/>
+        <w:keepNext/>
+      </w:pPr>
+      <w:r>
         <w:t>What project persistence means</w:t>
       </w:r>
     </w:p>
     <w:p>
       <w:r>
         <w:t>The concept preserves per-project state in browser memory only. The signed-in Maya Rao fixture is one Kearney portfolio collaborator with an explicit membership in each seeded project. Project entry and governed session mutations evaluate that identity's declared capability grants; the interface never borrows a client owner's rights. A production implementation still needs authenticated tenant context, server-side project authorization, encrypted object storage, a project registry, lineage storage, versioned event history, retention policies, and audit controls. Do not interpret session restoration as backend persistence.</w:t>
-      </w:r>
-    </w:p>
-    <w:p>
-      <w:r>
-        <w:br w:type="page"/>
       </w:r>
     </w:p>
     <w:p>
@@ -8249,7 +8530,7 @@
         <w:pStyle w:val="ListBullet"/>
       </w:pPr>
       <w:r>
-        <w:t>Open an app from Apps to keep the project context and selected decision.</w:t>
+        <w:t>Open a mounted app chip for a direct jump, or choose Apps in the mounted-work bar to inspect and change the project catalog.</w:t>
       </w:r>
     </w:p>
     <w:p>
@@ -8269,6 +8550,22 @@
       </w:r>
     </w:p>
     <w:p>
+      <w:pPr>
+        <w:pStyle w:val="ListBullet"/>
+      </w:pPr>
+      <w:r>
+        <w:t>Use Run history to reopen an exact immutable run ID, inspect its report, trace, parent, inputs, and outputs, or open the application home for a new task.</w:t>
+      </w:r>
+    </w:p>
+    <w:p>
+      <w:pPr>
+        <w:pStyle w:val="ListBullet"/>
+      </w:pPr>
+      <w:r>
+        <w:t>Editable numeric assumptions remain visible when invalid. Correct the inline range or step error before Rerun with changes becomes available.</w:t>
+      </w:r>
+    </w:p>
+    <w:p>
       <w:r>
         <w:br w:type="page"/>
       </w:r>
@@ -8284,7 +8581,7 @@
           <w:color w:val="FF6B35"/>
           <w:sz w:val="17"/>
         </w:rPr>
-        <w:t>PROJECT AGENTS</w:t>
+        <w:t>PLAYGROUND</w:t>
       </w:r>
     </w:p>
     <w:p>
@@ -8301,7 +8598,7 @@
         <w:spacing w:after="200"/>
       </w:pPr>
       <w:r>
-        <w:t>Agents use a minimal code-style workspace. It exposes what the agent is doing, which project entities it touches, which evidence it cites, and where a human must decide.</w:t>
+        <w:t>Playground is the agent-first work surface. Its code-style layout exposes the conversation, stable message IDs, visible product trace, app calls, evidence, results, steering, and human decision gates without changing the surrounding project frame.</w:t>
       </w:r>
     </w:p>
     <w:tbl>
@@ -8465,7 +8762,7 @@
                 <w:color w:val="111815"/>
                 <w:sz w:val="15"/>
               </w:rPr>
-              <w:t>Agent roster</w:t>
+              <w:t>Session history</w:t>
             </w:r>
           </w:p>
         </w:tc>
@@ -8490,7 +8787,7 @@
                 <w:color w:val="111815"/>
                 <w:sz w:val="15"/>
               </w:rPr>
-              <w:t>Name, role, level, state, and specialty</w:t>
+              <w:t>Stable session ID, title, status, agent, activity, and result</w:t>
             </w:r>
           </w:p>
         </w:tc>
@@ -8515,7 +8812,7 @@
                 <w:color w:val="111815"/>
                 <w:sz w:val="15"/>
               </w:rPr>
-              <w:t>Create the first agent in a new project or select an existing project specialist</w:t>
+              <w:t>Continue a previous task or start a new project-scoped conversation</w:t>
             </w:r>
           </w:p>
         </w:tc>
@@ -8540,7 +8837,7 @@
                 <w:color w:val="111815"/>
                 <w:sz w:val="15"/>
               </w:rPr>
-              <w:t>Profiles are synthetic</w:t>
+              <w:t>History is browser-session fixture data</w:t>
             </w:r>
           </w:p>
         </w:tc>
@@ -8572,7 +8869,7 @@
                 <w:color w:val="111815"/>
                 <w:sz w:val="15"/>
               </w:rPr>
-              <w:t>Conversation</w:t>
+              <w:t>Run-as control</w:t>
             </w:r>
           </w:p>
         </w:tc>
@@ -8598,7 +8895,7 @@
                 <w:color w:val="111815"/>
                 <w:sz w:val="15"/>
               </w:rPr>
-              <w:t>User prompt, agent response, and system status</w:t>
+              <w:t>The specialist assigned to the next Playground prompt</w:t>
             </w:r>
           </w:p>
         </w:tc>
@@ -8624,7 +8921,7 @@
                 <w:color w:val="111815"/>
                 <w:sz w:val="15"/>
               </w:rPr>
-              <w:t>Ask a project-specific question. The deterministic response binds to the current project and selected specialist</w:t>
+              <w:t>Choose an existing project agent or open New agent to draft a manifest</w:t>
             </w:r>
           </w:p>
         </w:tc>
@@ -8650,7 +8947,7 @@
                 <w:color w:val="111815"/>
                 <w:sz w:val="15"/>
               </w:rPr>
-              <w:t>No model API is called</w:t>
+              <w:t>Profiles are synthetic</w:t>
             </w:r>
           </w:p>
         </w:tc>
@@ -8681,7 +8978,7 @@
                 <w:color w:val="111815"/>
                 <w:sz w:val="15"/>
               </w:rPr>
-              <w:t>Tool trace</w:t>
+              <w:t>Conversation</w:t>
             </w:r>
           </w:p>
         </w:tc>
@@ -8706,7 +9003,7 @@
                 <w:color w:val="111815"/>
                 <w:sz w:val="15"/>
               </w:rPr>
-              <w:t>Step, agent, activity, detail, and graph node</w:t>
+              <w:t>User prompt, agent response, and system status</w:t>
             </w:r>
           </w:p>
         </w:tc>
@@ -8731,7 +9028,7 @@
                 <w:color w:val="111815"/>
                 <w:sz w:val="15"/>
               </w:rPr>
-              <w:t>Start, advance, replay, cancel, and inspect the visible execution trace</w:t>
+              <w:t>Ask a project-specific question. The deterministic response binds to the current project and selected specialist</w:t>
             </w:r>
           </w:p>
         </w:tc>
@@ -8756,7 +9053,7 @@
                 <w:color w:val="111815"/>
                 <w:sz w:val="15"/>
               </w:rPr>
-              <w:t>This is not hidden chain of thought</w:t>
+              <w:t>No model API is called</w:t>
             </w:r>
           </w:p>
         </w:tc>
@@ -8788,7 +9085,7 @@
                 <w:color w:val="111815"/>
                 <w:sz w:val="15"/>
               </w:rPr>
-              <w:t>Visual steering</w:t>
+              <w:t>Tool trace</w:t>
             </w:r>
           </w:p>
         </w:tc>
@@ -8814,7 +9111,7 @@
                 <w:color w:val="111815"/>
                 <w:sz w:val="15"/>
               </w:rPr>
-              <w:t>Instructions such as pin evidence, require human review, preserve service floor, or exclude an entity</w:t>
+              <w:t>Step, agent, activity, detail, and graph node</w:t>
             </w:r>
           </w:p>
         </w:tc>
@@ -8840,7 +9137,7 @@
                 <w:color w:val="111815"/>
                 <w:sz w:val="15"/>
               </w:rPr>
-              <w:t>Click a steering control and confirm the instruction appears in the trace context</w:t>
+              <w:t>Start, advance, replay, cancel, and inspect the visible execution trace</w:t>
             </w:r>
           </w:p>
         </w:tc>
@@ -8866,7 +9163,7 @@
                 <w:color w:val="111815"/>
                 <w:sz w:val="15"/>
               </w:rPr>
-              <w:t>No policy or model weights change</w:t>
+              <w:t>This is not hidden chain of thought</w:t>
             </w:r>
           </w:p>
         </w:tc>
@@ -8897,7 +9194,7 @@
                 <w:color w:val="111815"/>
                 <w:sz w:val="15"/>
               </w:rPr>
-              <w:t>Experience profile</w:t>
+              <w:t>Visual steering</w:t>
             </w:r>
           </w:p>
         </w:tc>
@@ -8922,7 +9219,7 @@
                 <w:color w:val="111815"/>
                 <w:sz w:val="15"/>
               </w:rPr>
-              <w:t>Level, years, evaluated runs, approved runs, calibration, override rate, failure rate, skills, MCPs, tools, and authority</w:t>
+              <w:t>Instructions such as pin evidence, require human review, preserve service floor, or exclude an entity</w:t>
             </w:r>
           </w:p>
         </w:tc>
@@ -8947,7 +9244,7 @@
                 <w:color w:val="111815"/>
                 <w:sz w:val="15"/>
               </w:rPr>
-              <w:t>Open the profile fixture receipt before relying on a capability</w:t>
+              <w:t>Click a steering control and confirm the instruction appears in the trace context</w:t>
             </w:r>
           </w:p>
         </w:tc>
@@ -8972,7 +9269,7 @@
                 <w:color w:val="111815"/>
                 <w:sz w:val="15"/>
               </w:rPr>
-              <w:t>Statistics are demo fixtures</w:t>
+              <w:t>No policy or model weights change</w:t>
             </w:r>
           </w:p>
         </w:tc>
@@ -9004,6 +9301,115 @@
                 <w:color w:val="111815"/>
                 <w:sz w:val="15"/>
               </w:rPr>
+              <w:t>Experience profile</w:t>
+            </w:r>
+          </w:p>
+        </w:tc>
+        <w:tc>
+          <w:tcPr>
+            <w:tcW w:type="dxa" w:w="3096"/>
+            <w:vAlign w:val="center"/>
+            <w:tcMar>
+              <w:top w:w="90" w:type="dxa"/>
+              <w:start w:w="100" w:type="dxa"/>
+              <w:bottom w:w="90" w:type="dxa"/>
+              <w:end w:w="100" w:type="dxa"/>
+            </w:tcMar>
+            <w:shd w:fill="F4F5F1"/>
+          </w:tcPr>
+          <w:p>
+            <w:pPr>
+              <w:spacing w:after="0" w:line="259" w:lineRule="auto"/>
+            </w:pPr>
+            <w:r>
+              <w:rPr>
+                <w:rFonts w:ascii="Arial" w:hAnsi="Arial" w:eastAsia="Arial"/>
+                <w:color w:val="111815"/>
+                <w:sz w:val="15"/>
+              </w:rPr>
+              <w:t>Level, years, evaluated runs, approved runs, calibration, override rate, failure rate, skills, MCPs, tools, and authority</w:t>
+            </w:r>
+          </w:p>
+        </w:tc>
+        <w:tc>
+          <w:tcPr>
+            <w:tcW w:type="dxa" w:w="3672"/>
+            <w:vAlign w:val="center"/>
+            <w:tcMar>
+              <w:top w:w="90" w:type="dxa"/>
+              <w:start w:w="100" w:type="dxa"/>
+              <w:bottom w:w="90" w:type="dxa"/>
+              <w:end w:w="100" w:type="dxa"/>
+            </w:tcMar>
+            <w:shd w:fill="F4F5F1"/>
+          </w:tcPr>
+          <w:p>
+            <w:pPr>
+              <w:spacing w:after="0" w:line="259" w:lineRule="auto"/>
+            </w:pPr>
+            <w:r>
+              <w:rPr>
+                <w:rFonts w:ascii="Arial" w:hAnsi="Arial" w:eastAsia="Arial"/>
+                <w:color w:val="111815"/>
+                <w:sz w:val="15"/>
+              </w:rPr>
+              <w:t>Open the profile fixture receipt before relying on a capability</w:t>
+            </w:r>
+          </w:p>
+        </w:tc>
+        <w:tc>
+          <w:tcPr>
+            <w:tcW w:type="dxa" w:w="1728"/>
+            <w:vAlign w:val="center"/>
+            <w:tcMar>
+              <w:top w:w="90" w:type="dxa"/>
+              <w:start w:w="100" w:type="dxa"/>
+              <w:bottom w:w="90" w:type="dxa"/>
+              <w:end w:w="100" w:type="dxa"/>
+            </w:tcMar>
+            <w:shd w:fill="F4F5F1"/>
+          </w:tcPr>
+          <w:p>
+            <w:pPr>
+              <w:spacing w:after="0" w:line="259" w:lineRule="auto"/>
+            </w:pPr>
+            <w:r>
+              <w:rPr>
+                <w:rFonts w:ascii="Arial" w:hAnsi="Arial" w:eastAsia="Arial"/>
+                <w:color w:val="111815"/>
+                <w:sz w:val="15"/>
+              </w:rPr>
+              <w:t>Statistics are demo fixtures</w:t>
+            </w:r>
+          </w:p>
+        </w:tc>
+      </w:tr>
+      <w:tr>
+        <w:trPr>
+          <w:cantSplit/>
+        </w:trPr>
+        <w:tc>
+          <w:tcPr>
+            <w:tcW w:type="dxa" w:w="1512"/>
+            <w:vAlign w:val="center"/>
+            <w:tcMar>
+              <w:top w:w="90" w:type="dxa"/>
+              <w:start w:w="100" w:type="dxa"/>
+              <w:bottom w:w="90" w:type="dxa"/>
+              <w:end w:w="100" w:type="dxa"/>
+            </w:tcMar>
+          </w:tcPr>
+          <w:p>
+            <w:pPr>
+              <w:keepNext w:val="0"/>
+              <w:spacing w:after="0" w:line="259" w:lineRule="auto"/>
+            </w:pPr>
+            <w:r>
+              <w:rPr>
+                <w:rFonts w:ascii="Arial" w:hAnsi="Arial" w:eastAsia="Arial"/>
+                <w:color w:val="111815"/>
+                <w:sz w:val="15"/>
+              </w:rPr>
               <w:t>Agent builder</w:t>
             </w:r>
           </w:p>
@@ -9018,7 +9424,6 @@
               <w:bottom w:w="90" w:type="dxa"/>
               <w:end w:w="100" w:type="dxa"/>
             </w:tcMar>
-            <w:shd w:fill="F4F5F1"/>
           </w:tcPr>
           <w:p>
             <w:pPr>
@@ -9044,7 +9449,6 @@
               <w:bottom w:w="90" w:type="dxa"/>
               <w:end w:w="100" w:type="dxa"/>
             </w:tcMar>
-            <w:shd w:fill="F4F5F1"/>
           </w:tcPr>
           <w:p>
             <w:pPr>
@@ -9070,7 +9474,6 @@
               <w:bottom w:w="90" w:type="dxa"/>
               <w:end w:w="100" w:type="dxa"/>
             </w:tcMar>
-            <w:shd w:fill="F4F5F1"/>
           </w:tcPr>
           <w:p>
             <w:pPr>
@@ -9115,7 +9518,7 @@
         <w:t xml:space="preserve">1.  </w:t>
       </w:r>
       <w:r>
-        <w:t>Select the specialist whose authority matches the task.</w:t>
+        <w:t>Open Playground and select the specialist whose authority matches the task, or resume the relevant session from history.</w:t>
       </w:r>
     </w:p>
     <w:p>
@@ -9131,7 +9534,7 @@
         <w:t xml:space="preserve">2.  </w:t>
       </w:r>
       <w:r>
-        <w:t>Enter the decision question and submit it.</w:t>
+        <w:t>Enter the decision question and press Enter or Send. Use Shift Enter for a new line. Submitting creates or continues an immutable session and starts its visible trace.</w:t>
       </w:r>
     </w:p>
     <w:p>
@@ -9147,7 +9550,7 @@
         <w:t xml:space="preserve">3.  </w:t>
       </w:r>
       <w:r>
-        <w:t>Start the trace and inspect each evidence, graph, variable, formulation, and calculation step.</w:t>
+        <w:t>Advance the trace and inspect each evidence, graph, variable, formulation, and calculation step. Application-created sessions show Ready until a brief starts the trace.</w:t>
       </w:r>
     </w:p>
     <w:p>
@@ -9196,6 +9599,11 @@
       </w:r>
       <w:r>
         <w:t>Complete only at the human gate. Use Cancel when the context is wrong or incomplete.</w:t>
+      </w:r>
+    </w:p>
+    <w:p>
+      <w:r>
+        <w:t>Agent profiles do not repeat inside Playground. Choose Agents in the mounted-work bar to inspect one accountability record in the right panel. Exactly named actor events are attributed to that identity; sessions and app runs are labeled as involvement unless the fixture has a direct actor record.</w:t>
       </w:r>
     </w:p>
     <w:p>
@@ -10202,7 +10610,7 @@
         <w:pStyle w:val="ListBullet"/>
       </w:pPr>
       <w:r>
-        <w:t>Knowledge graph nodes and trace steps point back to project receipts.</w:t>
+        <w:t>Data &amp; graph search results, knowledge graph nodes, agent trace steps, and app-run inputs point back to project receipts.</w:t>
       </w:r>
     </w:p>
     <w:p>
@@ -10237,7 +10645,7 @@
           <w:color w:val="FF6B35"/>
           <w:sz w:val="17"/>
         </w:rPr>
-        <w:t>PROJECT DATA</w:t>
+        <w:t>DATA AND KNOWLEDGE</w:t>
       </w:r>
     </w:p>
     <w:p>
@@ -10246,7 +10654,7 @@
         <w:keepNext/>
       </w:pPr>
       <w:r>
-        <w:t>Stage project-owned data</w:t>
+        <w:t>Use Data &amp; graph</w:t>
       </w:r>
     </w:p>
     <w:p>
@@ -10254,7 +10662,375 @@
         <w:spacing w:after="200"/>
       </w:pPr>
       <w:r>
-        <w:t>Project data is inside the project workspace. The concept demonstrates the user journey without reading or persisting the selected file.</w:t>
+        <w:t>Sources and knowledge relationships share one project surface. A compact mode switch moves between source operations and graph inspection while one query searches the visible project catalog. The concept demonstrates the journey without reading or persisting a selected file.</w:t>
+      </w:r>
+    </w:p>
+    <w:tbl>
+      <w:tblPr>
+        <w:tblW w:type="auto" w:w="0"/>
+        <w:jc w:val="center"/>
+        <w:tblLayout w:type="fixed"/>
+        <w:tblLook w:firstColumn="1" w:firstRow="1" w:lastColumn="0" w:lastRow="0" w:noHBand="0" w:noVBand="1" w:val="04A0"/>
+        <w:tblBorders>
+          <w:top w:val="single" w:sz="6" w:color="D9D9D9"/>
+          <w:left w:val="single" w:sz="6" w:color="D9D9D9"/>
+          <w:bottom w:val="single" w:sz="6" w:color="D9D9D9"/>
+          <w:right w:val="single" w:sz="6" w:color="D9D9D9"/>
+          <w:insideH w:val="single" w:sz="6" w:color="D9D9D9"/>
+          <w:insideV w:val="single" w:sz="6" w:color="D9D9D9"/>
+        </w:tblBorders>
+      </w:tblPr>
+      <w:tblGrid>
+        <w:gridCol w:w="3389"/>
+        <w:gridCol w:w="3389"/>
+        <w:gridCol w:w="3389"/>
+      </w:tblGrid>
+      <w:tr>
+        <w:trPr>
+          <w:tblHeader w:val="true"/>
+          <w:cantSplit/>
+        </w:trPr>
+        <w:tc>
+          <w:tcPr>
+            <w:tcW w:type="dxa" w:w="1944"/>
+            <w:vAlign w:val="center"/>
+            <w:tcMar>
+              <w:top w:w="90" w:type="dxa"/>
+              <w:start w:w="100" w:type="dxa"/>
+              <w:bottom w:w="90" w:type="dxa"/>
+              <w:end w:w="100" w:type="dxa"/>
+            </w:tcMar>
+            <w:shd w:fill="111815"/>
+          </w:tcPr>
+          <w:p>
+            <w:pPr>
+              <w:spacing w:after="0" w:line="259" w:lineRule="auto"/>
+            </w:pPr>
+            <w:r>
+              <w:rPr>
+                <w:rFonts w:ascii="Arial" w:hAnsi="Arial" w:eastAsia="Arial"/>
+                <w:b/>
+                <w:color w:val="FFFFFF"/>
+                <w:sz w:val="16"/>
+              </w:rPr>
+              <w:t>Area</w:t>
+            </w:r>
+          </w:p>
+        </w:tc>
+        <w:tc>
+          <w:tcPr>
+            <w:tcW w:type="dxa" w:w="5904"/>
+            <w:vAlign w:val="center"/>
+            <w:tcMar>
+              <w:top w:w="90" w:type="dxa"/>
+              <w:start w:w="100" w:type="dxa"/>
+              <w:bottom w:w="90" w:type="dxa"/>
+              <w:end w:w="100" w:type="dxa"/>
+            </w:tcMar>
+            <w:shd w:fill="111815"/>
+          </w:tcPr>
+          <w:p>
+            <w:pPr>
+              <w:spacing w:after="0" w:line="259" w:lineRule="auto"/>
+            </w:pPr>
+            <w:r>
+              <w:rPr>
+                <w:rFonts w:ascii="Arial" w:hAnsi="Arial" w:eastAsia="Arial"/>
+                <w:b/>
+                <w:color w:val="FFFFFF"/>
+                <w:sz w:val="16"/>
+              </w:rPr>
+              <w:t>Use it for</w:t>
+            </w:r>
+          </w:p>
+        </w:tc>
+        <w:tc>
+          <w:tcPr>
+            <w:tcW w:type="dxa" w:w="2016"/>
+            <w:vAlign w:val="center"/>
+            <w:tcMar>
+              <w:top w:w="90" w:type="dxa"/>
+              <w:start w:w="100" w:type="dxa"/>
+              <w:bottom w:w="90" w:type="dxa"/>
+              <w:end w:w="100" w:type="dxa"/>
+            </w:tcMar>
+            <w:shd w:fill="111815"/>
+          </w:tcPr>
+          <w:p>
+            <w:pPr>
+              <w:spacing w:after="0" w:line="259" w:lineRule="auto"/>
+            </w:pPr>
+            <w:r>
+              <w:rPr>
+                <w:rFonts w:ascii="Arial" w:hAnsi="Arial" w:eastAsia="Arial"/>
+                <w:b/>
+                <w:color w:val="FFFFFF"/>
+                <w:sz w:val="16"/>
+              </w:rPr>
+              <w:t>Terminal result</w:t>
+            </w:r>
+          </w:p>
+        </w:tc>
+      </w:tr>
+      <w:tr>
+        <w:trPr>
+          <w:cantSplit/>
+        </w:trPr>
+        <w:tc>
+          <w:tcPr>
+            <w:tcW w:type="dxa" w:w="1944"/>
+            <w:vAlign w:val="center"/>
+            <w:tcMar>
+              <w:top w:w="90" w:type="dxa"/>
+              <w:start w:w="100" w:type="dxa"/>
+              <w:bottom w:w="90" w:type="dxa"/>
+              <w:end w:w="100" w:type="dxa"/>
+            </w:tcMar>
+          </w:tcPr>
+          <w:p>
+            <w:pPr>
+              <w:keepNext w:val="0"/>
+              <w:spacing w:after="0" w:line="259" w:lineRule="auto"/>
+            </w:pPr>
+            <w:r>
+              <w:rPr>
+                <w:rFonts w:ascii="Arial" w:hAnsi="Arial" w:eastAsia="Arial"/>
+                <w:color w:val="111815"/>
+                <w:sz w:val="16"/>
+              </w:rPr>
+              <w:t>Project query</w:t>
+            </w:r>
+          </w:p>
+        </w:tc>
+        <w:tc>
+          <w:tcPr>
+            <w:tcW w:type="dxa" w:w="5904"/>
+            <w:vAlign w:val="center"/>
+            <w:tcMar>
+              <w:top w:w="90" w:type="dxa"/>
+              <w:start w:w="100" w:type="dxa"/>
+              <w:bottom w:w="90" w:type="dxa"/>
+              <w:end w:w="100" w:type="dxa"/>
+            </w:tcMar>
+          </w:tcPr>
+          <w:p>
+            <w:pPr>
+              <w:spacing w:after="0" w:line="259" w:lineRule="auto"/>
+            </w:pPr>
+            <w:r>
+              <w:rPr>
+                <w:rFonts w:ascii="Arial" w:hAnsi="Arial" w:eastAsia="Arial"/>
+                <w:color w:val="111815"/>
+                <w:sz w:val="16"/>
+              </w:rPr>
+              <w:t>Search Excel, PDF, CSV, JSON, SQL-table, dataset, evidence, connector, variable, and graph fixtures.</w:t>
+            </w:r>
+          </w:p>
+        </w:tc>
+        <w:tc>
+          <w:tcPr>
+            <w:tcW w:type="dxa" w:w="2016"/>
+            <w:vAlign w:val="center"/>
+            <w:tcMar>
+              <w:top w:w="90" w:type="dxa"/>
+              <w:start w:w="100" w:type="dxa"/>
+              <w:bottom w:w="90" w:type="dxa"/>
+              <w:end w:w="100" w:type="dxa"/>
+            </w:tcMar>
+          </w:tcPr>
+          <w:p>
+            <w:pPr>
+              <w:spacing w:after="0" w:line="259" w:lineRule="auto"/>
+            </w:pPr>
+            <w:r>
+              <w:rPr>
+                <w:rFonts w:ascii="Arial" w:hAnsi="Arial" w:eastAsia="Arial"/>
+                <w:color w:val="111815"/>
+                <w:sz w:val="16"/>
+              </w:rPr>
+              <w:t>A bounded result opens its source contract, exact evidence receipt, or graph node</w:t>
+            </w:r>
+          </w:p>
+        </w:tc>
+      </w:tr>
+      <w:tr>
+        <w:trPr>
+          <w:cantSplit/>
+        </w:trPr>
+        <w:tc>
+          <w:tcPr>
+            <w:tcW w:type="dxa" w:w="1944"/>
+            <w:vAlign w:val="center"/>
+            <w:tcMar>
+              <w:top w:w="90" w:type="dxa"/>
+              <w:start w:w="100" w:type="dxa"/>
+              <w:bottom w:w="90" w:type="dxa"/>
+              <w:end w:w="100" w:type="dxa"/>
+            </w:tcMar>
+            <w:shd w:fill="F4F5F1"/>
+          </w:tcPr>
+          <w:p>
+            <w:pPr>
+              <w:keepNext w:val="0"/>
+              <w:spacing w:after="0" w:line="259" w:lineRule="auto"/>
+            </w:pPr>
+            <w:r>
+              <w:rPr>
+                <w:rFonts w:ascii="Arial" w:hAnsi="Arial" w:eastAsia="Arial"/>
+                <w:color w:val="111815"/>
+                <w:sz w:val="16"/>
+              </w:rPr>
+              <w:t>Sources</w:t>
+            </w:r>
+          </w:p>
+        </w:tc>
+        <w:tc>
+          <w:tcPr>
+            <w:tcW w:type="dxa" w:w="5904"/>
+            <w:vAlign w:val="center"/>
+            <w:tcMar>
+              <w:top w:w="90" w:type="dxa"/>
+              <w:start w:w="100" w:type="dxa"/>
+              <w:bottom w:w="90" w:type="dxa"/>
+              <w:end w:w="100" w:type="dxa"/>
+            </w:tcMar>
+            <w:shd w:fill="F4F5F1"/>
+          </w:tcPr>
+          <w:p>
+            <w:pPr>
+              <w:spacing w:after="0" w:line="259" w:lineRule="auto"/>
+            </w:pPr>
+            <w:r>
+              <w:rPr>
+                <w:rFonts w:ascii="Arial" w:hAnsi="Arial" w:eastAsia="Arial"/>
+                <w:color w:val="111815"/>
+                <w:sz w:val="16"/>
+              </w:rPr>
+              <w:t>Inspect datasets and connector contracts, stage a local file name, or request IoT and enterprise feeds.</w:t>
+            </w:r>
+          </w:p>
+        </w:tc>
+        <w:tc>
+          <w:tcPr>
+            <w:tcW w:type="dxa" w:w="2016"/>
+            <w:vAlign w:val="center"/>
+            <w:tcMar>
+              <w:top w:w="90" w:type="dxa"/>
+              <w:start w:w="100" w:type="dxa"/>
+              <w:bottom w:w="90" w:type="dxa"/>
+              <w:end w:w="100" w:type="dxa"/>
+            </w:tcMar>
+            <w:shd w:fill="F4F5F1"/>
+          </w:tcPr>
+          <w:p>
+            <w:pPr>
+              <w:spacing w:after="0" w:line="259" w:lineRule="auto"/>
+            </w:pPr>
+            <w:r>
+              <w:rPr>
+                <w:rFonts w:ascii="Arial" w:hAnsi="Arial" w:eastAsia="Arial"/>
+                <w:color w:val="111815"/>
+                <w:sz w:val="16"/>
+              </w:rPr>
+              <w:t>Dataset or connector receipt</w:t>
+            </w:r>
+          </w:p>
+        </w:tc>
+      </w:tr>
+      <w:tr>
+        <w:trPr>
+          <w:cantSplit/>
+        </w:trPr>
+        <w:tc>
+          <w:tcPr>
+            <w:tcW w:type="dxa" w:w="1944"/>
+            <w:vAlign w:val="center"/>
+            <w:tcMar>
+              <w:top w:w="90" w:type="dxa"/>
+              <w:start w:w="100" w:type="dxa"/>
+              <w:bottom w:w="90" w:type="dxa"/>
+              <w:end w:w="100" w:type="dxa"/>
+            </w:tcMar>
+          </w:tcPr>
+          <w:p>
+            <w:pPr>
+              <w:keepNext w:val="0"/>
+              <w:spacing w:after="0" w:line="259" w:lineRule="auto"/>
+            </w:pPr>
+            <w:r>
+              <w:rPr>
+                <w:rFonts w:ascii="Arial" w:hAnsi="Arial" w:eastAsia="Arial"/>
+                <w:color w:val="111815"/>
+                <w:sz w:val="16"/>
+              </w:rPr>
+              <w:t>Knowledge graph</w:t>
+            </w:r>
+          </w:p>
+        </w:tc>
+        <w:tc>
+          <w:tcPr>
+            <w:tcW w:type="dxa" w:w="5904"/>
+            <w:vAlign w:val="center"/>
+            <w:tcMar>
+              <w:top w:w="90" w:type="dxa"/>
+              <w:start w:w="100" w:type="dxa"/>
+              <w:bottom w:w="90" w:type="dxa"/>
+              <w:end w:w="100" w:type="dxa"/>
+            </w:tcMar>
+          </w:tcPr>
+          <w:p>
+            <w:pPr>
+              <w:spacing w:after="0" w:line="259" w:lineRule="auto"/>
+            </w:pPr>
+            <w:r>
+              <w:rPr>
+                <w:rFonts w:ascii="Arial" w:hAnsi="Arial" w:eastAsia="Arial"/>
+                <w:color w:val="111815"/>
+                <w:sz w:val="16"/>
+              </w:rPr>
+              <w:t>Inspect connected project entities and trace context across evidence, variables, calculations, apps, and decisions.</w:t>
+            </w:r>
+          </w:p>
+        </w:tc>
+        <w:tc>
+          <w:tcPr>
+            <w:tcW w:type="dxa" w:w="2016"/>
+            <w:vAlign w:val="center"/>
+            <w:tcMar>
+              <w:top w:w="90" w:type="dxa"/>
+              <w:start w:w="100" w:type="dxa"/>
+              <w:bottom w:w="90" w:type="dxa"/>
+              <w:end w:w="100" w:type="dxa"/>
+            </w:tcMar>
+          </w:tcPr>
+          <w:p>
+            <w:pPr>
+              <w:spacing w:after="0" w:line="259" w:lineRule="auto"/>
+            </w:pPr>
+            <w:r>
+              <w:rPr>
+                <w:rFonts w:ascii="Arial" w:hAnsi="Arial" w:eastAsia="Arial"/>
+                <w:color w:val="111815"/>
+                <w:sz w:val="16"/>
+              </w:rPr>
+              <w:t>Selected node, evidence receipt, or Playground steering context</w:t>
+            </w:r>
+          </w:p>
+        </w:tc>
+      </w:tr>
+    </w:tbl>
+    <w:p>
+      <w:pPr>
+        <w:spacing w:after="0" w:before="0"/>
+      </w:pPr>
+    </w:p>
+    <w:p>
+      <w:pPr>
+        <w:pStyle w:val="Heading2"/>
+        <w:keepNext/>
+      </w:pPr>
+      <w:r>
+        <w:t>Stage project-owned data</w:t>
       </w:r>
     </w:p>
     <w:tbl>
@@ -11047,6 +11823,11 @@
       </w:pPr>
     </w:p>
     <w:p>
+      <w:r>
+        <w:br w:type="page"/>
+      </w:r>
+    </w:p>
+    <w:p>
       <w:pPr>
         <w:pStyle w:val="Heading2"/>
         <w:keepNext/>
@@ -11057,7 +11838,7 @@
     </w:p>
     <w:p>
       <w:r>
-        <w:t>The Data tab includes explicit request templates for operational updates from ports, cargo handlers, warehouses, factories, suppliers, vehicles, robots, and field teams. QR scans, signed custody events, sensor telemetry, robot events, carrier milestones, CDC, and manual exceptions remain request drafts. Policy-review status and fixed-sample replay status are tracked independently, so completing one does not erase the other. Production ingestion must validate identity, device trust, timestamp, location, signature, unit, schema, consent, and access before updating the operational graph.</w:t>
+        <w:t>Sources mode includes explicit request templates for operational updates from ports, cargo handlers, warehouses, factories, suppliers, vehicles, robots, and field teams. QR scans, signed custody events, sensor telemetry, robot events, carrier milestones, CDC, and manual exceptions remain request drafts. Policy-review status and fixed-sample replay status are tracked independently, so completing one does not erase the other. Production ingestion must validate identity, device trust, timestamp, location, signature, unit, schema, consent, and access before updating the operational graph.</w:t>
       </w:r>
     </w:p>
     <w:tbl>
@@ -14672,7 +15453,7 @@
                 <w:color w:val="111815"/>
                 <w:sz w:val="15"/>
               </w:rPr>
-              <w:t>Open Graph</w:t>
+              <w:t>Open Data &amp; graph, then Knowledge graph</w:t>
             </w:r>
           </w:p>
         </w:tc>
@@ -14780,7 +15561,7 @@
                 <w:color w:val="111815"/>
                 <w:sz w:val="15"/>
               </w:rPr>
-              <w:t>Open Agents and select the OR specialist</w:t>
+              <w:t>Open Playground and select the OR specialist</w:t>
             </w:r>
           </w:p>
         </w:tc>
@@ -15502,7 +16283,7 @@
     </w:p>
     <w:p>
       <w:r>
-        <w:t>For ports and cargo, select P-008 Global Berth to Door. Open LogisticsRadar, choose route and transfer layers, focus a port region, pin a cargo or handoff, and inspect quantity and value. Return to Data to request a future QR custody feed or port update under the client and project boundary.</w:t>
+        <w:t>For ports and cargo, select P-008 Global Berth to Door. Open LogisticsRadar, choose route and transfer layers, focus a port region, pin a cargo or handoff, and inspect quantity and value. Return to Data &amp; graph, use Sources, and request a future QR custody feed or port update under the client and project boundary.</w:t>
       </w:r>
     </w:p>
     <w:p>
@@ -15538,7 +16319,7 @@
         <w:spacing w:after="200"/>
       </w:pPr>
       <w:r>
-        <w:t>Maya records navigation context in the query string so a concept walkthrough can start at a specific project tab or app studio.</w:t>
+        <w:t>Maya records validated project context in the query string so a walkthrough can start at a project surface, Playground session, app run, or mounted app studio.</w:t>
       </w:r>
     </w:p>
     <w:p>
@@ -15553,6 +16334,34 @@
           <w:sz w:val="16"/>
         </w:rPr>
         <w:t>?view=company&amp;scope=company&amp;sector=mobility-ev&amp;client=apex-mobility&amp;project=anode-shield&amp;projectTab=overview</w:t>
+      </w:r>
+    </w:p>
+    <w:p>
+      <w:pPr>
+        <w:spacing w:after="40"/>
+        <w:ind w:left="360"/>
+      </w:pPr>
+      <w:r>
+        <w:rPr>
+          <w:rFonts w:ascii="Consolas" w:hAnsi="Consolas" w:eastAsia="Consolas"/>
+          <w:color w:val="111815"/>
+          <w:sz w:val="16"/>
+        </w:rPr>
+        <w:t>?view=company&amp;scope=company&amp;sector=mobility-ev&amp;client=apex-mobility&amp;project=anode-shield&amp;projectTab=agents&amp;session=SES-P001-024</w:t>
+      </w:r>
+    </w:p>
+    <w:p>
+      <w:pPr>
+        <w:spacing w:after="40"/>
+        <w:ind w:left="360"/>
+      </w:pPr>
+      <w:r>
+        <w:rPr>
+          <w:rFonts w:ascii="Consolas" w:hAnsi="Consolas" w:eastAsia="Consolas"/>
+          <w:color w:val="111815"/>
+          <w:sz w:val="16"/>
+        </w:rPr>
+        <w:t>?view=company&amp;scope=company&amp;sector=mobility-ev&amp;client=apex-mobility&amp;project=anode-shield&amp;projectTab=apps&amp;run=APP-P001-NO-019</w:t>
       </w:r>
     </w:p>
     <w:p>
@@ -15768,7 +16577,7 @@
                 <w:color w:val="111815"/>
                 <w:sz w:val="16"/>
               </w:rPr>
-              <w:t>Escape</w:t>
+              <w:t>Command B or Control B</w:t>
             </w:r>
           </w:p>
         </w:tc>
@@ -15794,7 +16603,7 @@
                 <w:color w:val="111815"/>
                 <w:sz w:val="16"/>
               </w:rPr>
-              <w:t>Close search, notifications, profile menu, or mobile navigation</w:t>
+              <w:t>Collapse or expand the project rail when focus is outside an input</w:t>
             </w:r>
           </w:p>
         </w:tc>
@@ -15825,7 +16634,7 @@
                 <w:color w:val="111815"/>
                 <w:sz w:val="16"/>
               </w:rPr>
-              <w:t>Browser Back and Forward</w:t>
+              <w:t>Escape</w:t>
             </w:r>
           </w:p>
         </w:tc>
@@ -15850,7 +16659,7 @@
                 <w:color w:val="111815"/>
                 <w:sz w:val="16"/>
               </w:rPr>
-              <w:t>Restore URL-addressed views, scope, decision, project, tab, and app studio</w:t>
+              <w:t>Close search, notifications, profile menu, mobile navigation, accountability panel, receipts, evidence, onboarding, or the agent builder</w:t>
             </w:r>
           </w:p>
         </w:tc>
@@ -15882,6 +16691,63 @@
                 <w:color w:val="111815"/>
                 <w:sz w:val="16"/>
               </w:rPr>
+              <w:t>Browser Back and Forward</w:t>
+            </w:r>
+          </w:p>
+        </w:tc>
+        <w:tc>
+          <w:tcPr>
+            <w:tcW w:type="dxa" w:w="6912"/>
+            <w:vAlign w:val="center"/>
+            <w:tcMar>
+              <w:top w:w="90" w:type="dxa"/>
+              <w:start w:w="100" w:type="dxa"/>
+              <w:bottom w:w="90" w:type="dxa"/>
+              <w:end w:w="100" w:type="dxa"/>
+            </w:tcMar>
+            <w:shd w:fill="F4F5F1"/>
+          </w:tcPr>
+          <w:p>
+            <w:pPr>
+              <w:spacing w:after="0" w:line="259" w:lineRule="auto"/>
+            </w:pPr>
+            <w:r>
+              <w:rPr>
+                <w:rFonts w:ascii="Arial" w:hAnsi="Arial" w:eastAsia="Arial"/>
+                <w:color w:val="111815"/>
+                <w:sz w:val="16"/>
+              </w:rPr>
+              <w:t>Restore validated views, scope, decision, project, surface, app studio, Playground session, and app run</w:t>
+            </w:r>
+          </w:p>
+        </w:tc>
+      </w:tr>
+      <w:tr>
+        <w:trPr>
+          <w:cantSplit/>
+        </w:trPr>
+        <w:tc>
+          <w:tcPr>
+            <w:tcW w:type="dxa" w:w="2952"/>
+            <w:vAlign w:val="center"/>
+            <w:tcMar>
+              <w:top w:w="90" w:type="dxa"/>
+              <w:start w:w="100" w:type="dxa"/>
+              <w:bottom w:w="90" w:type="dxa"/>
+              <w:end w:w="100" w:type="dxa"/>
+            </w:tcMar>
+          </w:tcPr>
+          <w:p>
+            <w:pPr>
+              <w:keepNext w:val="0"/>
+              <w:spacing w:after="0" w:line="259" w:lineRule="auto"/>
+            </w:pPr>
+            <w:r>
+              <w:rPr>
+                <w:rFonts w:ascii="Arial" w:hAnsi="Arial" w:eastAsia="Arial"/>
+                <w:color w:val="111815"/>
+                <w:sz w:val="16"/>
+              </w:rPr>
               <w:t>Tab and Shift Tab</w:t>
             </w:r>
           </w:p>
@@ -15896,10 +16762,41 @@
               <w:bottom w:w="90" w:type="dxa"/>
               <w:end w:w="100" w:type="dxa"/>
             </w:tcMar>
+          </w:tcPr>
+          <w:p>
+            <w:pPr>
+              <w:spacing w:after="0" w:line="259" w:lineRule="auto"/>
+            </w:pPr>
+            <w:r>
+              <w:rPr>
+                <w:rFonts w:ascii="Arial" w:hAnsi="Arial" w:eastAsia="Arial"/>
+                <w:color w:val="111815"/>
+                <w:sz w:val="16"/>
+              </w:rPr>
+              <w:t>Move through buttons, inputs, selectors, map entities, and dialog controls; focus remains inside an open modal until it closes</w:t>
+            </w:r>
+          </w:p>
+        </w:tc>
+      </w:tr>
+      <w:tr>
+        <w:trPr>
+          <w:cantSplit/>
+        </w:trPr>
+        <w:tc>
+          <w:tcPr>
+            <w:tcW w:type="dxa" w:w="2952"/>
+            <w:vAlign w:val="center"/>
+            <w:tcMar>
+              <w:top w:w="90" w:type="dxa"/>
+              <w:start w:w="100" w:type="dxa"/>
+              <w:bottom w:w="90" w:type="dxa"/>
+              <w:end w:w="100" w:type="dxa"/>
+            </w:tcMar>
             <w:shd w:fill="F4F5F1"/>
           </w:tcPr>
           <w:p>
             <w:pPr>
+              <w:keepNext w:val="0"/>
               <w:spacing w:after="0" w:line="259" w:lineRule="auto"/>
             </w:pPr>
             <w:r>
@@ -15908,7 +16805,33 @@
                 <w:color w:val="111815"/>
                 <w:sz w:val="16"/>
               </w:rPr>
-              <w:t>Move through buttons, inputs, selectors, map entities, and dialog controls</w:t>
+              <w:t>Enter in a Playground prompt</w:t>
+            </w:r>
+          </w:p>
+        </w:tc>
+        <w:tc>
+          <w:tcPr>
+            <w:tcW w:type="dxa" w:w="6912"/>
+            <w:vAlign w:val="center"/>
+            <w:tcMar>
+              <w:top w:w="90" w:type="dxa"/>
+              <w:start w:w="100" w:type="dxa"/>
+              <w:bottom w:w="90" w:type="dxa"/>
+              <w:end w:w="100" w:type="dxa"/>
+            </w:tcMar>
+            <w:shd w:fill="F4F5F1"/>
+          </w:tcPr>
+          <w:p>
+            <w:pPr>
+              <w:spacing w:after="0" w:line="259" w:lineRule="auto"/>
+            </w:pPr>
+            <w:r>
+              <w:rPr>
+                <w:rFonts w:ascii="Arial" w:hAnsi="Arial" w:eastAsia="Arial"/>
+                <w:color w:val="111815"/>
+                <w:sz w:val="16"/>
+              </w:rPr>
+              <w:t>Send the prompt; use Shift Enter to add a new line</w:t>
             </w:r>
           </w:p>
         </w:tc>
@@ -16554,7 +17477,7 @@
                 <w:color w:val="111815"/>
                 <w:sz w:val="15"/>
               </w:rPr>
-              <w:t>Knowledge graph</w:t>
+              <w:t>Data and knowledge graph</w:t>
             </w:r>
           </w:p>
         </w:tc>
@@ -16580,7 +17503,7 @@
                 <w:color w:val="111815"/>
                 <w:sz w:val="15"/>
               </w:rPr>
-              <w:t>Deterministic fixture</w:t>
+              <w:t>File-name, connector, query, and deterministic graph fixtures</w:t>
             </w:r>
           </w:p>
         </w:tc>
@@ -16606,7 +17529,7 @@
                 <w:color w:val="111815"/>
                 <w:sz w:val="15"/>
               </w:rPr>
-              <w:t>Entity resolution, temporal graph, provenance store, access-aware queries, versioning</w:t>
+              <w:t>Upload and query services, entity resolution, temporal graph, provenance store, access-aware queries, versioning</w:t>
             </w:r>
           </w:p>
         </w:tc>
@@ -16637,7 +17560,7 @@
                 <w:color w:val="111815"/>
                 <w:sz w:val="15"/>
               </w:rPr>
-              <w:t>Agents</w:t>
+              <w:t>Playground and agents</w:t>
             </w:r>
           </w:p>
         </w:tc>
@@ -17729,7 +18652,7 @@
     </w:p>
     <w:p>
       <w:r>
-        <w:t>Use the concept as one coherent workspace: Operations World for global or regional awareness, then Sector, Client, and Project for delivery. Keep apps, data, IoT requests, agents, decisions, collaborators, variables, OR methods, and evidence inside the selected project. When a screen shows a fixture, target contract, missing connector, or blocked gate, preserve that label; it is part of the trust model.</w:t>
+        <w:t>Use the concept as one coherent workspace: Operations World for global or regional awareness, then the selected Client, Tower, and Project path for delivery. Use the mounted-work bar for apps and accountable people; use Data &amp; graph for sources and knowledge; use Playground for agent-first execution. Keep every decision, variable, method, receipt, and result inside the selected project. When a screen shows a fixture, target contract, missing connector, or blocked gate, preserve that label; it is part of the trust model.</w:t>
       </w:r>
     </w:p>
     <w:sectPr>

</xml_diff>